<commit_message>
Update plan: LXC containers + dedicated vLLM machine architecture
</commit_message>
<xml_diff>
--- a/CLOUDFLARE_MIGRATION_PLAN.docx
+++ b/CLOUDFLARE_MIGRATION_PLAN.docx
@@ -524,13 +524,13 @@
     </w:p>
     <w:bookmarkEnd w:id="20"/>
     <w:bookmarkEnd w:id="21"/>
-    <w:bookmarkStart w:id="22" w:name="X00466feba826877f3b36b943bdddab45414b903"/>
+    <w:bookmarkStart w:id="23" w:name="X7e34a297f86aec53236cd9841750437baa5c1a4"/>
     <w:p>
       <w:pPr>
         <w:pStyle w:val="Heading2"/>
       </w:pPr>
       <w:r>
-        <w:t xml:space="preserve">2. Target Architecture (Cloudflare + self-hosted VM)</w:t>
+        <w:t xml:space="preserve">2. Target Architecture (Cloudflare + self-hosted Proxmox)</w:t>
       </w:r>
     </w:p>
     <w:p>
@@ -622,7 +622,7 @@
         <w:rPr>
           <w:rStyle w:val="VerbatimChar"/>
         </w:rPr>
-        <w:t xml:space="preserve">                       │  1. Receive webhook JSON (from, subject,       │</w:t>
+        <w:t xml:space="preserve">                       │  1. Receive webhook JSON                       │</w:t>
       </w:r>
       <w:r>
         <w:br/>
@@ -631,7 +631,7 @@
         <w:rPr>
           <w:rStyle w:val="VerbatimChar"/>
         </w:rPr>
-        <w:t xml:space="preserve">                       │     attachments[].contentBase64)                │</w:t>
+        <w:t xml:space="preserve">                       │  2. Security filter                            │</w:t>
       </w:r>
       <w:r>
         <w:br/>
@@ -640,7 +640,7 @@
         <w:rPr>
           <w:rStyle w:val="VerbatimChar"/>
         </w:rPr>
-        <w:t xml:space="preserve">                       │  2. Security filter (port scan_email_content)  │</w:t>
+        <w:t xml:space="preserve">                       │  3-4. LLM vision (local → cloud fallback)      │</w:t>
       </w:r>
       <w:r>
         <w:br/>
@@ -649,7 +649,7 @@
         <w:rPr>
           <w:rStyle w:val="VerbatimChar"/>
         </w:rPr>
-        <w:t xml:space="preserve">                       │  3. Call LLM vision API to analyze PDF pages   │</w:t>
+        <w:t xml:space="preserve">                       │  5. Call home LXC Python API to fill PDF       │</w:t>
       </w:r>
       <w:r>
         <w:br/>
@@ -658,7 +658,7 @@
         <w:rPr>
           <w:rStyle w:val="VerbatimChar"/>
         </w:rPr>
-        <w:t xml:space="preserve">                       │  4. Call LLM to generate fill instructions     │</w:t>
+        <w:t xml:space="preserve">                       │  6. Send filled PDF via Resend API             │</w:t>
       </w:r>
       <w:r>
         <w:br/>
@@ -667,7 +667,7 @@
         <w:rPr>
           <w:rStyle w:val="VerbatimChar"/>
         </w:rPr>
-        <w:t xml:space="preserve">                       │  5. Call home VM Python API to execute fill    │</w:t>
+        <w:t xml:space="preserve">                       │  7. Log to Cloudflare D1                       │</w:t>
       </w:r>
       <w:r>
         <w:br/>
@@ -676,7 +676,7 @@
         <w:rPr>
           <w:rStyle w:val="VerbatimChar"/>
         </w:rPr>
-        <w:t xml:space="preserve">                       │     (ReportLab + PyPDF2 + signature overlay)   │</w:t>
+        <w:t xml:space="preserve">                       └───────────────────────────────────────────────┘</w:t>
       </w:r>
       <w:r>
         <w:br/>
@@ -685,7 +685,7 @@
         <w:rPr>
           <w:rStyle w:val="VerbatimChar"/>
         </w:rPr>
-        <w:t xml:space="preserve">                       │  6. Send filled PDF via Resend API             │</w:t>
+        <w:t xml:space="preserve">                                         │</w:t>
       </w:r>
       <w:r>
         <w:br/>
@@ -694,7 +694,7 @@
         <w:rPr>
           <w:rStyle w:val="VerbatimChar"/>
         </w:rPr>
-        <w:t xml:space="preserve">                       │  7. Log to Cloudflare D1                       │</w:t>
+        <w:t xml:space="preserve">┌──────────────────────┐          │</w:t>
       </w:r>
       <w:r>
         <w:br/>
@@ -703,10 +703,7 @@
         <w:rPr>
           <w:rStyle w:val="VerbatimChar"/>
         </w:rPr>
-        <w:t xml:space="preserve">                       └───────────────────────────────────────────────┘</w:t>
-      </w:r>
-      <w:r>
-        <w:br/>
+        <w:t xml:space="preserve">│ Cloudflare D1        │          │</w:t>
       </w:r>
       <w:r>
         <w:br/>
@@ -715,7 +712,7 @@
         <w:rPr>
           <w:rStyle w:val="VerbatimChar"/>
         </w:rPr>
-        <w:t xml:space="preserve">┌──────────────────────┐    ┌──────────────────────┐</w:t>
+        <w:t xml:space="preserve">│ (SQLite at edge)     │          │</w:t>
       </w:r>
       <w:r>
         <w:br/>
@@ -724,7 +721,7 @@
         <w:rPr>
           <w:rStyle w:val="VerbatimChar"/>
         </w:rPr>
-        <w:t xml:space="preserve">│ Cloudflare D1        │    │ Dashboard            │</w:t>
+        <w:t xml:space="preserve">└──────────────────────┘          │</w:t>
       </w:r>
       <w:r>
         <w:br/>
@@ -733,7 +730,7 @@
         <w:rPr>
           <w:rStyle w:val="VerbatimChar"/>
         </w:rPr>
-        <w:t xml:space="preserve">│ (SQLite at edge)     │    │ (stays on Abacus OR  │</w:t>
+        <w:t xml:space="preserve">                                  │   Cloudflare Tunnel</w:t>
       </w:r>
       <w:r>
         <w:br/>
@@ -742,7 +739,7 @@
         <w:rPr>
           <w:rStyle w:val="VerbatimChar"/>
         </w:rPr>
-        <w:t xml:space="preserve">│ - form processing    │    │  moves to Cloudflare │</w:t>
+        <w:t xml:space="preserve">══════════════════════════════════════════════════════════════════════</w:t>
       </w:r>
       <w:r>
         <w:br/>
@@ -751,7 +748,7 @@
         <w:rPr>
           <w:rStyle w:val="VerbatimChar"/>
         </w:rPr>
-        <w:t xml:space="preserve">│   logs               │    │  Pages — your call)  │</w:t>
+        <w:t xml:space="preserve"> HOME PROXMOX HOST</w:t>
       </w:r>
       <w:r>
         <w:br/>
@@ -760,7 +757,10 @@
         <w:rPr>
           <w:rStyle w:val="VerbatimChar"/>
         </w:rPr>
-        <w:t xml:space="preserve">│ - system_status      │    └──────────────────────┘</w:t>
+        <w:t xml:space="preserve">══════════════════════════════════════════════════════════════════════</w:t>
+      </w:r>
+      <w:r>
+        <w:br/>
       </w:r>
       <w:r>
         <w:br/>
@@ -769,7 +769,7 @@
         <w:rPr>
           <w:rStyle w:val="VerbatimChar"/>
         </w:rPr>
-        <w:t xml:space="preserve">│ - knowledge_entries  │</w:t>
+        <w:t xml:space="preserve"> ┌───────────────────────────────────────────────────────────────┐</w:t>
       </w:r>
       <w:r>
         <w:br/>
@@ -778,7 +778,7 @@
         <w:rPr>
           <w:rStyle w:val="VerbatimChar"/>
         </w:rPr>
-        <w:t xml:space="preserve">│ - app_config         │</w:t>
+        <w:t xml:space="preserve"> │ LXC: form-claw-services  (Ubuntu 24.04)                  │</w:t>
       </w:r>
       <w:r>
         <w:br/>
@@ -787,10 +787,7 @@
         <w:rPr>
           <w:rStyle w:val="VerbatimChar"/>
         </w:rPr>
-        <w:t xml:space="preserve">└──────────────────────┘</w:t>
-      </w:r>
-      <w:r>
-        <w:br/>
+        <w:t xml:space="preserve"> │                                                           │</w:t>
       </w:r>
       <w:r>
         <w:br/>
@@ -799,7 +796,7 @@
         <w:rPr>
           <w:rStyle w:val="VerbatimChar"/>
         </w:rPr>
-        <w:t xml:space="preserve">┌─────────────────────────────────────────────────────────────┐</w:t>
+        <w:t xml:space="preserve"> │  :3000  Next.js Dashboard  → formclaw.savlil.com          │</w:t>
       </w:r>
       <w:r>
         <w:br/>
@@ -808,7 +805,7 @@
         <w:rPr>
           <w:rStyle w:val="VerbatimChar"/>
         </w:rPr>
-        <w:t xml:space="preserve">│ HOME PROXMOX VM  (fixed IP, reverse-proxied via Cloudflare │</w:t>
+        <w:t xml:space="preserve"> │  :8787  FastAPI PDF Filler → pdf.savlil.com               │</w:t>
       </w:r>
       <w:r>
         <w:br/>
@@ -817,7 +814,7 @@
         <w:rPr>
           <w:rStyle w:val="VerbatimChar"/>
         </w:rPr>
-        <w:t xml:space="preserve">│                   Tunnel or direct with DDNS)               │</w:t>
+        <w:t xml:space="preserve"> │                                                           │</w:t>
       </w:r>
       <w:r>
         <w:br/>
@@ -826,7 +823,7 @@
         <w:rPr>
           <w:rStyle w:val="VerbatimChar"/>
         </w:rPr>
-        <w:t xml:space="preserve">│                                                             │</w:t>
+        <w:t xml:space="preserve"> │  RAM: 2–4 GB  |  CPU: 2–4 cores  |  Disk: 10 GB           │</w:t>
       </w:r>
       <w:r>
         <w:br/>
@@ -835,7 +832,7 @@
         <w:rPr>
           <w:rStyle w:val="VerbatimChar"/>
         </w:rPr>
-        <w:t xml:space="preserve">│  ┌─────────────────────────────────────────┐                │</w:t>
+        <w:t xml:space="preserve"> │  Assets: signatures/, fonts/, family_data.json            │</w:t>
       </w:r>
       <w:r>
         <w:br/>
@@ -844,7 +841,7 @@
         <w:rPr>
           <w:rStyle w:val="VerbatimChar"/>
         </w:rPr>
-        <w:t xml:space="preserve">│  │ Python API (FastAPI / Flask)            │                │</w:t>
+        <w:t xml:space="preserve"> │  cloudflared tunnel running as systemd service            │</w:t>
       </w:r>
       <w:r>
         <w:br/>
@@ -853,7 +850,10 @@
         <w:rPr>
           <w:rStyle w:val="VerbatimChar"/>
         </w:rPr>
-        <w:t xml:space="preserve">│  │  POST /fill-pdf                         │                │</w:t>
+        <w:t xml:space="preserve"> └───────────────────────────────────────────────────────────────┘</w:t>
+      </w:r>
+      <w:r>
+        <w:br/>
       </w:r>
       <w:r>
         <w:br/>
@@ -862,7 +862,7 @@
         <w:rPr>
           <w:rStyle w:val="VerbatimChar"/>
         </w:rPr>
-        <w:t xml:space="preserve">│  │  • ReportLab, PyPDF2, Pillow            │                │</w:t>
+        <w:t xml:space="preserve"> ┌───────────────────────────────────────────────────────────────┐</w:t>
       </w:r>
       <w:r>
         <w:br/>
@@ -871,7 +871,7 @@
         <w:rPr>
           <w:rStyle w:val="VerbatimChar"/>
         </w:rPr>
-        <w:t xml:space="preserve">│  │  • Signatures &amp; fonts on local disk     │                │</w:t>
+        <w:t xml:space="preserve"> │ DEDICATED LLM MACHINE  (already running, separate host)   │</w:t>
       </w:r>
       <w:r>
         <w:br/>
@@ -880,7 +880,7 @@
         <w:rPr>
           <w:rStyle w:val="VerbatimChar"/>
         </w:rPr>
-        <w:t xml:space="preserve">│  │  • Token-authenticated                  │                │</w:t>
+        <w:t xml:space="preserve"> │                                                           │</w:t>
       </w:r>
       <w:r>
         <w:br/>
@@ -889,7 +889,7 @@
         <w:rPr>
           <w:rStyle w:val="VerbatimChar"/>
         </w:rPr>
-        <w:t xml:space="preserve">│  └─────────────────────────────────────────┘                │</w:t>
+        <w:t xml:space="preserve"> │  vLLM server (OpenAI-compatible API)                      │</w:t>
       </w:r>
       <w:r>
         <w:br/>
@@ -898,7 +898,7 @@
         <w:rPr>
           <w:rStyle w:val="VerbatimChar"/>
         </w:rPr>
-        <w:t xml:space="preserve">│                                                             │</w:t>
+        <w:t xml:space="preserve"> │  :8000  /v1/chat/completions                              │</w:t>
       </w:r>
       <w:r>
         <w:br/>
@@ -907,7 +907,7 @@
         <w:rPr>
           <w:rStyle w:val="VerbatimChar"/>
         </w:rPr>
-        <w:t xml:space="preserve">│  Assets: signatures/, fonts/, family_data.json              │</w:t>
+        <w:t xml:space="preserve"> │  Model: Gemma 4 / Qwen2.5-VL / etc.                      │</w:t>
       </w:r>
       <w:r>
         <w:br/>
@@ -916,7 +916,7 @@
         <w:rPr>
           <w:rStyle w:val="VerbatimChar"/>
         </w:rPr>
-        <w:t xml:space="preserve">│  OS: Debian/Ubuntu LXC or VM (lightweight)                  │</w:t>
+        <w:t xml:space="preserve"> │  Reachable from LXC on LAN or via Cloudflare Tunnel       │</w:t>
       </w:r>
       <w:r>
         <w:br/>
@@ -925,25 +925,278 @@
         <w:rPr>
           <w:rStyle w:val="VerbatimChar"/>
         </w:rPr>
-        <w:t xml:space="preserve">│  RAM: 512MB–1GB sufficient                                  │</w:t>
-      </w:r>
-      <w:r>
-        <w:br/>
-      </w:r>
-      <w:r>
-        <w:rPr>
-          <w:rStyle w:val="VerbatimChar"/>
-        </w:rPr>
-        <w:t xml:space="preserve">│  Disk: &lt;1GB                                                 │</w:t>
-      </w:r>
-      <w:r>
-        <w:br/>
-      </w:r>
-      <w:r>
-        <w:rPr>
-          <w:rStyle w:val="VerbatimChar"/>
-        </w:rPr>
-        <w:t xml:space="preserve">└─────────────────────────────────────────────────────────────┘</w:t>
+        <w:t xml:space="preserve"> └───────────────────────────────────────────────────────────────┘</w:t>
+      </w:r>
+    </w:p>
+    <w:bookmarkStart w:id="22" w:name="lxc-vs-vm-what-goes-where"/>
+    <w:p>
+      <w:pPr>
+        <w:pStyle w:val="Heading3"/>
+      </w:pPr>
+      <w:r>
+        <w:t xml:space="preserve">LXC vs VM: What Goes Where</w:t>
+      </w:r>
+    </w:p>
+    <w:tbl>
+      <w:tblPr>
+        <w:tblStyle w:val="Table"/>
+        <w:tblW w:type="pct" w:w="5000"/>
+        <w:tblLook w:firstRow="1" w:lastRow="0" w:firstColumn="0" w:lastColumn="0" w:noHBand="0" w:noVBand="0" w:val="0020"/>
+      </w:tblPr>
+      <w:tblGrid>
+        <w:gridCol w:w="3394"/>
+        <w:gridCol w:w="2640"/>
+        <w:gridCol w:w="1885"/>
+      </w:tblGrid>
+      <w:tr>
+        <w:trPr>
+          <w:tblHeader w:val="true"/>
+        </w:trPr>
+        <w:tc>
+          <w:tcPr/>
+          <w:p>
+            <w:pPr>
+              <w:pStyle w:val="Compact"/>
+              <w:jc w:val="left"/>
+            </w:pPr>
+            <w:r>
+              <w:t xml:space="preserve">Service</w:t>
+            </w:r>
+          </w:p>
+        </w:tc>
+        <w:tc>
+          <w:tcPr/>
+          <w:p>
+            <w:pPr>
+              <w:pStyle w:val="Compact"/>
+              <w:jc w:val="left"/>
+            </w:pPr>
+            <w:r>
+              <w:t xml:space="preserve">Where</w:t>
+            </w:r>
+          </w:p>
+        </w:tc>
+        <w:tc>
+          <w:tcPr/>
+          <w:p>
+            <w:pPr>
+              <w:pStyle w:val="Compact"/>
+              <w:jc w:val="left"/>
+            </w:pPr>
+            <w:r>
+              <w:t xml:space="preserve">Why</w:t>
+            </w:r>
+          </w:p>
+        </w:tc>
+      </w:tr>
+      <w:tr>
+        <w:tc>
+          <w:tcPr/>
+          <w:p>
+            <w:pPr>
+              <w:pStyle w:val="Compact"/>
+              <w:jc w:val="left"/>
+            </w:pPr>
+            <w:r>
+              <w:rPr>
+                <w:bCs/>
+                <w:b/>
+              </w:rPr>
+              <w:t xml:space="preserve">FastAPI PDF Filler</w:t>
+            </w:r>
+          </w:p>
+        </w:tc>
+        <w:tc>
+          <w:tcPr/>
+          <w:p>
+            <w:pPr>
+              <w:pStyle w:val="Compact"/>
+              <w:jc w:val="left"/>
+            </w:pPr>
+            <w:r>
+              <w:t xml:space="preserve">✅ LXC</w:t>
+            </w:r>
+          </w:p>
+        </w:tc>
+        <w:tc>
+          <w:tcPr/>
+          <w:p>
+            <w:pPr>
+              <w:pStyle w:val="Compact"/>
+              <w:jc w:val="left"/>
+            </w:pPr>
+            <w:r>
+              <w:t xml:space="preserve">Pure Python, no hardware access needed. Lowest overhead.</w:t>
+            </w:r>
+          </w:p>
+        </w:tc>
+      </w:tr>
+      <w:tr>
+        <w:tc>
+          <w:tcPr/>
+          <w:p>
+            <w:pPr>
+              <w:pStyle w:val="Compact"/>
+              <w:jc w:val="left"/>
+            </w:pPr>
+            <w:r>
+              <w:rPr>
+                <w:bCs/>
+                <w:b/>
+              </w:rPr>
+              <w:t xml:space="preserve">Next.js Dashboard</w:t>
+            </w:r>
+          </w:p>
+        </w:tc>
+        <w:tc>
+          <w:tcPr/>
+          <w:p>
+            <w:pPr>
+              <w:pStyle w:val="Compact"/>
+              <w:jc w:val="left"/>
+            </w:pPr>
+            <w:r>
+              <w:t xml:space="preserve">✅ LXC</w:t>
+            </w:r>
+          </w:p>
+        </w:tc>
+        <w:tc>
+          <w:tcPr/>
+          <w:p>
+            <w:pPr>
+              <w:pStyle w:val="Compact"/>
+              <w:jc w:val="left"/>
+            </w:pPr>
+            <w:r>
+              <w:t xml:space="preserve">Node.js process, no special kernel features.</w:t>
+            </w:r>
+          </w:p>
+        </w:tc>
+      </w:tr>
+      <w:tr>
+        <w:tc>
+          <w:tcPr/>
+          <w:p>
+            <w:pPr>
+              <w:pStyle w:val="Compact"/>
+              <w:jc w:val="left"/>
+            </w:pPr>
+            <w:r>
+              <w:rPr>
+                <w:bCs/>
+                <w:b/>
+              </w:rPr>
+              <w:t xml:space="preserve">Cloudflare Tunnel</w:t>
+            </w:r>
+          </w:p>
+        </w:tc>
+        <w:tc>
+          <w:tcPr/>
+          <w:p>
+            <w:pPr>
+              <w:pStyle w:val="Compact"/>
+              <w:jc w:val="left"/>
+            </w:pPr>
+            <w:r>
+              <w:t xml:space="preserve">✅ LXC</w:t>
+            </w:r>
+          </w:p>
+        </w:tc>
+        <w:tc>
+          <w:tcPr/>
+          <w:p>
+            <w:pPr>
+              <w:pStyle w:val="Compact"/>
+              <w:jc w:val="left"/>
+            </w:pPr>
+            <w:r>
+              <w:t xml:space="preserve">Userspace binary, works everywhere.</w:t>
+            </w:r>
+          </w:p>
+        </w:tc>
+      </w:tr>
+      <w:tr>
+        <w:tc>
+          <w:tcPr/>
+          <w:p>
+            <w:pPr>
+              <w:pStyle w:val="Compact"/>
+              <w:jc w:val="left"/>
+            </w:pPr>
+            <w:r>
+              <w:rPr>
+                <w:bCs/>
+                <w:b/>
+              </w:rPr>
+              <w:t xml:space="preserve">vLLM (self-hosted LLM)</w:t>
+            </w:r>
+          </w:p>
+        </w:tc>
+        <w:tc>
+          <w:tcPr/>
+          <w:p>
+            <w:pPr>
+              <w:pStyle w:val="Compact"/>
+              <w:jc w:val="left"/>
+            </w:pPr>
+            <w:r>
+              <w:t xml:space="preserve">✅</w:t>
+            </w:r>
+            <w:r>
+              <w:t xml:space="preserve"> </w:t>
+            </w:r>
+            <w:r>
+              <w:rPr>
+                <w:bCs/>
+                <w:b/>
+              </w:rPr>
+              <w:t xml:space="preserve">Existing dedicated machine</w:t>
+            </w:r>
+          </w:p>
+        </w:tc>
+        <w:tc>
+          <w:tcPr/>
+          <w:p>
+            <w:pPr>
+              <w:pStyle w:val="Compact"/>
+              <w:jc w:val="left"/>
+            </w:pPr>
+            <w:r>
+              <w:t xml:space="preserve">Already running — no changes needed, reachable on LAN.</w:t>
+            </w:r>
+          </w:p>
+        </w:tc>
+      </w:tr>
+    </w:tbl>
+    <w:p>
+      <w:pPr>
+        <w:pStyle w:val="BodyText"/>
+      </w:pPr>
+      <w:r>
+        <w:rPr>
+          <w:bCs/>
+          <w:b/>
+        </w:rPr>
+        <w:t xml:space="preserve">Recommendation</w:t>
+      </w:r>
+      <w:r>
+        <w:t xml:space="preserve">: Run PDF filler + dashboard + cloudflared in a</w:t>
+      </w:r>
+      <w:r>
+        <w:t xml:space="preserve"> </w:t>
+      </w:r>
+      <w:r>
+        <w:rPr>
+          <w:bCs/>
+          <w:b/>
+        </w:rPr>
+        <w:t xml:space="preserve">single LXC container</w:t>
+      </w:r>
+      <w:r>
+        <w:t xml:space="preserve"> </w:t>
+      </w:r>
+      <w:r>
+        <w:t xml:space="preserve">(2–4 vCPU, 2–4 GB RAM, 10 GB disk). The LLM stays on your existing dedicated machine — the Cloudflare Worker (or the LXC services) calls it over your LAN or via Tunnel.</w:t>
       </w:r>
     </w:p>
     <w:p>
@@ -954,7 +1207,8 @@
       </w:r>
     </w:p>
     <w:bookmarkEnd w:id="22"/>
-    <w:bookmarkStart w:id="35" w:name="component-by-component-migration"/>
+    <w:bookmarkEnd w:id="23"/>
+    <w:bookmarkStart w:id="36" w:name="component-by-component-migration"/>
     <w:p>
       <w:pPr>
         <w:pStyle w:val="Heading2"/>
@@ -963,7 +1217,7 @@
         <w:t xml:space="preserve">3. Component-by-Component Migration</w:t>
       </w:r>
     </w:p>
-    <w:bookmarkStart w:id="23" w:name="email-intake-worker-form-claw-email"/>
+    <w:bookmarkStart w:id="24" w:name="email-intake-worker-form-claw-email"/>
     <w:p>
       <w:pPr>
         <w:pStyle w:val="Heading3"/>
@@ -1028,8 +1282,8 @@
         <w:t xml:space="preserve">: Config change only (update Cloudflare secret)</w:t>
       </w:r>
     </w:p>
-    <w:bookmarkEnd w:id="23"/>
-    <w:bookmarkStart w:id="24" w:name="Xfd1ad61e7330a45103340089b13f8af248c3e08"/>
+    <w:bookmarkEnd w:id="24"/>
+    <w:bookmarkStart w:id="25" w:name="Xfd1ad61e7330a45103340089b13f8af248c3e08"/>
     <w:p>
       <w:pPr>
         <w:pStyle w:val="Heading3"/>
@@ -1334,8 +1588,8 @@
         <w:t xml:space="preserve">        • Knowledge base</w:t>
       </w:r>
     </w:p>
-    <w:bookmarkEnd w:id="24"/>
-    <w:bookmarkStart w:id="26" w:name="database-cloudflare-d1"/>
+    <w:bookmarkEnd w:id="25"/>
+    <w:bookmarkStart w:id="27" w:name="database-cloudflare-d1"/>
     <w:p>
       <w:pPr>
         <w:pStyle w:val="Heading3"/>
@@ -1374,7 +1628,7 @@
       <w:r>
         <w:t xml:space="preserve"> </w:t>
       </w:r>
-      <w:hyperlink r:id="rId25">
+      <w:hyperlink r:id="rId26">
         <w:r>
           <w:rPr>
             <w:rStyle w:val="Hyperlink"/>
@@ -3024,8 +3278,8 @@
         <w:t xml:space="preserve">);</w:t>
       </w:r>
     </w:p>
-    <w:bookmarkEnd w:id="26"/>
-    <w:bookmarkStart w:id="33" w:name="X171a8d105c403c2544e1c228d387928d2d9d618"/>
+    <w:bookmarkEnd w:id="27"/>
+    <w:bookmarkStart w:id="34" w:name="X171a8d105c403c2544e1c228d387928d2d9d618"/>
     <w:p>
       <w:pPr>
         <w:pStyle w:val="Heading3"/>
@@ -3042,7 +3296,7 @@
         <w:t xml:space="preserve">Run the Next.js dashboard on the same Proxmox host as the PDF filler, exposed via Cloudflare Tunnel.</w:t>
       </w:r>
     </w:p>
-    <w:bookmarkStart w:id="27" w:name="why-self-host"/>
+    <w:bookmarkStart w:id="28" w:name="why-self-host"/>
     <w:p>
       <w:pPr>
         <w:pStyle w:val="Heading4"/>
@@ -3099,296 +3353,26 @@
         <w:t xml:space="preserve">Cloudflare Tunnel = free TLS, no port forwarding</w:t>
       </w:r>
     </w:p>
-    <w:bookmarkEnd w:id="27"/>
-    <w:bookmarkStart w:id="28" w:name="dashboard-vm-lxc-requirements"/>
+    <w:bookmarkEnd w:id="28"/>
+    <w:bookmarkStart w:id="29" w:name="dashboard-runs-in-the-same-lxc"/>
     <w:p>
       <w:pPr>
         <w:pStyle w:val="Heading4"/>
       </w:pPr>
       <w:r>
-        <w:t xml:space="preserve">Dashboard VM / LXC Requirements</w:t>
+        <w:t xml:space="preserve">Dashboard runs in the same LXC</w:t>
       </w:r>
     </w:p>
-    <w:tbl>
-      <w:tblPr>
-        <w:tblStyle w:val="Table"/>
-        <w:tblW w:type="auto" w:w="0"/>
-        <w:tblLook w:firstRow="1" w:lastRow="0" w:firstColumn="0" w:lastColumn="0" w:noHBand="0" w:noVBand="0" w:val="0020"/>
-      </w:tblPr>
-      <w:tblGrid>
-        <w:gridCol w:w="2640"/>
-        <w:gridCol w:w="2640"/>
-        <w:gridCol w:w="2640"/>
-      </w:tblGrid>
-      <w:tr>
-        <w:trPr>
-          <w:tblHeader w:val="true"/>
-        </w:trPr>
-        <w:tc>
-          <w:tcPr/>
-          <w:p>
-            <w:pPr>
-              <w:pStyle w:val="Compact"/>
-              <w:jc w:val="left"/>
-            </w:pPr>
-            <w:r>
-              <w:t xml:space="preserve">Requirement</w:t>
-            </w:r>
-          </w:p>
-        </w:tc>
-        <w:tc>
-          <w:tcPr/>
-          <w:p>
-            <w:pPr>
-              <w:pStyle w:val="Compact"/>
-              <w:jc w:val="left"/>
-            </w:pPr>
-            <w:r>
-              <w:t xml:space="preserve">Minimum</w:t>
-            </w:r>
-          </w:p>
-        </w:tc>
-        <w:tc>
-          <w:tcPr/>
-          <w:p>
-            <w:pPr>
-              <w:pStyle w:val="Compact"/>
-              <w:jc w:val="left"/>
-            </w:pPr>
-            <w:r>
-              <w:t xml:space="preserve">Recommended</w:t>
-            </w:r>
-          </w:p>
-        </w:tc>
-      </w:tr>
-      <w:tr>
-        <w:tc>
-          <w:tcPr/>
-          <w:p>
-            <w:pPr>
-              <w:pStyle w:val="Compact"/>
-              <w:jc w:val="left"/>
-            </w:pPr>
-            <w:r>
-              <w:rPr>
-                <w:bCs/>
-                <w:b/>
-              </w:rPr>
-              <w:t xml:space="preserve">OS</w:t>
-            </w:r>
-          </w:p>
-        </w:tc>
-        <w:tc>
-          <w:tcPr/>
-          <w:p>
-            <w:pPr>
-              <w:pStyle w:val="Compact"/>
-              <w:jc w:val="left"/>
-            </w:pPr>
-            <w:r>
-              <w:t xml:space="preserve">Debian 12 / Ubuntu 22.04</w:t>
-            </w:r>
-          </w:p>
-        </w:tc>
-        <w:tc>
-          <w:tcPr/>
-          <w:p>
-            <w:pPr>
-              <w:pStyle w:val="Compact"/>
-              <w:jc w:val="left"/>
-            </w:pPr>
-            <w:r>
-              <w:t xml:space="preserve">Ubuntu 24.04 LXC</w:t>
-            </w:r>
-          </w:p>
-        </w:tc>
-      </w:tr>
-      <w:tr>
-        <w:tc>
-          <w:tcPr/>
-          <w:p>
-            <w:pPr>
-              <w:pStyle w:val="Compact"/>
-              <w:jc w:val="left"/>
-            </w:pPr>
-            <w:r>
-              <w:rPr>
-                <w:bCs/>
-                <w:b/>
-              </w:rPr>
-              <w:t xml:space="preserve">CPU</w:t>
-            </w:r>
-          </w:p>
-        </w:tc>
-        <w:tc>
-          <w:tcPr/>
-          <w:p>
-            <w:pPr>
-              <w:pStyle w:val="Compact"/>
-              <w:jc w:val="left"/>
-            </w:pPr>
-            <w:r>
-              <w:t xml:space="preserve">1 vCPU</w:t>
-            </w:r>
-          </w:p>
-        </w:tc>
-        <w:tc>
-          <w:tcPr/>
-          <w:p>
-            <w:pPr>
-              <w:pStyle w:val="Compact"/>
-              <w:jc w:val="left"/>
-            </w:pPr>
-            <w:r>
-              <w:t xml:space="preserve">2 vCPU</w:t>
-            </w:r>
-          </w:p>
-        </w:tc>
-      </w:tr>
-      <w:tr>
-        <w:tc>
-          <w:tcPr/>
-          <w:p>
-            <w:pPr>
-              <w:pStyle w:val="Compact"/>
-              <w:jc w:val="left"/>
-            </w:pPr>
-            <w:r>
-              <w:rPr>
-                <w:bCs/>
-                <w:b/>
-              </w:rPr>
-              <w:t xml:space="preserve">RAM</w:t>
-            </w:r>
-          </w:p>
-        </w:tc>
-        <w:tc>
-          <w:tcPr/>
-          <w:p>
-            <w:pPr>
-              <w:pStyle w:val="Compact"/>
-              <w:jc w:val="left"/>
-            </w:pPr>
-            <w:r>
-              <w:t xml:space="preserve">512 MB</w:t>
-            </w:r>
-          </w:p>
-        </w:tc>
-        <w:tc>
-          <w:tcPr/>
-          <w:p>
-            <w:pPr>
-              <w:pStyle w:val="Compact"/>
-              <w:jc w:val="left"/>
-            </w:pPr>
-            <w:r>
-              <w:t xml:space="preserve">1 GB (Next.js build + runtime)</w:t>
-            </w:r>
-          </w:p>
-        </w:tc>
-      </w:tr>
-      <w:tr>
-        <w:tc>
-          <w:tcPr/>
-          <w:p>
-            <w:pPr>
-              <w:pStyle w:val="Compact"/>
-              <w:jc w:val="left"/>
-            </w:pPr>
-            <w:r>
-              <w:rPr>
-                <w:bCs/>
-                <w:b/>
-              </w:rPr>
-              <w:t xml:space="preserve">Disk</w:t>
-            </w:r>
-          </w:p>
-        </w:tc>
-        <w:tc>
-          <w:tcPr/>
-          <w:p>
-            <w:pPr>
-              <w:pStyle w:val="Compact"/>
-              <w:jc w:val="left"/>
-            </w:pPr>
-            <w:r>
-              <w:t xml:space="preserve">2 GB</w:t>
-            </w:r>
-          </w:p>
-        </w:tc>
-        <w:tc>
-          <w:tcPr/>
-          <w:p>
-            <w:pPr>
-              <w:pStyle w:val="Compact"/>
-              <w:jc w:val="left"/>
-            </w:pPr>
-            <w:r>
-              <w:t xml:space="preserve">5 GB (Node.js + app + .next cache)</w:t>
-            </w:r>
-          </w:p>
-        </w:tc>
-      </w:tr>
-      <w:tr>
-        <w:tc>
-          <w:tcPr/>
-          <w:p>
-            <w:pPr>
-              <w:pStyle w:val="Compact"/>
-              <w:jc w:val="left"/>
-            </w:pPr>
-            <w:r>
-              <w:rPr>
-                <w:bCs/>
-                <w:b/>
-              </w:rPr>
-              <w:t xml:space="preserve">Node.js</w:t>
-            </w:r>
-          </w:p>
-        </w:tc>
-        <w:tc>
-          <w:tcPr/>
-          <w:p>
-            <w:pPr>
-              <w:pStyle w:val="Compact"/>
-              <w:jc w:val="left"/>
-            </w:pPr>
-            <w:r>
-              <w:t xml:space="preserve">18 LTS</w:t>
-            </w:r>
-          </w:p>
-        </w:tc>
-        <w:tc>
-          <w:tcPr/>
-          <w:p>
-            <w:pPr>
-              <w:pStyle w:val="Compact"/>
-              <w:jc w:val="left"/>
-            </w:pPr>
-            <w:r>
-              <w:t xml:space="preserve">20 LTS</w:t>
-            </w:r>
-          </w:p>
-        </w:tc>
-      </w:tr>
-    </w:tbl>
     <w:p>
       <w:pPr>
-        <w:pStyle w:val="BlockText"/>
-      </w:pPr>
-      <w:r>
-        <w:rPr>
-          <w:bCs/>
-          <w:b/>
-        </w:rPr>
-        <w:t xml:space="preserve">Tip</w:t>
-      </w:r>
-      <w:r>
-        <w:t xml:space="preserve">: Can share the same LXC as the PDF filler if you prefer — just run both services on different ports (8787 for PDF API, 3000 for dashboard).</w:t>
+        <w:pStyle w:val="FirstParagraph"/>
+      </w:pPr>
+      <w:r>
+        <w:t xml:space="preserve">No separate container needed — the dashboard runs alongside the PDF filler in the same LXC (port 3000 for dashboard, port 8787 for PDF API). Node.js 20 is already installed for the dashboard.</w:t>
       </w:r>
     </w:p>
-    <w:bookmarkEnd w:id="28"/>
-    <w:bookmarkStart w:id="29" w:name="database-strategy"/>
+    <w:bookmarkEnd w:id="29"/>
+    <w:bookmarkStart w:id="30" w:name="database-strategy"/>
     <w:p>
       <w:pPr>
         <w:pStyle w:val="Heading4"/>
@@ -4364,8 +4348,8 @@
         <w:t xml:space="preserve">}</w:t>
       </w:r>
     </w:p>
-    <w:bookmarkEnd w:id="29"/>
-    <w:bookmarkStart w:id="30" w:name="setup-steps"/>
+    <w:bookmarkEnd w:id="30"/>
+    <w:bookmarkStart w:id="31" w:name="setup-steps"/>
     <w:p>
       <w:pPr>
         <w:pStyle w:val="Heading4"/>
@@ -4952,8 +4936,8 @@
         <w:t xml:space="preserve"> form-claw-dashboard</w:t>
       </w:r>
     </w:p>
-    <w:bookmarkEnd w:id="30"/>
-    <w:bookmarkStart w:id="31" w:name="Xa2e7ad7ec6d6d2aa5f06456c7229726ed98b59c"/>
+    <w:bookmarkEnd w:id="31"/>
+    <w:bookmarkStart w:id="32" w:name="Xa2e7ad7ec6d6d2aa5f06456c7229726ed98b59c"/>
     <w:p>
       <w:pPr>
         <w:pStyle w:val="Heading4"/>
@@ -5197,8 +5181,8 @@
         <w:t xml:space="preserve">serves the PDF API — both from the same VM, same tunnel.</w:t>
       </w:r>
     </w:p>
-    <w:bookmarkEnd w:id="31"/>
-    <w:bookmarkStart w:id="32" w:name="migration-from-prisma-to-d1"/>
+    <w:bookmarkEnd w:id="32"/>
+    <w:bookmarkStart w:id="33" w:name="migration-from-prisma-to-d1"/>
     <w:p>
       <w:pPr>
         <w:pStyle w:val="Heading4"/>
@@ -5269,9 +5253,9 @@
         <w:t xml:space="preserve">: 1-2 days for the Prisma → D1 migration.</w:t>
       </w:r>
     </w:p>
-    <w:bookmarkEnd w:id="32"/>
     <w:bookmarkEnd w:id="33"/>
-    <w:bookmarkStart w:id="34" w:name="health-monitoring"/>
+    <w:bookmarkEnd w:id="34"/>
+    <w:bookmarkStart w:id="35" w:name="health-monitoring"/>
     <w:p>
       <w:pPr>
         <w:pStyle w:val="Heading3"/>
@@ -5338,8 +5322,8 @@
         </w:pict>
       </w:r>
     </w:p>
-    <w:bookmarkEnd w:id="34"/>
     <w:bookmarkEnd w:id="35"/>
+    <w:bookmarkEnd w:id="36"/>
     <w:bookmarkStart w:id="49" w:name="llm-api-options"/>
     <w:p>
       <w:pPr>
@@ -5349,7 +5333,7 @@
         <w:t xml:space="preserve">4. LLM API Options</w:t>
       </w:r>
     </w:p>
-    <w:bookmarkStart w:id="36" w:name="the-form-processor-needs"/>
+    <w:bookmarkStart w:id="37" w:name="the-form-processor-needs"/>
     <w:p>
       <w:pPr>
         <w:pStyle w:val="Heading3"/>
@@ -5434,8 +5418,8 @@
         <w:t xml:space="preserve">: Understand Hebrew form labels</w:t>
       </w:r>
     </w:p>
-    <w:bookmarkEnd w:id="36"/>
-    <w:bookmarkStart w:id="37" w:name="option-a-abacus-ai-chatllm-api-current"/>
+    <w:bookmarkEnd w:id="37"/>
+    <w:bookmarkStart w:id="38" w:name="option-a-abacus-ai-chatllm-api-current"/>
     <w:p>
       <w:pPr>
         <w:pStyle w:val="Heading3"/>
@@ -6279,8 +6263,8 @@
         <w:t xml:space="preserve">;</w:t>
       </w:r>
     </w:p>
-    <w:bookmarkEnd w:id="37"/>
-    <w:bookmarkStart w:id="39" w:name="option-b-xai-grok-api"/>
+    <w:bookmarkEnd w:id="38"/>
+    <w:bookmarkStart w:id="40" w:name="option-b-xai-grok-api"/>
     <w:p>
       <w:pPr>
         <w:pStyle w:val="Heading3"/>
@@ -6328,7 +6312,7 @@
       <w:r>
         <w:t xml:space="preserve"> </w:t>
       </w:r>
-      <w:hyperlink r:id="rId38">
+      <w:hyperlink r:id="rId39">
         <w:r>
           <w:rPr>
             <w:rStyle w:val="Hyperlink"/>
@@ -7158,14 +7142,14 @@
         <w:t xml:space="preserve">- Grok vision is newer, less battle-tested for precise coordinate extraction</w:t>
       </w:r>
     </w:p>
-    <w:bookmarkEnd w:id="39"/>
-    <w:bookmarkStart w:id="48" w:name="Xcbf411df57de44247f3ac88aedce327537210d8"/>
+    <w:bookmarkEnd w:id="40"/>
+    <w:bookmarkStart w:id="48" w:name="X323ab623c5b3da3648de06e2bd309decbdc327a"/>
     <w:p>
       <w:pPr>
         <w:pStyle w:val="Heading3"/>
       </w:pPr>
       <w:r>
-        <w:t xml:space="preserve">Option C: Self-Hosted LLM (Gemma 4 / Qwen2.5-VL / etc.)</w:t>
+        <w:t xml:space="preserve">Option C: Self-Hosted LLM via vLLM (your dedicated LLM machine)</w:t>
       </w:r>
     </w:p>
     <w:p>
@@ -7173,7 +7157,7 @@
         <w:pStyle w:val="FirstParagraph"/>
       </w:pPr>
       <w:r>
-        <w:t xml:space="preserve">Run a vision-capable open model on your Proxmox server via</w:t>
+        <w:t xml:space="preserve">You already have a dedicated machine running</w:t>
       </w:r>
       <w:r>
         <w:t xml:space="preserve"> </w:t>
@@ -7183,29 +7167,16 @@
           <w:bCs/>
           <w:b/>
         </w:rPr>
-        <w:t xml:space="preserve">Ollama</w:t>
-      </w:r>
-      <w:r>
-        <w:t xml:space="preserve"> </w:t>
-      </w:r>
-      <w:r>
-        <w:t xml:space="preserve">or</w:t>
-      </w:r>
-      <w:r>
-        <w:t xml:space="preserve"> </w:t>
-      </w:r>
-      <w:r>
-        <w:rPr>
-          <w:bCs/>
-          <w:b/>
-        </w:rPr>
         <w:t xml:space="preserve">vLLM</w:t>
       </w:r>
       <w:r>
-        <w:t xml:space="preserve">. This is the fully self-sufficient option — zero API costs, zero external dependencies.</w:t>
+        <w:t xml:space="preserve"> </w:t>
+      </w:r>
+      <w:r>
+        <w:t xml:space="preserve">with an OpenAI-compatible API. This is the primary LLM provider — zero API costs, zero external dependencies, already operational.</w:t>
       </w:r>
     </w:p>
-    <w:bookmarkStart w:id="40" w:name="recommended-models"/>
+    <w:bookmarkStart w:id="41" w:name="recommended-models"/>
     <w:p>
       <w:pPr>
         <w:pStyle w:val="Heading4"/>
@@ -7859,14 +7830,22 @@
         </w:tc>
       </w:tr>
     </w:tbl>
-    <w:bookmarkEnd w:id="40"/>
-    <w:bookmarkStart w:id="41" w:name="hardware-requirements-for-proxmox-vm"/>
+    <w:bookmarkEnd w:id="41"/>
+    <w:bookmarkStart w:id="42" w:name="model-selection-guide"/>
     <w:p>
       <w:pPr>
         <w:pStyle w:val="Heading4"/>
       </w:pPr>
       <w:r>
-        <w:t xml:space="preserve">Hardware Requirements for Proxmox VM</w:t>
+        <w:t xml:space="preserve">Model Selection Guide</w:t>
+      </w:r>
+    </w:p>
+    <w:p>
+      <w:pPr>
+        <w:pStyle w:val="FirstParagraph"/>
+      </w:pPr>
+      <w:r>
+        <w:t xml:space="preserve">Pick the right model for your dedicated vLLM machine based on its GPU:</w:t>
       </w:r>
     </w:p>
     <w:tbl>
@@ -7876,12 +7855,11 @@
         <w:tblLook w:firstRow="1" w:lastRow="0" w:firstColumn="0" w:lastColumn="0" w:noHBand="0" w:noVBand="0" w:val="0020"/>
       </w:tblPr>
       <w:tblGrid>
-        <w:gridCol w:w="2318"/>
-        <w:gridCol w:w="965"/>
-        <w:gridCol w:w="1159"/>
-        <w:gridCol w:w="965"/>
-        <w:gridCol w:w="1159"/>
-        <w:gridCol w:w="1352"/>
+        <w:gridCol w:w="880"/>
+        <w:gridCol w:w="2137"/>
+        <w:gridCol w:w="2011"/>
+        <w:gridCol w:w="2011"/>
+        <w:gridCol w:w="880"/>
       </w:tblGrid>
       <w:tr>
         <w:trPr>
@@ -7895,55 +7873,43 @@
               <w:jc w:val="left"/>
             </w:pPr>
             <w:r>
-              <w:t xml:space="preserve">Model Tier</w:t>
-            </w:r>
-          </w:p>
-        </w:tc>
-        <w:tc>
-          <w:tcPr/>
-          <w:p>
-            <w:pPr>
-              <w:pStyle w:val="Compact"/>
-              <w:jc w:val="left"/>
-            </w:pPr>
-            <w:r>
-              <w:t xml:space="preserve">GPU</w:t>
-            </w:r>
-          </w:p>
-        </w:tc>
-        <w:tc>
-          <w:tcPr/>
-          <w:p>
-            <w:pPr>
-              <w:pStyle w:val="Compact"/>
-              <w:jc w:val="left"/>
-            </w:pPr>
-            <w:r>
-              <w:t xml:space="preserve">VRAM</w:t>
-            </w:r>
-          </w:p>
-        </w:tc>
-        <w:tc>
-          <w:tcPr/>
-          <w:p>
-            <w:pPr>
-              <w:pStyle w:val="Compact"/>
-              <w:jc w:val="left"/>
-            </w:pPr>
-            <w:r>
-              <w:t xml:space="preserve">RAM</w:t>
-            </w:r>
-          </w:p>
-        </w:tc>
-        <w:tc>
-          <w:tcPr/>
-          <w:p>
-            <w:pPr>
-              <w:pStyle w:val="Compact"/>
-              <w:jc w:val="left"/>
-            </w:pPr>
-            <w:r>
-              <w:t xml:space="preserve">Disk</w:t>
+              <w:t xml:space="preserve">Model</w:t>
+            </w:r>
+          </w:p>
+        </w:tc>
+        <w:tc>
+          <w:tcPr/>
+          <w:p>
+            <w:pPr>
+              <w:pStyle w:val="Compact"/>
+              <w:jc w:val="left"/>
+            </w:pPr>
+            <w:r>
+              <w:t xml:space="preserve">VRAM needed (Q4)</w:t>
+            </w:r>
+          </w:p>
+        </w:tc>
+        <w:tc>
+          <w:tcPr/>
+          <w:p>
+            <w:pPr>
+              <w:pStyle w:val="Compact"/>
+              <w:jc w:val="left"/>
+            </w:pPr>
+            <w:r>
+              <w:t xml:space="preserve">Vision Quality</w:t>
+            </w:r>
+          </w:p>
+        </w:tc>
+        <w:tc>
+          <w:tcPr/>
+          <w:p>
+            <w:pPr>
+              <w:pStyle w:val="Compact"/>
+              <w:jc w:val="left"/>
+            </w:pPr>
+            <w:r>
+              <w:t xml:space="preserve">Hebrew Quality</w:t>
             </w:r>
           </w:p>
         </w:tc>
@@ -7973,73 +7939,55 @@
                 <w:bCs/>
                 <w:b/>
               </w:rPr>
-              <w:t xml:space="preserve">Budget</w:t>
-            </w:r>
-            <w:r>
-              <w:t xml:space="preserve"> </w:t>
-            </w:r>
-            <w:r>
-              <w:t xml:space="preserve">(Gemma 4 12B / Qwen 7B)</w:t>
-            </w:r>
-          </w:p>
-        </w:tc>
-        <w:tc>
-          <w:tcPr/>
-          <w:p>
-            <w:pPr>
-              <w:pStyle w:val="Compact"/>
-              <w:jc w:val="left"/>
-            </w:pPr>
-            <w:r>
-              <w:t xml:space="preserve">1× RTX 3060 12GB or RTX 4060 Ti 16GB</w:t>
-            </w:r>
-          </w:p>
-        </w:tc>
-        <w:tc>
-          <w:tcPr/>
-          <w:p>
-            <w:pPr>
-              <w:pStyle w:val="Compact"/>
-              <w:jc w:val="left"/>
-            </w:pPr>
-            <w:r>
-              <w:t xml:space="preserve">12–16 GB</w:t>
-            </w:r>
-          </w:p>
-        </w:tc>
-        <w:tc>
-          <w:tcPr/>
-          <w:p>
-            <w:pPr>
-              <w:pStyle w:val="Compact"/>
-              <w:jc w:val="left"/>
-            </w:pPr>
-            <w:r>
-              <w:t xml:space="preserve">16 GB</w:t>
-            </w:r>
-          </w:p>
-        </w:tc>
-        <w:tc>
-          <w:tcPr/>
-          <w:p>
-            <w:pPr>
-              <w:pStyle w:val="Compact"/>
-              <w:jc w:val="left"/>
-            </w:pPr>
-            <w:r>
-              <w:t xml:space="preserve">30 GB</w:t>
-            </w:r>
-          </w:p>
-        </w:tc>
-        <w:tc>
-          <w:tcPr/>
-          <w:p>
-            <w:pPr>
-              <w:pStyle w:val="Compact"/>
-              <w:jc w:val="left"/>
-            </w:pPr>
-            <w:r>
-              <w:t xml:space="preserve">Good enough for 1-2 forms/day</w:t>
+              <w:t xml:space="preserve">Gemma 4 12B</w:t>
+            </w:r>
+          </w:p>
+        </w:tc>
+        <w:tc>
+          <w:tcPr/>
+          <w:p>
+            <w:pPr>
+              <w:pStyle w:val="Compact"/>
+              <w:jc w:val="left"/>
+            </w:pPr>
+            <w:r>
+              <w:t xml:space="preserve">~8 GB</w:t>
+            </w:r>
+          </w:p>
+        </w:tc>
+        <w:tc>
+          <w:tcPr/>
+          <w:p>
+            <w:pPr>
+              <w:pStyle w:val="Compact"/>
+              <w:jc w:val="left"/>
+            </w:pPr>
+            <w:r>
+              <w:t xml:space="preserve">✅ Good</w:t>
+            </w:r>
+          </w:p>
+        </w:tc>
+        <w:tc>
+          <w:tcPr/>
+          <w:p>
+            <w:pPr>
+              <w:pStyle w:val="Compact"/>
+              <w:jc w:val="left"/>
+            </w:pPr>
+            <w:r>
+              <w:t xml:space="preserve">⚠️ Moderate</w:t>
+            </w:r>
+          </w:p>
+        </w:tc>
+        <w:tc>
+          <w:tcPr/>
+          <w:p>
+            <w:pPr>
+              <w:pStyle w:val="Compact"/>
+              <w:jc w:val="left"/>
+            </w:pPr>
+            <w:r>
+              <w:t xml:space="preserve">Best speed/quality ratio</w:t>
             </w:r>
           </w:p>
         </w:tc>
@@ -8057,73 +8005,55 @@
                 <w:bCs/>
                 <w:b/>
               </w:rPr>
-              <w:t xml:space="preserve">Mid</w:t>
-            </w:r>
-            <w:r>
-              <w:t xml:space="preserve"> </w:t>
-            </w:r>
-            <w:r>
-              <w:t xml:space="preserve">(Gemma 4 27B)</w:t>
-            </w:r>
-          </w:p>
-        </w:tc>
-        <w:tc>
-          <w:tcPr/>
-          <w:p>
-            <w:pPr>
-              <w:pStyle w:val="Compact"/>
-              <w:jc w:val="left"/>
-            </w:pPr>
-            <w:r>
-              <w:t xml:space="preserve">1× RTX 3090 / 4090</w:t>
-            </w:r>
-          </w:p>
-        </w:tc>
-        <w:tc>
-          <w:tcPr/>
-          <w:p>
-            <w:pPr>
-              <w:pStyle w:val="Compact"/>
-              <w:jc w:val="left"/>
-            </w:pPr>
-            <w:r>
-              <w:t xml:space="preserve">24 GB</w:t>
-            </w:r>
-          </w:p>
-        </w:tc>
-        <w:tc>
-          <w:tcPr/>
-          <w:p>
-            <w:pPr>
-              <w:pStyle w:val="Compact"/>
-              <w:jc w:val="left"/>
-            </w:pPr>
-            <w:r>
-              <w:t xml:space="preserve">32 GB</w:t>
-            </w:r>
-          </w:p>
-        </w:tc>
-        <w:tc>
-          <w:tcPr/>
-          <w:p>
-            <w:pPr>
-              <w:pStyle w:val="Compact"/>
-              <w:jc w:val="left"/>
-            </w:pPr>
-            <w:r>
-              <w:t xml:space="preserve">50 GB</w:t>
-            </w:r>
-          </w:p>
-        </w:tc>
-        <w:tc>
-          <w:tcPr/>
-          <w:p>
-            <w:pPr>
-              <w:pStyle w:val="Compact"/>
-              <w:jc w:val="left"/>
-            </w:pPr>
-            <w:r>
-              <w:t xml:space="preserve">Best quality/cost for self-hosted</w:t>
+              <w:t xml:space="preserve">Gemma 4 27B</w:t>
+            </w:r>
+          </w:p>
+        </w:tc>
+        <w:tc>
+          <w:tcPr/>
+          <w:p>
+            <w:pPr>
+              <w:pStyle w:val="Compact"/>
+              <w:jc w:val="left"/>
+            </w:pPr>
+            <w:r>
+              <w:t xml:space="preserve">~18 GB</w:t>
+            </w:r>
+          </w:p>
+        </w:tc>
+        <w:tc>
+          <w:tcPr/>
+          <w:p>
+            <w:pPr>
+              <w:pStyle w:val="Compact"/>
+              <w:jc w:val="left"/>
+            </w:pPr>
+            <w:r>
+              <w:t xml:space="preserve">✅ Excellent + bounding boxes</w:t>
+            </w:r>
+          </w:p>
+        </w:tc>
+        <w:tc>
+          <w:tcPr/>
+          <w:p>
+            <w:pPr>
+              <w:pStyle w:val="Compact"/>
+              <w:jc w:val="left"/>
+            </w:pPr>
+            <w:r>
+              <w:t xml:space="preserve">⚠️ Moderate</w:t>
+            </w:r>
+          </w:p>
+        </w:tc>
+        <w:tc>
+          <w:tcPr/>
+          <w:p>
+            <w:pPr>
+              <w:pStyle w:val="Compact"/>
+              <w:jc w:val="left"/>
+            </w:pPr>
+            <w:r>
+              <w:t xml:space="preserve">Best open model for doc analysis</w:t>
             </w:r>
           </w:p>
         </w:tc>
@@ -8141,73 +8071,55 @@
                 <w:bCs/>
                 <w:b/>
               </w:rPr>
-              <w:t xml:space="preserve">High</w:t>
-            </w:r>
-            <w:r>
-              <w:t xml:space="preserve"> </w:t>
-            </w:r>
-            <w:r>
-              <w:t xml:space="preserve">(Qwen 72B)</w:t>
-            </w:r>
-          </w:p>
-        </w:tc>
-        <w:tc>
-          <w:tcPr/>
-          <w:p>
-            <w:pPr>
-              <w:pStyle w:val="Compact"/>
-              <w:jc w:val="left"/>
-            </w:pPr>
-            <w:r>
-              <w:t xml:space="preserve">2× RTX 3090 or 1× A100</w:t>
-            </w:r>
-          </w:p>
-        </w:tc>
-        <w:tc>
-          <w:tcPr/>
-          <w:p>
-            <w:pPr>
-              <w:pStyle w:val="Compact"/>
-              <w:jc w:val="left"/>
-            </w:pPr>
-            <w:r>
-              <w:t xml:space="preserve">48+ GB</w:t>
-            </w:r>
-          </w:p>
-        </w:tc>
-        <w:tc>
-          <w:tcPr/>
-          <w:p>
-            <w:pPr>
-              <w:pStyle w:val="Compact"/>
-              <w:jc w:val="left"/>
-            </w:pPr>
-            <w:r>
-              <w:t xml:space="preserve">64 GB</w:t>
-            </w:r>
-          </w:p>
-        </w:tc>
-        <w:tc>
-          <w:tcPr/>
-          <w:p>
-            <w:pPr>
-              <w:pStyle w:val="Compact"/>
-              <w:jc w:val="left"/>
-            </w:pPr>
-            <w:r>
-              <w:t xml:space="preserve">100 GB</w:t>
-            </w:r>
-          </w:p>
-        </w:tc>
-        <w:tc>
-          <w:tcPr/>
-          <w:p>
-            <w:pPr>
-              <w:pStyle w:val="Compact"/>
-              <w:jc w:val="left"/>
-            </w:pPr>
-            <w:r>
-              <w:t xml:space="preserve">Enterprise quality, overkill for 2/day</w:t>
+              <w:t xml:space="preserve">Qwen2.5-VL-7B</w:t>
+            </w:r>
+          </w:p>
+        </w:tc>
+        <w:tc>
+          <w:tcPr/>
+          <w:p>
+            <w:pPr>
+              <w:pStyle w:val="Compact"/>
+              <w:jc w:val="left"/>
+            </w:pPr>
+            <w:r>
+              <w:t xml:space="preserve">~5 GB</w:t>
+            </w:r>
+          </w:p>
+        </w:tc>
+        <w:tc>
+          <w:tcPr/>
+          <w:p>
+            <w:pPr>
+              <w:pStyle w:val="Compact"/>
+              <w:jc w:val="left"/>
+            </w:pPr>
+            <w:r>
+              <w:t xml:space="preserve">✅ Excellent OCR</w:t>
+            </w:r>
+          </w:p>
+        </w:tc>
+        <w:tc>
+          <w:tcPr/>
+          <w:p>
+            <w:pPr>
+              <w:pStyle w:val="Compact"/>
+              <w:jc w:val="left"/>
+            </w:pPr>
+            <w:r>
+              <w:t xml:space="preserve">✅ Good</w:t>
+            </w:r>
+          </w:p>
+        </w:tc>
+        <w:tc>
+          <w:tcPr/>
+          <w:p>
+            <w:pPr>
+              <w:pStyle w:val="Compact"/>
+              <w:jc w:val="left"/>
+            </w:pPr>
+            <w:r>
+              <w:t xml:space="preserve">Best Hebrew OCR among smaller models</w:t>
             </w:r>
           </w:p>
         </w:tc>
@@ -8225,73 +8137,55 @@
                 <w:bCs/>
                 <w:b/>
               </w:rPr>
-              <w:t xml:space="preserve">CPU-only</w:t>
-            </w:r>
-            <w:r>
-              <w:t xml:space="preserve"> </w:t>
-            </w:r>
-            <w:r>
-              <w:t xml:space="preserve">(Gemma 4 12B Q4)</w:t>
-            </w:r>
-          </w:p>
-        </w:tc>
-        <w:tc>
-          <w:tcPr/>
-          <w:p>
-            <w:pPr>
-              <w:pStyle w:val="Compact"/>
-              <w:jc w:val="left"/>
-            </w:pPr>
-            <w:r>
-              <w:t xml:space="preserve">None</w:t>
-            </w:r>
-          </w:p>
-        </w:tc>
-        <w:tc>
-          <w:tcPr/>
-          <w:p>
-            <w:pPr>
-              <w:pStyle w:val="Compact"/>
-              <w:jc w:val="left"/>
-            </w:pPr>
-            <w:r>
-              <w:t xml:space="preserve">0</w:t>
-            </w:r>
-          </w:p>
-        </w:tc>
-        <w:tc>
-          <w:tcPr/>
-          <w:p>
-            <w:pPr>
-              <w:pStyle w:val="Compact"/>
-              <w:jc w:val="left"/>
-            </w:pPr>
-            <w:r>
-              <w:t xml:space="preserve">16 GB</w:t>
-            </w:r>
-          </w:p>
-        </w:tc>
-        <w:tc>
-          <w:tcPr/>
-          <w:p>
-            <w:pPr>
-              <w:pStyle w:val="Compact"/>
-              <w:jc w:val="left"/>
-            </w:pPr>
-            <w:r>
-              <w:t xml:space="preserve">30 GB</w:t>
-            </w:r>
-          </w:p>
-        </w:tc>
-        <w:tc>
-          <w:tcPr/>
-          <w:p>
-            <w:pPr>
-              <w:pStyle w:val="Compact"/>
-              <w:jc w:val="left"/>
-            </w:pPr>
-            <w:r>
-              <w:t xml:space="preserve">Works but slow (~2-5 tok/s, ~60s per form analysis)</w:t>
+              <w:t xml:space="preserve">Qwen2.5-VL-72B</w:t>
+            </w:r>
+          </w:p>
+        </w:tc>
+        <w:tc>
+          <w:tcPr/>
+          <w:p>
+            <w:pPr>
+              <w:pStyle w:val="Compact"/>
+              <w:jc w:val="left"/>
+            </w:pPr>
+            <w:r>
+              <w:t xml:space="preserve">~42 GB</w:t>
+            </w:r>
+          </w:p>
+        </w:tc>
+        <w:tc>
+          <w:tcPr/>
+          <w:p>
+            <w:pPr>
+              <w:pStyle w:val="Compact"/>
+              <w:jc w:val="left"/>
+            </w:pPr>
+            <w:r>
+              <w:t xml:space="preserve">✅ Best-in-class</w:t>
+            </w:r>
+          </w:p>
+        </w:tc>
+        <w:tc>
+          <w:tcPr/>
+          <w:p>
+            <w:pPr>
+              <w:pStyle w:val="Compact"/>
+              <w:jc w:val="left"/>
+            </w:pPr>
+            <w:r>
+              <w:t xml:space="preserve">✅ Good</w:t>
+            </w:r>
+          </w:p>
+        </w:tc>
+        <w:tc>
+          <w:tcPr/>
+          <w:p>
+            <w:pPr>
+              <w:pStyle w:val="Compact"/>
+              <w:jc w:val="left"/>
+            </w:pPr>
+            <w:r>
+              <w:t xml:space="preserve">If your machine has the VRAM</w:t>
             </w:r>
           </w:p>
         </w:tc>
@@ -8306,10 +8200,10 @@
           <w:bCs/>
           <w:b/>
         </w:rPr>
-        <w:t xml:space="preserve">Recommendation for your use case (2 forms/day)</w:t>
-      </w:r>
-      <w:r>
-        <w:t xml:space="preserve">:</w:t>
+        <w:t xml:space="preserve">Recommendation for Hebrew forms</w:t>
+      </w:r>
+      <w:r>
+        <w:t xml:space="preserve">: Start with</w:t>
       </w:r>
       <w:r>
         <w:t xml:space="preserve"> </w:t>
@@ -8319,13 +8213,13 @@
           <w:bCs/>
           <w:b/>
         </w:rPr>
-        <w:t xml:space="preserve">Gemma 4 12B</w:t>
-      </w:r>
-      <w:r>
-        <w:t xml:space="preserve"> </w:t>
-      </w:r>
-      <w:r>
-        <w:t xml:space="preserve">on a GPU with 12+ GB VRAM, or</w:t>
+        <w:t xml:space="preserve">Qwen2.5-VL-7B</w:t>
+      </w:r>
+      <w:r>
+        <w:t xml:space="preserve"> </w:t>
+      </w:r>
+      <w:r>
+        <w:t xml:space="preserve">(best Hebrew OCR in its class). If your machine has 24+ GB VRAM, try</w:t>
       </w:r>
       <w:r>
         <w:t xml:space="preserve"> </w:t>
@@ -8335,39 +8229,429 @@
           <w:bCs/>
           <w:b/>
         </w:rPr>
-        <w:t xml:space="preserve">CPU-only</w:t>
-      </w:r>
-      <w:r>
-        <w:t xml:space="preserve"> </w:t>
-      </w:r>
-      <w:r>
-        <w:t xml:space="preserve">if you can tolerate ~60 seconds per form analysis. For Hebrew-heavy forms,</w:t>
-      </w:r>
-      <w:r>
-        <w:t xml:space="preserve"> </w:t>
-      </w:r>
+        <w:t xml:space="preserve">Gemma 4 27B</w:t>
+      </w:r>
+      <w:r>
+        <w:t xml:space="preserve"> </w:t>
+      </w:r>
+      <w:r>
+        <w:t xml:space="preserve">for superior document analysis.</w:t>
+      </w:r>
+    </w:p>
+    <w:bookmarkEnd w:id="42"/>
+    <w:bookmarkStart w:id="43" w:name="vllm-setup-already-running"/>
+    <w:p>
+      <w:pPr>
+        <w:pStyle w:val="Heading4"/>
+      </w:pPr>
+      <w:r>
+        <w:t xml:space="preserve">vLLM Setup (already running)</w:t>
+      </w:r>
+    </w:p>
+    <w:p>
+      <w:pPr>
+        <w:pStyle w:val="FirstParagraph"/>
+      </w:pPr>
+      <w:r>
+        <w:t xml:space="preserve">Your dedicated LLM machine already runs vLLM. Ensure it’s configured with a vision-capable model and the OpenAI-compatible API enabled:</w:t>
+      </w:r>
+    </w:p>
+    <w:p>
+      <w:pPr>
+        <w:pStyle w:val="SourceCode"/>
+      </w:pPr>
+      <w:r>
+        <w:rPr>
+          <w:rStyle w:val="CommentTok"/>
+        </w:rPr>
+        <w:t xml:space="preserve"># vLLM serves an OpenAI-compatible API (default port 8000)</w:t>
+      </w:r>
+      <w:r>
+        <w:br/>
+      </w:r>
+      <w:r>
+        <w:rPr>
+          <w:rStyle w:val="CommentTok"/>
+        </w:rPr>
+        <w:t xml:space="preserve"># Typical startup command:</w:t>
+      </w:r>
+      <w:r>
+        <w:br/>
+      </w:r>
+      <w:r>
+        <w:rPr>
+          <w:rStyle w:val="ExtensionTok"/>
+        </w:rPr>
+        <w:t xml:space="preserve">vllm</w:t>
+      </w:r>
+      <w:r>
+        <w:rPr>
+          <w:rStyle w:val="NormalTok"/>
+        </w:rPr>
+        <w:t xml:space="preserve"> serve google/gemma-4-12b-it </w:t>
+      </w:r>
+      <w:r>
+        <w:rPr>
+          <w:rStyle w:val="DataTypeTok"/>
+        </w:rPr>
+        <w:t xml:space="preserve">\ </w:t>
+      </w:r>
+      <w:r>
+        <w:rPr>
+          <w:rStyle w:val="NormalTok"/>
+        </w:rPr>
+        <w:t xml:space="preserve"> </w:t>
+      </w:r>
+      <w:r>
+        <w:rPr>
+          <w:rStyle w:val="CommentTok"/>
+        </w:rPr>
+        <w:t xml:space="preserve"># or Qwen/Qwen2.5-VL-7B-Instruct</w:t>
+      </w:r>
+      <w:r>
+        <w:br/>
+      </w:r>
+      <w:r>
+        <w:rPr>
+          <w:rStyle w:val="NormalTok"/>
+        </w:rPr>
+        <w:t xml:space="preserve">  </w:t>
+      </w:r>
+      <w:r>
+        <w:rPr>
+          <w:rStyle w:val="ExtensionTok"/>
+        </w:rPr>
+        <w:t xml:space="preserve">--port</w:t>
+      </w:r>
+      <w:r>
+        <w:rPr>
+          <w:rStyle w:val="NormalTok"/>
+        </w:rPr>
+        <w:t xml:space="preserve"> 8000 </w:t>
+      </w:r>
+      <w:r>
+        <w:rPr>
+          <w:rStyle w:val="DataTypeTok"/>
+        </w:rPr>
+        <w:t xml:space="preserve">\</w:t>
+      </w:r>
+      <w:r>
+        <w:br/>
+      </w:r>
+      <w:r>
+        <w:rPr>
+          <w:rStyle w:val="NormalTok"/>
+        </w:rPr>
+        <w:t xml:space="preserve">  </w:t>
+      </w:r>
+      <w:r>
+        <w:rPr>
+          <w:rStyle w:val="AttributeTok"/>
+        </w:rPr>
+        <w:t xml:space="preserve">--api-key</w:t>
+      </w:r>
+      <w:r>
+        <w:rPr>
+          <w:rStyle w:val="NormalTok"/>
+        </w:rPr>
+        <w:t xml:space="preserve"> </w:t>
+      </w:r>
+      <w:r>
+        <w:rPr>
+          <w:rStyle w:val="StringTok"/>
+        </w:rPr>
+        <w:t xml:space="preserve">"your-token"</w:t>
+      </w:r>
+      <w:r>
+        <w:rPr>
+          <w:rStyle w:val="NormalTok"/>
+        </w:rPr>
+        <w:t xml:space="preserve">  </w:t>
+      </w:r>
+      <w:r>
+        <w:rPr>
+          <w:rStyle w:val="CommentTok"/>
+        </w:rPr>
+        <w:t xml:space="preserve"># optional, for auth</w:t>
+      </w:r>
+      <w:r>
+        <w:br/>
+      </w:r>
+      <w:r>
+        <w:br/>
+      </w:r>
+      <w:r>
+        <w:rPr>
+          <w:rStyle w:val="CommentTok"/>
+        </w:rPr>
+        <w:t xml:space="preserve"># Verify vision works:</w:t>
+      </w:r>
+      <w:r>
+        <w:br/>
+      </w:r>
+      <w:r>
+        <w:rPr>
+          <w:rStyle w:val="ExtensionTok"/>
+        </w:rPr>
+        <w:t xml:space="preserve">curl</w:t>
+      </w:r>
+      <w:r>
+        <w:rPr>
+          <w:rStyle w:val="NormalTok"/>
+        </w:rPr>
+        <w:t xml:space="preserve"> http://</w:t>
+      </w:r>
+      <w:r>
+        <w:rPr>
+          <w:rStyle w:val="OperatorTok"/>
+        </w:rPr>
+        <w:t xml:space="preserve">&lt;</w:t>
+      </w:r>
+      <w:r>
+        <w:rPr>
+          <w:rStyle w:val="NormalTok"/>
+        </w:rPr>
+        <w:t xml:space="preserve">LLM_MACHINE_IP</w:t>
+      </w:r>
+      <w:r>
+        <w:rPr>
+          <w:rStyle w:val="OperatorTok"/>
+        </w:rPr>
+        <w:t xml:space="preserve">&gt;</w:t>
+      </w:r>
+      <w:r>
+        <w:rPr>
+          <w:rStyle w:val="NormalTok"/>
+        </w:rPr>
+        <w:t xml:space="preserve">:8000/v1/chat/completions </w:t>
+      </w:r>
+      <w:r>
+        <w:rPr>
+          <w:rStyle w:val="DataTypeTok"/>
+        </w:rPr>
+        <w:t xml:space="preserve">\</w:t>
+      </w:r>
+      <w:r>
+        <w:br/>
+      </w:r>
+      <w:r>
+        <w:rPr>
+          <w:rStyle w:val="NormalTok"/>
+        </w:rPr>
+        <w:t xml:space="preserve">  </w:t>
+      </w:r>
+      <w:r>
+        <w:rPr>
+          <w:rStyle w:val="AttributeTok"/>
+        </w:rPr>
+        <w:t xml:space="preserve">-H</w:t>
+      </w:r>
+      <w:r>
+        <w:rPr>
+          <w:rStyle w:val="NormalTok"/>
+        </w:rPr>
+        <w:t xml:space="preserve"> </w:t>
+      </w:r>
+      <w:r>
+        <w:rPr>
+          <w:rStyle w:val="StringTok"/>
+        </w:rPr>
+        <w:t xml:space="preserve">"Content-Type: application/json"</w:t>
+      </w:r>
+      <w:r>
+        <w:rPr>
+          <w:rStyle w:val="NormalTok"/>
+        </w:rPr>
+        <w:t xml:space="preserve"> </w:t>
+      </w:r>
+      <w:r>
+        <w:rPr>
+          <w:rStyle w:val="DataTypeTok"/>
+        </w:rPr>
+        <w:t xml:space="preserve">\</w:t>
+      </w:r>
+      <w:r>
+        <w:br/>
+      </w:r>
+      <w:r>
+        <w:rPr>
+          <w:rStyle w:val="NormalTok"/>
+        </w:rPr>
+        <w:t xml:space="preserve">  </w:t>
+      </w:r>
+      <w:r>
+        <w:rPr>
+          <w:rStyle w:val="AttributeTok"/>
+        </w:rPr>
+        <w:t xml:space="preserve">-H</w:t>
+      </w:r>
+      <w:r>
+        <w:rPr>
+          <w:rStyle w:val="NormalTok"/>
+        </w:rPr>
+        <w:t xml:space="preserve"> </w:t>
+      </w:r>
+      <w:r>
+        <w:rPr>
+          <w:rStyle w:val="StringTok"/>
+        </w:rPr>
+        <w:t xml:space="preserve">"Authorization: Bearer your-token"</w:t>
+      </w:r>
+      <w:r>
+        <w:rPr>
+          <w:rStyle w:val="NormalTok"/>
+        </w:rPr>
+        <w:t xml:space="preserve"> </w:t>
+      </w:r>
+      <w:r>
+        <w:rPr>
+          <w:rStyle w:val="DataTypeTok"/>
+        </w:rPr>
+        <w:t xml:space="preserve">\</w:t>
+      </w:r>
+      <w:r>
+        <w:br/>
+      </w:r>
+      <w:r>
+        <w:rPr>
+          <w:rStyle w:val="NormalTok"/>
+        </w:rPr>
+        <w:t xml:space="preserve">  </w:t>
+      </w:r>
+      <w:r>
+        <w:rPr>
+          <w:rStyle w:val="AttributeTok"/>
+        </w:rPr>
+        <w:t xml:space="preserve">-d</w:t>
+      </w:r>
+      <w:r>
+        <w:rPr>
+          <w:rStyle w:val="NormalTok"/>
+        </w:rPr>
+        <w:t xml:space="preserve"> </w:t>
+      </w:r>
+      <w:r>
+        <w:rPr>
+          <w:rStyle w:val="StringTok"/>
+        </w:rPr>
+        <w:t xml:space="preserve">'{</w:t>
+      </w:r>
+      <w:r>
+        <w:br/>
+      </w:r>
+      <w:r>
+        <w:rPr>
+          <w:rStyle w:val="StringTok"/>
+        </w:rPr>
+        <w:t xml:space="preserve">    "model": "google/gemma-4-12b-it",</w:t>
+      </w:r>
+      <w:r>
+        <w:br/>
+      </w:r>
+      <w:r>
+        <w:rPr>
+          <w:rStyle w:val="StringTok"/>
+        </w:rPr>
+        <w:t xml:space="preserve">    "messages": [{</w:t>
+      </w:r>
+      <w:r>
+        <w:br/>
+      </w:r>
+      <w:r>
+        <w:rPr>
+          <w:rStyle w:val="StringTok"/>
+        </w:rPr>
+        <w:t xml:space="preserve">      "role": "user",</w:t>
+      </w:r>
+      <w:r>
+        <w:br/>
+      </w:r>
+      <w:r>
+        <w:rPr>
+          <w:rStyle w:val="StringTok"/>
+        </w:rPr>
+        <w:t xml:space="preserve">      "content": [</w:t>
+      </w:r>
+      <w:r>
+        <w:br/>
+      </w:r>
+      <w:r>
+        <w:rPr>
+          <w:rStyle w:val="StringTok"/>
+        </w:rPr>
+        <w:t xml:space="preserve">        {"type": "text", "text": "Analyze this PDF form..."},</w:t>
+      </w:r>
+      <w:r>
+        <w:br/>
+      </w:r>
+      <w:r>
+        <w:rPr>
+          <w:rStyle w:val="StringTok"/>
+        </w:rPr>
+        <w:t xml:space="preserve">        {"type": "image_url", "image_url": {"url": "data:image/png;base64,..."}}</w:t>
+      </w:r>
+      <w:r>
+        <w:br/>
+      </w:r>
+      <w:r>
+        <w:rPr>
+          <w:rStyle w:val="StringTok"/>
+        </w:rPr>
+        <w:t xml:space="preserve">      ]</w:t>
+      </w:r>
+      <w:r>
+        <w:br/>
+      </w:r>
+      <w:r>
+        <w:rPr>
+          <w:rStyle w:val="StringTok"/>
+        </w:rPr>
+        <w:t xml:space="preserve">    }]</w:t>
+      </w:r>
+      <w:r>
+        <w:br/>
+      </w:r>
+      <w:r>
+        <w:rPr>
+          <w:rStyle w:val="StringTok"/>
+        </w:rPr>
+        <w:t xml:space="preserve">  }'</w:t>
+      </w:r>
+    </w:p>
+    <w:bookmarkEnd w:id="43"/>
+    <w:bookmarkStart w:id="44" w:name="exposing-vllm-to-cloudflare-worker"/>
+    <w:p>
+      <w:pPr>
+        <w:pStyle w:val="Heading4"/>
+      </w:pPr>
+      <w:r>
+        <w:t xml:space="preserve">Exposing vLLM to Cloudflare Worker</w:t>
+      </w:r>
+    </w:p>
+    <w:p>
+      <w:pPr>
+        <w:pStyle w:val="FirstParagraph"/>
+      </w:pPr>
+      <w:r>
+        <w:t xml:space="preserve">The Cloudflare Worker needs to reach your vLLM server. Two approaches:</w:t>
+      </w:r>
+    </w:p>
+    <w:p>
+      <w:pPr>
+        <w:pStyle w:val="BodyText"/>
+      </w:pPr>
       <w:r>
         <w:rPr>
           <w:bCs/>
           <w:b/>
         </w:rPr>
-        <w:t xml:space="preserve">Qwen2.5-VL-7B</w:t>
-      </w:r>
-      <w:r>
-        <w:t xml:space="preserve"> </w:t>
-      </w:r>
-      <w:r>
-        <w:t xml:space="preserve">may have better Hebrew OCR out of the box.</w:t>
-      </w:r>
-    </w:p>
-    <w:bookmarkEnd w:id="41"/>
-    <w:bookmarkStart w:id="42" w:name="setup-via-ollama-simplest"/>
-    <w:p>
-      <w:pPr>
-        <w:pStyle w:val="Heading4"/>
-      </w:pPr>
-      <w:r>
-        <w:t xml:space="preserve">Setup via Ollama (simplest)</w:t>
+        <w:t xml:space="preserve">Approach A: Cloudflare Tunnel</w:t>
+      </w:r>
+      <w:r>
+        <w:t xml:space="preserve"> </w:t>
+      </w:r>
+      <w:r>
+        <w:t xml:space="preserve">(recommended — if LLM machine has cloudflared)</w:t>
       </w:r>
     </w:p>
     <w:p>
@@ -8378,56 +8662,41 @@
         <w:rPr>
           <w:rStyle w:val="CommentTok"/>
         </w:rPr>
-        <w:t xml:space="preserve"># On the Proxmox VM (same one or a dedicated GPU-passthrough VM)</w:t>
-      </w:r>
-      <w:r>
-        <w:br/>
-      </w:r>
-      <w:r>
-        <w:br/>
-      </w:r>
-      <w:r>
-        <w:rPr>
-          <w:rStyle w:val="CommentTok"/>
-        </w:rPr>
-        <w:t xml:space="preserve"># 1. Install Ollama</w:t>
-      </w:r>
-      <w:r>
-        <w:br/>
-      </w:r>
-      <w:r>
-        <w:rPr>
-          <w:rStyle w:val="ExtensionTok"/>
-        </w:rPr>
-        <w:t xml:space="preserve">curl</w:t>
-      </w:r>
-      <w:r>
-        <w:rPr>
-          <w:rStyle w:val="NormalTok"/>
-        </w:rPr>
-        <w:t xml:space="preserve"> </w:t>
+        <w:t xml:space="preserve"># On the LLM machine, add to cloudflared config:</w:t>
+      </w:r>
+      <w:r>
+        <w:br/>
+      </w:r>
+      <w:r>
+        <w:rPr>
+          <w:rStyle w:val="FunctionTok"/>
+        </w:rPr>
+        <w:t xml:space="preserve">ingress</w:t>
+      </w:r>
+      <w:r>
+        <w:rPr>
+          <w:rStyle w:val="KeywordTok"/>
+        </w:rPr>
+        <w:t xml:space="preserve">:</w:t>
+      </w:r>
+      <w:r>
+        <w:br/>
       </w:r>
       <w:r>
         <w:rPr>
           <w:rStyle w:val="AttributeTok"/>
         </w:rPr>
-        <w:t xml:space="preserve">-fsSL</w:t>
-      </w:r>
-      <w:r>
-        <w:rPr>
-          <w:rStyle w:val="NormalTok"/>
-        </w:rPr>
-        <w:t xml:space="preserve"> https://ollama.com/install.sh </w:t>
+        <w:t xml:space="preserve">  </w:t>
       </w:r>
       <w:r>
         <w:rPr>
           <w:rStyle w:val="KeywordTok"/>
         </w:rPr>
-        <w:t xml:space="preserve">|</w:t>
-      </w:r>
-      <w:r>
-        <w:rPr>
-          <w:rStyle w:val="NormalTok"/>
+        <w:t xml:space="preserve">-</w:t>
+      </w:r>
+      <w:r>
+        <w:rPr>
+          <w:rStyle w:val="AttributeTok"/>
         </w:rPr>
         <w:t xml:space="preserve"> </w:t>
       </w:r>
@@ -8435,452 +8704,46 @@
         <w:rPr>
           <w:rStyle w:val="FunctionTok"/>
         </w:rPr>
-        <w:t xml:space="preserve">sh</w:t>
-      </w:r>
-      <w:r>
-        <w:br/>
-      </w:r>
-      <w:r>
-        <w:br/>
-      </w:r>
-      <w:r>
-        <w:rPr>
-          <w:rStyle w:val="CommentTok"/>
-        </w:rPr>
-        <w:t xml:space="preserve"># 2. Pull your chosen model</w:t>
-      </w:r>
-      <w:r>
-        <w:br/>
-      </w:r>
-      <w:r>
-        <w:rPr>
-          <w:rStyle w:val="ExtensionTok"/>
-        </w:rPr>
-        <w:t xml:space="preserve">ollama</w:t>
-      </w:r>
-      <w:r>
-        <w:rPr>
-          <w:rStyle w:val="NormalTok"/>
-        </w:rPr>
-        <w:t xml:space="preserve"> pull gemma4:12b          </w:t>
-      </w:r>
-      <w:r>
-        <w:rPr>
-          <w:rStyle w:val="CommentTok"/>
-        </w:rPr>
-        <w:t xml:space="preserve"># ~7GB download, 8GB VRAM</w:t>
-      </w:r>
-      <w:r>
-        <w:br/>
-      </w:r>
-      <w:r>
-        <w:rPr>
-          <w:rStyle w:val="CommentTok"/>
-        </w:rPr>
-        <w:t xml:space="preserve"># OR</w:t>
-      </w:r>
-      <w:r>
-        <w:br/>
-      </w:r>
-      <w:r>
-        <w:rPr>
-          <w:rStyle w:val="ExtensionTok"/>
-        </w:rPr>
-        <w:t xml:space="preserve">ollama</w:t>
-      </w:r>
-      <w:r>
-        <w:rPr>
-          <w:rStyle w:val="NormalTok"/>
-        </w:rPr>
-        <w:t xml:space="preserve"> pull gemma4:27b          </w:t>
-      </w:r>
-      <w:r>
-        <w:rPr>
-          <w:rStyle w:val="CommentTok"/>
-        </w:rPr>
-        <w:t xml:space="preserve"># ~18GB download, 24GB VRAM  </w:t>
-      </w:r>
-      <w:r>
-        <w:br/>
-      </w:r>
-      <w:r>
-        <w:rPr>
-          <w:rStyle w:val="CommentTok"/>
-        </w:rPr>
-        <w:t xml:space="preserve"># OR</w:t>
-      </w:r>
-      <w:r>
-        <w:br/>
-      </w:r>
-      <w:r>
-        <w:rPr>
-          <w:rStyle w:val="ExtensionTok"/>
-        </w:rPr>
-        <w:t xml:space="preserve">ollama</w:t>
-      </w:r>
-      <w:r>
-        <w:rPr>
-          <w:rStyle w:val="NormalTok"/>
-        </w:rPr>
-        <w:t xml:space="preserve"> pull qwen2.5-vl:7b       </w:t>
-      </w:r>
-      <w:r>
-        <w:rPr>
-          <w:rStyle w:val="CommentTok"/>
-        </w:rPr>
-        <w:t xml:space="preserve"># ~5GB download, good Hebrew OCR</w:t>
-      </w:r>
-      <w:r>
-        <w:br/>
-      </w:r>
-      <w:r>
-        <w:br/>
-      </w:r>
-      <w:r>
-        <w:rPr>
-          <w:rStyle w:val="CommentTok"/>
-        </w:rPr>
-        <w:t xml:space="preserve"># 3. Ollama serves an OpenAI-compatible API on port 11434</w:t>
-      </w:r>
-      <w:r>
-        <w:br/>
-      </w:r>
-      <w:r>
-        <w:rPr>
-          <w:rStyle w:val="CommentTok"/>
-        </w:rPr>
-        <w:t xml:space="preserve"># Test it:</w:t>
-      </w:r>
-      <w:r>
-        <w:br/>
-      </w:r>
-      <w:r>
-        <w:rPr>
-          <w:rStyle w:val="ExtensionTok"/>
-        </w:rPr>
-        <w:t xml:space="preserve">curl</w:t>
-      </w:r>
-      <w:r>
-        <w:rPr>
-          <w:rStyle w:val="NormalTok"/>
-        </w:rPr>
-        <w:t xml:space="preserve"> http://localhost:11434/v1/chat/completions </w:t>
-      </w:r>
-      <w:r>
-        <w:rPr>
-          <w:rStyle w:val="DataTypeTok"/>
-        </w:rPr>
-        <w:t xml:space="preserve">\</w:t>
-      </w:r>
-      <w:r>
-        <w:br/>
-      </w:r>
-      <w:r>
-        <w:rPr>
-          <w:rStyle w:val="NormalTok"/>
-        </w:rPr>
-        <w:t xml:space="preserve">  </w:t>
+        <w:t xml:space="preserve">hostname</w:t>
+      </w:r>
+      <w:r>
+        <w:rPr>
+          <w:rStyle w:val="KeywordTok"/>
+        </w:rPr>
+        <w:t xml:space="preserve">:</w:t>
       </w:r>
       <w:r>
         <w:rPr>
           <w:rStyle w:val="AttributeTok"/>
         </w:rPr>
-        <w:t xml:space="preserve">-H</w:t>
-      </w:r>
-      <w:r>
-        <w:rPr>
-          <w:rStyle w:val="NormalTok"/>
-        </w:rPr>
-        <w:t xml:space="preserve"> </w:t>
-      </w:r>
-      <w:r>
-        <w:rPr>
-          <w:rStyle w:val="StringTok"/>
-        </w:rPr>
-        <w:t xml:space="preserve">"Content-Type: application/json"</w:t>
-      </w:r>
-      <w:r>
-        <w:rPr>
-          <w:rStyle w:val="NormalTok"/>
-        </w:rPr>
-        <w:t xml:space="preserve"> </w:t>
-      </w:r>
-      <w:r>
-        <w:rPr>
-          <w:rStyle w:val="DataTypeTok"/>
-        </w:rPr>
-        <w:t xml:space="preserve">\</w:t>
-      </w:r>
-      <w:r>
-        <w:br/>
-      </w:r>
-      <w:r>
-        <w:rPr>
-          <w:rStyle w:val="NormalTok"/>
-        </w:rPr>
-        <w:t xml:space="preserve">  </w:t>
+        <w:t xml:space="preserve"> llm.savlil.com</w:t>
+      </w:r>
+      <w:r>
+        <w:br/>
       </w:r>
       <w:r>
         <w:rPr>
           <w:rStyle w:val="AttributeTok"/>
         </w:rPr>
-        <w:t xml:space="preserve">-d</w:t>
-      </w:r>
-      <w:r>
-        <w:rPr>
-          <w:rStyle w:val="NormalTok"/>
-        </w:rPr>
-        <w:t xml:space="preserve"> </w:t>
-      </w:r>
-      <w:r>
-        <w:rPr>
-          <w:rStyle w:val="StringTok"/>
-        </w:rPr>
-        <w:t xml:space="preserve">'{</w:t>
-      </w:r>
-      <w:r>
-        <w:br/>
-      </w:r>
-      <w:r>
-        <w:rPr>
-          <w:rStyle w:val="StringTok"/>
-        </w:rPr>
-        <w:t xml:space="preserve">    "model": "gemma4:12b",</w:t>
-      </w:r>
-      <w:r>
-        <w:br/>
-      </w:r>
-      <w:r>
-        <w:rPr>
-          <w:rStyle w:val="StringTok"/>
-        </w:rPr>
-        <w:t xml:space="preserve">    "messages": [{"role": "user", "content": "Hello"}]</w:t>
-      </w:r>
-      <w:r>
-        <w:br/>
-      </w:r>
-      <w:r>
-        <w:rPr>
-          <w:rStyle w:val="StringTok"/>
-        </w:rPr>
-        <w:t xml:space="preserve">  }'</w:t>
-      </w:r>
-      <w:r>
-        <w:br/>
-      </w:r>
-      <w:r>
-        <w:br/>
-      </w:r>
-      <w:r>
-        <w:rPr>
-          <w:rStyle w:val="CommentTok"/>
-        </w:rPr>
-        <w:t xml:space="preserve"># 4. For vision (send base64 image):</w:t>
-      </w:r>
-      <w:r>
-        <w:br/>
-      </w:r>
-      <w:r>
-        <w:rPr>
-          <w:rStyle w:val="ExtensionTok"/>
-        </w:rPr>
-        <w:t xml:space="preserve">curl</w:t>
-      </w:r>
-      <w:r>
-        <w:rPr>
-          <w:rStyle w:val="NormalTok"/>
-        </w:rPr>
-        <w:t xml:space="preserve"> http://localhost:11434/v1/chat/completions </w:t>
-      </w:r>
-      <w:r>
-        <w:rPr>
-          <w:rStyle w:val="DataTypeTok"/>
-        </w:rPr>
-        <w:t xml:space="preserve">\</w:t>
-      </w:r>
-      <w:r>
-        <w:br/>
-      </w:r>
-      <w:r>
-        <w:rPr>
-          <w:rStyle w:val="NormalTok"/>
-        </w:rPr>
-        <w:t xml:space="preserve">  </w:t>
+        <w:t xml:space="preserve">    </w:t>
+      </w:r>
+      <w:r>
+        <w:rPr>
+          <w:rStyle w:val="FunctionTok"/>
+        </w:rPr>
+        <w:t xml:space="preserve">service</w:t>
+      </w:r>
+      <w:r>
+        <w:rPr>
+          <w:rStyle w:val="KeywordTok"/>
+        </w:rPr>
+        <w:t xml:space="preserve">:</w:t>
       </w:r>
       <w:r>
         <w:rPr>
           <w:rStyle w:val="AttributeTok"/>
         </w:rPr>
-        <w:t xml:space="preserve">-H</w:t>
-      </w:r>
-      <w:r>
-        <w:rPr>
-          <w:rStyle w:val="NormalTok"/>
-        </w:rPr>
-        <w:t xml:space="preserve"> </w:t>
-      </w:r>
-      <w:r>
-        <w:rPr>
-          <w:rStyle w:val="StringTok"/>
-        </w:rPr>
-        <w:t xml:space="preserve">"Content-Type: application/json"</w:t>
-      </w:r>
-      <w:r>
-        <w:rPr>
-          <w:rStyle w:val="NormalTok"/>
-        </w:rPr>
-        <w:t xml:space="preserve"> </w:t>
-      </w:r>
-      <w:r>
-        <w:rPr>
-          <w:rStyle w:val="DataTypeTok"/>
-        </w:rPr>
-        <w:t xml:space="preserve">\</w:t>
-      </w:r>
-      <w:r>
-        <w:br/>
-      </w:r>
-      <w:r>
-        <w:rPr>
-          <w:rStyle w:val="NormalTok"/>
-        </w:rPr>
-        <w:t xml:space="preserve">  </w:t>
-      </w:r>
-      <w:r>
-        <w:rPr>
-          <w:rStyle w:val="AttributeTok"/>
-        </w:rPr>
-        <w:t xml:space="preserve">-d</w:t>
-      </w:r>
-      <w:r>
-        <w:rPr>
-          <w:rStyle w:val="NormalTok"/>
-        </w:rPr>
-        <w:t xml:space="preserve"> </w:t>
-      </w:r>
-      <w:r>
-        <w:rPr>
-          <w:rStyle w:val="StringTok"/>
-        </w:rPr>
-        <w:t xml:space="preserve">'{</w:t>
-      </w:r>
-      <w:r>
-        <w:br/>
-      </w:r>
-      <w:r>
-        <w:rPr>
-          <w:rStyle w:val="StringTok"/>
-        </w:rPr>
-        <w:t xml:space="preserve">    "model": "gemma4:12b",</w:t>
-      </w:r>
-      <w:r>
-        <w:br/>
-      </w:r>
-      <w:r>
-        <w:rPr>
-          <w:rStyle w:val="StringTok"/>
-        </w:rPr>
-        <w:t xml:space="preserve">    "messages": [{</w:t>
-      </w:r>
-      <w:r>
-        <w:br/>
-      </w:r>
-      <w:r>
-        <w:rPr>
-          <w:rStyle w:val="StringTok"/>
-        </w:rPr>
-        <w:t xml:space="preserve">      "role": "user",</w:t>
-      </w:r>
-      <w:r>
-        <w:br/>
-      </w:r>
-      <w:r>
-        <w:rPr>
-          <w:rStyle w:val="StringTok"/>
-        </w:rPr>
-        <w:t xml:space="preserve">      "content": [</w:t>
-      </w:r>
-      <w:r>
-        <w:br/>
-      </w:r>
-      <w:r>
-        <w:rPr>
-          <w:rStyle w:val="StringTok"/>
-        </w:rPr>
-        <w:t xml:space="preserve">        {"type": "text", "text": "Analyze this PDF form..."},</w:t>
-      </w:r>
-      <w:r>
-        <w:br/>
-      </w:r>
-      <w:r>
-        <w:rPr>
-          <w:rStyle w:val="StringTok"/>
-        </w:rPr>
-        <w:t xml:space="preserve">        {"type": "image_url", "image_url": {"url": "data:image/png;base64,..."}}</w:t>
-      </w:r>
-      <w:r>
-        <w:br/>
-      </w:r>
-      <w:r>
-        <w:rPr>
-          <w:rStyle w:val="StringTok"/>
-        </w:rPr>
-        <w:t xml:space="preserve">      ]</w:t>
-      </w:r>
-      <w:r>
-        <w:br/>
-      </w:r>
-      <w:r>
-        <w:rPr>
-          <w:rStyle w:val="StringTok"/>
-        </w:rPr>
-        <w:t xml:space="preserve">    }]</w:t>
-      </w:r>
-      <w:r>
-        <w:br/>
-      </w:r>
-      <w:r>
-        <w:rPr>
-          <w:rStyle w:val="StringTok"/>
-        </w:rPr>
-        <w:t xml:space="preserve">  }'</w:t>
-      </w:r>
-      <w:r>
-        <w:br/>
-      </w:r>
-      <w:r>
-        <w:br/>
-      </w:r>
-      <w:r>
-        <w:rPr>
-          <w:rStyle w:val="CommentTok"/>
-        </w:rPr>
-        <w:t xml:space="preserve"># 5. Create systemd override for auto-start</w:t>
-      </w:r>
-      <w:r>
-        <w:br/>
-      </w:r>
-      <w:r>
-        <w:rPr>
-          <w:rStyle w:val="ExtensionTok"/>
-        </w:rPr>
-        <w:t xml:space="preserve">systemctl</w:t>
-      </w:r>
-      <w:r>
-        <w:rPr>
-          <w:rStyle w:val="NormalTok"/>
-        </w:rPr>
-        <w:t xml:space="preserve"> enable ollama</w:t>
-      </w:r>
-    </w:p>
-    <w:bookmarkEnd w:id="42"/>
-    <w:bookmarkStart w:id="43" w:name="exposing-to-cloudflare-worker"/>
-    <w:p>
-      <w:pPr>
-        <w:pStyle w:val="Heading4"/>
-      </w:pPr>
-      <w:r>
-        <w:t xml:space="preserve">Exposing to Cloudflare Worker</w:t>
+        <w:t xml:space="preserve"> http://localhost:8000</w:t>
       </w:r>
     </w:p>
     <w:p>
@@ -8888,7 +8751,16 @@
         <w:pStyle w:val="FirstParagraph"/>
       </w:pPr>
       <w:r>
-        <w:t xml:space="preserve">The Cloudflare Worker needs to reach Ollama on your VM. Two approaches:</w:t>
+        <w:t xml:space="preserve">Then in the Worker:</w:t>
+      </w:r>
+      <w:r>
+        <w:t xml:space="preserve"> </w:t>
+      </w:r>
+      <w:r>
+        <w:rPr>
+          <w:rStyle w:val="VerbatimChar"/>
+        </w:rPr>
+        <w:t xml:space="preserve">LLM_API_URL = https://llm.savlil.com/v1/chat/completions</w:t>
       </w:r>
     </w:p>
     <w:p>
@@ -8900,144 +8772,156 @@
           <w:bCs/>
           <w:b/>
         </w:rPr>
-        <w:t xml:space="preserve">Approach A: Tunnel the Ollama API</w:t>
-      </w:r>
-      <w:r>
-        <w:t xml:space="preserve"> </w:t>
-      </w:r>
-      <w:r>
-        <w:t xml:space="preserve">(recommended)</w:t>
+        <w:t xml:space="preserve">Approach B: Route through the LXC</w:t>
+      </w:r>
+      <w:r>
+        <w:t xml:space="preserve"> </w:t>
+      </w:r>
+      <w:r>
+        <w:t xml:space="preserve">(no extra tunnel needed)</w:t>
+      </w:r>
+      <w:r>
+        <w:t xml:space="preserve"> </w:t>
+      </w:r>
+      <w:r>
+        <w:t xml:space="preserve">The Worker calls</w:t>
+      </w:r>
+      <w:r>
+        <w:t xml:space="preserve"> </w:t>
+      </w:r>
+      <w:r>
+        <w:rPr>
+          <w:rStyle w:val="VerbatimChar"/>
+        </w:rPr>
+        <w:t xml:space="preserve">pdf.savlil.com</w:t>
+      </w:r>
+      <w:r>
+        <w:t xml:space="preserve"> </w:t>
+      </w:r>
+      <w:r>
+        <w:t xml:space="preserve">(the LXC), and the PDF filler LXC calls vLLM over LAN (</w:t>
+      </w:r>
+      <w:r>
+        <w:rPr>
+          <w:rStyle w:val="VerbatimChar"/>
+        </w:rPr>
+        <w:t xml:space="preserve">http://&lt;LLM_IP&gt;:8000</w:t>
+      </w:r>
+      <w:r>
+        <w:t xml:space="preserve">). This keeps the LLM API fully private — never exposed to the internet.</w:t>
       </w:r>
     </w:p>
     <w:p>
       <w:pPr>
-        <w:pStyle w:val="SourceCode"/>
-      </w:pPr>
-      <w:r>
-        <w:rPr>
-          <w:rStyle w:val="CommentTok"/>
-        </w:rPr>
-        <w:t xml:space="preserve"># Add to /etc/cloudflared/config.yml:</w:t>
-      </w:r>
-      <w:r>
-        <w:br/>
-      </w:r>
-      <w:r>
-        <w:rPr>
-          <w:rStyle w:val="FunctionTok"/>
-        </w:rPr>
-        <w:t xml:space="preserve">ingress</w:t>
-      </w:r>
-      <w:r>
-        <w:rPr>
-          <w:rStyle w:val="KeywordTok"/>
-        </w:rPr>
-        <w:t xml:space="preserve">:</w:t>
-      </w:r>
-      <w:r>
-        <w:br/>
-      </w:r>
-      <w:r>
-        <w:rPr>
-          <w:rStyle w:val="AttributeTok"/>
-        </w:rPr>
-        <w:t xml:space="preserve">  </w:t>
-      </w:r>
-      <w:r>
-        <w:rPr>
-          <w:rStyle w:val="KeywordTok"/>
-        </w:rPr>
-        <w:t xml:space="preserve">-</w:t>
-      </w:r>
-      <w:r>
-        <w:rPr>
-          <w:rStyle w:val="AttributeTok"/>
-        </w:rPr>
-        <w:t xml:space="preserve"> </w:t>
-      </w:r>
-      <w:r>
-        <w:rPr>
-          <w:rStyle w:val="FunctionTok"/>
-        </w:rPr>
-        <w:t xml:space="preserve">hostname</w:t>
-      </w:r>
-      <w:r>
-        <w:rPr>
-          <w:rStyle w:val="KeywordTok"/>
-        </w:rPr>
-        <w:t xml:space="preserve">:</w:t>
-      </w:r>
-      <w:r>
-        <w:rPr>
-          <w:rStyle w:val="AttributeTok"/>
-        </w:rPr>
-        <w:t xml:space="preserve"> llm.savlil.com</w:t>
-      </w:r>
-      <w:r>
-        <w:br/>
-      </w:r>
-      <w:r>
-        <w:rPr>
-          <w:rStyle w:val="AttributeTok"/>
-        </w:rPr>
-        <w:t xml:space="preserve">    </w:t>
-      </w:r>
-      <w:r>
-        <w:rPr>
-          <w:rStyle w:val="FunctionTok"/>
-        </w:rPr>
-        <w:t xml:space="preserve">service</w:t>
-      </w:r>
-      <w:r>
-        <w:rPr>
-          <w:rStyle w:val="KeywordTok"/>
-        </w:rPr>
-        <w:t xml:space="preserve">:</w:t>
-      </w:r>
-      <w:r>
-        <w:rPr>
-          <w:rStyle w:val="AttributeTok"/>
-        </w:rPr>
-        <w:t xml:space="preserve"> http://localhost:11434</w:t>
+        <w:pStyle w:val="BodyText"/>
+      </w:pPr>
+      <w:r>
+        <w:rPr>
+          <w:bCs/>
+          <w:b/>
+        </w:rPr>
+        <w:t xml:space="preserve">Approach C: Direct tunnel from existing LXC</w:t>
+      </w:r>
+      <w:r>
+        <w:t xml:space="preserve"> </w:t>
+      </w:r>
+      <w:r>
+        <w:t xml:space="preserve">Add the LLM machine’s IP as an ingress in the LXC’s existing cloudflared tunnel:</w:t>
       </w:r>
     </w:p>
     <w:p>
       <w:pPr>
-        <w:pStyle w:val="FirstParagraph"/>
-      </w:pPr>
-      <w:r>
-        <w:t xml:space="preserve">Then in the Worker:</w:t>
-      </w:r>
-      <w:r>
-        <w:t xml:space="preserve"> </w:t>
-      </w:r>
-      <w:r>
-        <w:rPr>
-          <w:rStyle w:val="VerbatimChar"/>
-        </w:rPr>
-        <w:t xml:space="preserve">LLM_API_URL = https://llm.savlil.com/v1/chat/completions</w:t>
+        <w:pStyle w:val="SourceCode"/>
+      </w:pPr>
+      <w:r>
+        <w:rPr>
+          <w:rStyle w:val="FunctionTok"/>
+        </w:rPr>
+        <w:t xml:space="preserve">ingress</w:t>
+      </w:r>
+      <w:r>
+        <w:rPr>
+          <w:rStyle w:val="KeywordTok"/>
+        </w:rPr>
+        <w:t xml:space="preserve">:</w:t>
+      </w:r>
+      <w:r>
+        <w:br/>
+      </w:r>
+      <w:r>
+        <w:rPr>
+          <w:rStyle w:val="AttributeTok"/>
+        </w:rPr>
+        <w:t xml:space="preserve">  </w:t>
+      </w:r>
+      <w:r>
+        <w:rPr>
+          <w:rStyle w:val="KeywordTok"/>
+        </w:rPr>
+        <w:t xml:space="preserve">-</w:t>
+      </w:r>
+      <w:r>
+        <w:rPr>
+          <w:rStyle w:val="AttributeTok"/>
+        </w:rPr>
+        <w:t xml:space="preserve"> </w:t>
+      </w:r>
+      <w:r>
+        <w:rPr>
+          <w:rStyle w:val="FunctionTok"/>
+        </w:rPr>
+        <w:t xml:space="preserve">hostname</w:t>
+      </w:r>
+      <w:r>
+        <w:rPr>
+          <w:rStyle w:val="KeywordTok"/>
+        </w:rPr>
+        <w:t xml:space="preserve">:</w:t>
+      </w:r>
+      <w:r>
+        <w:rPr>
+          <w:rStyle w:val="AttributeTok"/>
+        </w:rPr>
+        <w:t xml:space="preserve"> llm.savlil.com</w:t>
+      </w:r>
+      <w:r>
+        <w:br/>
+      </w:r>
+      <w:r>
+        <w:rPr>
+          <w:rStyle w:val="AttributeTok"/>
+        </w:rPr>
+        <w:t xml:space="preserve">    </w:t>
+      </w:r>
+      <w:r>
+        <w:rPr>
+          <w:rStyle w:val="FunctionTok"/>
+        </w:rPr>
+        <w:t xml:space="preserve">service</w:t>
+      </w:r>
+      <w:r>
+        <w:rPr>
+          <w:rStyle w:val="KeywordTok"/>
+        </w:rPr>
+        <w:t xml:space="preserve">:</w:t>
+      </w:r>
+      <w:r>
+        <w:rPr>
+          <w:rStyle w:val="AttributeTok"/>
+        </w:rPr>
+        <w:t xml:space="preserve"> http://&lt;LLM_MACHINE_LAN_IP&gt;:8000</w:t>
       </w:r>
     </w:p>
     <w:p>
       <w:pPr>
-        <w:pStyle w:val="BodyText"/>
-      </w:pPr>
-      <w:r>
-        <w:rPr>
-          <w:bCs/>
-          <w:b/>
-        </w:rPr>
-        <w:t xml:space="preserve">Approach B: Call from the PDF filler VM directly</w:t>
-      </w:r>
-      <w:r>
-        <w:t xml:space="preserve"> </w:t>
-      </w:r>
-      <w:r>
-        <w:t xml:space="preserve">Since the PDF filler and Ollama run on the same host (or LAN), the Worker calls the PDF filler, which calls Ollama locally. This avoids exposing the LLM API to the internet.</w:t>
+        <w:pStyle w:val="FirstParagraph"/>
+      </w:pPr>
+      <w:r>
+        <w:t xml:space="preserve">This works if the LXC can reach the LLM machine on your LAN.</w:t>
       </w:r>
     </w:p>
-    <w:bookmarkEnd w:id="43"/>
-    <w:bookmarkStart w:id="44" w:name="integration-from-cloudflare-worker"/>
+    <w:bookmarkEnd w:id="44"/>
+    <w:bookmarkStart w:id="45" w:name="integration-from-cloudflare-worker"/>
     <w:p>
       <w:pPr>
         <w:pStyle w:val="Heading4"/>
@@ -9054,7 +8938,7 @@
         <w:rPr>
           <w:rStyle w:val="CommentTok"/>
         </w:rPr>
-        <w:t xml:space="preserve">// Same OpenAI-compatible format as ChatLLM and Grok:</w:t>
+        <w:t xml:space="preserve">// Same OpenAI-compatible format as ChatLLM and Grok — vLLM is fully compatible:</w:t>
       </w:r>
       <w:r>
         <w:br/>
@@ -9189,7 +9073,16 @@
         <w:rPr>
           <w:rStyle w:val="NormalTok"/>
         </w:rPr>
-        <w:t xml:space="preserve"> { </w:t>
+        <w:t xml:space="preserve"> {</w:t>
+      </w:r>
+      <w:r>
+        <w:br/>
+      </w:r>
+      <w:r>
+        <w:rPr>
+          <w:rStyle w:val="NormalTok"/>
+        </w:rPr>
+        <w:t xml:space="preserve">    </w:t>
       </w:r>
       <w:r>
         <w:rPr>
@@ -9217,6 +9110,336 @@
       </w:r>
       <w:r>
         <w:rPr>
+          <w:rStyle w:val="OperatorTok"/>
+        </w:rPr>
+        <w:t xml:space="preserve">,</w:t>
+      </w:r>
+      <w:r>
+        <w:br/>
+      </w:r>
+      <w:r>
+        <w:rPr>
+          <w:rStyle w:val="NormalTok"/>
+        </w:rPr>
+        <w:t xml:space="preserve">    </w:t>
+      </w:r>
+      <w:r>
+        <w:rPr>
+          <w:rStyle w:val="StringTok"/>
+        </w:rPr>
+        <w:t xml:space="preserve">'Authorization'</w:t>
+      </w:r>
+      <w:r>
+        <w:rPr>
+          <w:rStyle w:val="OperatorTok"/>
+        </w:rPr>
+        <w:t xml:space="preserve">:</w:t>
+      </w:r>
+      <w:r>
+        <w:rPr>
+          <w:rStyle w:val="NormalTok"/>
+        </w:rPr>
+        <w:t xml:space="preserve"> </w:t>
+      </w:r>
+      <w:r>
+        <w:rPr>
+          <w:rStyle w:val="VerbatimStringTok"/>
+        </w:rPr>
+        <w:t xml:space="preserve">`Bearer </w:t>
+      </w:r>
+      <w:r>
+        <w:rPr>
+          <w:rStyle w:val="SpecialCharTok"/>
+        </w:rPr>
+        <w:t xml:space="preserve">${</w:t>
+      </w:r>
+      <w:r>
+        <w:rPr>
+          <w:rStyle w:val="NormalTok"/>
+        </w:rPr>
+        <w:t xml:space="preserve">env</w:t>
+      </w:r>
+      <w:r>
+        <w:rPr>
+          <w:rStyle w:val="OperatorTok"/>
+        </w:rPr>
+        <w:t xml:space="preserve">.</w:t>
+      </w:r>
+      <w:r>
+        <w:rPr>
+          <w:rStyle w:val="AttributeTok"/>
+        </w:rPr>
+        <w:t xml:space="preserve">VLLM_API_KEY</w:t>
+      </w:r>
+      <w:r>
+        <w:rPr>
+          <w:rStyle w:val="SpecialCharTok"/>
+        </w:rPr>
+        <w:t xml:space="preserve">}</w:t>
+      </w:r>
+      <w:r>
+        <w:rPr>
+          <w:rStyle w:val="VerbatimStringTok"/>
+        </w:rPr>
+        <w:t xml:space="preserve">`</w:t>
+      </w:r>
+      <w:r>
+        <w:rPr>
+          <w:rStyle w:val="NormalTok"/>
+        </w:rPr>
+        <w:t xml:space="preserve">  </w:t>
+      </w:r>
+      <w:r>
+        <w:rPr>
+          <w:rStyle w:val="CommentTok"/>
+        </w:rPr>
+        <w:t xml:space="preserve">// if vLLM requires auth</w:t>
+      </w:r>
+      <w:r>
+        <w:br/>
+      </w:r>
+      <w:r>
+        <w:rPr>
+          <w:rStyle w:val="NormalTok"/>
+        </w:rPr>
+        <w:t xml:space="preserve">  }</w:t>
+      </w:r>
+      <w:r>
+        <w:rPr>
+          <w:rStyle w:val="OperatorTok"/>
+        </w:rPr>
+        <w:t xml:space="preserve">,</w:t>
+      </w:r>
+      <w:r>
+        <w:br/>
+      </w:r>
+      <w:r>
+        <w:rPr>
+          <w:rStyle w:val="NormalTok"/>
+        </w:rPr>
+        <w:t xml:space="preserve">  body</w:t>
+      </w:r>
+      <w:r>
+        <w:rPr>
+          <w:rStyle w:val="OperatorTok"/>
+        </w:rPr>
+        <w:t xml:space="preserve">:</w:t>
+      </w:r>
+      <w:r>
+        <w:rPr>
+          <w:rStyle w:val="NormalTok"/>
+        </w:rPr>
+        <w:t xml:space="preserve"> </w:t>
+      </w:r>
+      <w:r>
+        <w:rPr>
+          <w:rStyle w:val="BuiltInTok"/>
+        </w:rPr>
+        <w:t xml:space="preserve">JSON</w:t>
+      </w:r>
+      <w:r>
+        <w:rPr>
+          <w:rStyle w:val="OperatorTok"/>
+        </w:rPr>
+        <w:t xml:space="preserve">.</w:t>
+      </w:r>
+      <w:r>
+        <w:rPr>
+          <w:rStyle w:val="FunctionTok"/>
+        </w:rPr>
+        <w:t xml:space="preserve">stringify</w:t>
+      </w:r>
+      <w:r>
+        <w:rPr>
+          <w:rStyle w:val="NormalTok"/>
+        </w:rPr>
+        <w:t xml:space="preserve">({</w:t>
+      </w:r>
+      <w:r>
+        <w:br/>
+      </w:r>
+      <w:r>
+        <w:rPr>
+          <w:rStyle w:val="NormalTok"/>
+        </w:rPr>
+        <w:t xml:space="preserve">    model</w:t>
+      </w:r>
+      <w:r>
+        <w:rPr>
+          <w:rStyle w:val="OperatorTok"/>
+        </w:rPr>
+        <w:t xml:space="preserve">:</w:t>
+      </w:r>
+      <w:r>
+        <w:rPr>
+          <w:rStyle w:val="NormalTok"/>
+        </w:rPr>
+        <w:t xml:space="preserve"> env</w:t>
+      </w:r>
+      <w:r>
+        <w:rPr>
+          <w:rStyle w:val="OperatorTok"/>
+        </w:rPr>
+        <w:t xml:space="preserve">.</w:t>
+      </w:r>
+      <w:r>
+        <w:rPr>
+          <w:rStyle w:val="AttributeTok"/>
+        </w:rPr>
+        <w:t xml:space="preserve">LLM_MODEL</w:t>
+      </w:r>
+      <w:r>
+        <w:rPr>
+          <w:rStyle w:val="OperatorTok"/>
+        </w:rPr>
+        <w:t xml:space="preserve">,</w:t>
+      </w:r>
+      <w:r>
+        <w:rPr>
+          <w:rStyle w:val="NormalTok"/>
+        </w:rPr>
+        <w:t xml:space="preserve">  </w:t>
+      </w:r>
+      <w:r>
+        <w:rPr>
+          <w:rStyle w:val="CommentTok"/>
+        </w:rPr>
+        <w:t xml:space="preserve">// e.g. 'google/gemma-4-12b-it'</w:t>
+      </w:r>
+      <w:r>
+        <w:br/>
+      </w:r>
+      <w:r>
+        <w:rPr>
+          <w:rStyle w:val="NormalTok"/>
+        </w:rPr>
+        <w:t xml:space="preserve">    messages</w:t>
+      </w:r>
+      <w:r>
+        <w:rPr>
+          <w:rStyle w:val="OperatorTok"/>
+        </w:rPr>
+        <w:t xml:space="preserve">:</w:t>
+      </w:r>
+      <w:r>
+        <w:rPr>
+          <w:rStyle w:val="NormalTok"/>
+        </w:rPr>
+        <w:t xml:space="preserve"> [{</w:t>
+      </w:r>
+      <w:r>
+        <w:br/>
+      </w:r>
+      <w:r>
+        <w:rPr>
+          <w:rStyle w:val="NormalTok"/>
+        </w:rPr>
+        <w:t xml:space="preserve">      role</w:t>
+      </w:r>
+      <w:r>
+        <w:rPr>
+          <w:rStyle w:val="OperatorTok"/>
+        </w:rPr>
+        <w:t xml:space="preserve">:</w:t>
+      </w:r>
+      <w:r>
+        <w:rPr>
+          <w:rStyle w:val="NormalTok"/>
+        </w:rPr>
+        <w:t xml:space="preserve"> </w:t>
+      </w:r>
+      <w:r>
+        <w:rPr>
+          <w:rStyle w:val="StringTok"/>
+        </w:rPr>
+        <w:t xml:space="preserve">'user'</w:t>
+      </w:r>
+      <w:r>
+        <w:rPr>
+          <w:rStyle w:val="OperatorTok"/>
+        </w:rPr>
+        <w:t xml:space="preserve">,</w:t>
+      </w:r>
+      <w:r>
+        <w:br/>
+      </w:r>
+      <w:r>
+        <w:rPr>
+          <w:rStyle w:val="NormalTok"/>
+        </w:rPr>
+        <w:t xml:space="preserve">      content</w:t>
+      </w:r>
+      <w:r>
+        <w:rPr>
+          <w:rStyle w:val="OperatorTok"/>
+        </w:rPr>
+        <w:t xml:space="preserve">:</w:t>
+      </w:r>
+      <w:r>
+        <w:rPr>
+          <w:rStyle w:val="NormalTok"/>
+        </w:rPr>
+        <w:t xml:space="preserve"> [</w:t>
+      </w:r>
+      <w:r>
+        <w:br/>
+      </w:r>
+      <w:r>
+        <w:rPr>
+          <w:rStyle w:val="NormalTok"/>
+        </w:rPr>
+        <w:t xml:space="preserve">        { type</w:t>
+      </w:r>
+      <w:r>
+        <w:rPr>
+          <w:rStyle w:val="OperatorTok"/>
+        </w:rPr>
+        <w:t xml:space="preserve">:</w:t>
+      </w:r>
+      <w:r>
+        <w:rPr>
+          <w:rStyle w:val="NormalTok"/>
+        </w:rPr>
+        <w:t xml:space="preserve"> </w:t>
+      </w:r>
+      <w:r>
+        <w:rPr>
+          <w:rStyle w:val="StringTok"/>
+        </w:rPr>
+        <w:t xml:space="preserve">'text'</w:t>
+      </w:r>
+      <w:r>
+        <w:rPr>
+          <w:rStyle w:val="OperatorTok"/>
+        </w:rPr>
+        <w:t xml:space="preserve">,</w:t>
+      </w:r>
+      <w:r>
+        <w:rPr>
+          <w:rStyle w:val="NormalTok"/>
+        </w:rPr>
+        <w:t xml:space="preserve"> text</w:t>
+      </w:r>
+      <w:r>
+        <w:rPr>
+          <w:rStyle w:val="OperatorTok"/>
+        </w:rPr>
+        <w:t xml:space="preserve">:</w:t>
+      </w:r>
+      <w:r>
+        <w:rPr>
+          <w:rStyle w:val="NormalTok"/>
+        </w:rPr>
+        <w:t xml:space="preserve"> </w:t>
+      </w:r>
+      <w:r>
+        <w:rPr>
+          <w:rStyle w:val="StringTok"/>
+        </w:rPr>
+        <w:t xml:space="preserve">'Analyze this Hebrew PDF form...'</w:t>
+      </w:r>
+      <w:r>
+        <w:rPr>
           <w:rStyle w:val="NormalTok"/>
         </w:rPr>
         <w:t xml:space="preserve"> }</w:t>
@@ -9234,22 +9457,7 @@
         <w:rPr>
           <w:rStyle w:val="NormalTok"/>
         </w:rPr>
-        <w:t xml:space="preserve">  </w:t>
-      </w:r>
-      <w:r>
-        <w:rPr>
-          <w:rStyle w:val="CommentTok"/>
-        </w:rPr>
-        <w:t xml:space="preserve">// No auth needed if behind Cloudflare Tunnel with Access policy</w:t>
-      </w:r>
-      <w:r>
-        <w:br/>
-      </w:r>
-      <w:r>
-        <w:rPr>
-          <w:rStyle w:val="NormalTok"/>
-        </w:rPr>
-        <w:t xml:space="preserve">  body</w:t>
+        <w:t xml:space="preserve">        { type</w:t>
       </w:r>
       <w:r>
         <w:rPr>
@@ -9265,36 +9473,21 @@
       </w:r>
       <w:r>
         <w:rPr>
-          <w:rStyle w:val="BuiltInTok"/>
-        </w:rPr>
-        <w:t xml:space="preserve">JSON</w:t>
-      </w:r>
-      <w:r>
-        <w:rPr>
-          <w:rStyle w:val="OperatorTok"/>
-        </w:rPr>
-        <w:t xml:space="preserve">.</w:t>
-      </w:r>
-      <w:r>
-        <w:rPr>
-          <w:rStyle w:val="FunctionTok"/>
-        </w:rPr>
-        <w:t xml:space="preserve">stringify</w:t>
-      </w:r>
-      <w:r>
-        <w:rPr>
-          <w:rStyle w:val="NormalTok"/>
-        </w:rPr>
-        <w:t xml:space="preserve">({</w:t>
-      </w:r>
-      <w:r>
-        <w:br/>
-      </w:r>
-      <w:r>
-        <w:rPr>
-          <w:rStyle w:val="NormalTok"/>
-        </w:rPr>
-        <w:t xml:space="preserve">    model</w:t>
+          <w:rStyle w:val="StringTok"/>
+        </w:rPr>
+        <w:t xml:space="preserve">'image_url'</w:t>
+      </w:r>
+      <w:r>
+        <w:rPr>
+          <w:rStyle w:val="OperatorTok"/>
+        </w:rPr>
+        <w:t xml:space="preserve">,</w:t>
+      </w:r>
+      <w:r>
+        <w:rPr>
+          <w:rStyle w:val="NormalTok"/>
+        </w:rPr>
+        <w:t xml:space="preserve"> image_url</w:t>
       </w:r>
       <w:r>
         <w:rPr>
@@ -9306,28 +9499,7 @@
         <w:rPr>
           <w:rStyle w:val="NormalTok"/>
         </w:rPr>
-        <w:t xml:space="preserve"> </w:t>
-      </w:r>
-      <w:r>
-        <w:rPr>
-          <w:rStyle w:val="StringTok"/>
-        </w:rPr>
-        <w:t xml:space="preserve">'gemma4:12b'</w:t>
-      </w:r>
-      <w:r>
-        <w:rPr>
-          <w:rStyle w:val="OperatorTok"/>
-        </w:rPr>
-        <w:t xml:space="preserve">,</w:t>
-      </w:r>
-      <w:r>
-        <w:br/>
-      </w:r>
-      <w:r>
-        <w:rPr>
-          <w:rStyle w:val="NormalTok"/>
-        </w:rPr>
-        <w:t xml:space="preserve">    messages</w:t>
+        <w:t xml:space="preserve"> { url</w:t>
       </w:r>
       <w:r>
         <w:rPr>
@@ -9339,192 +9511,6 @@
         <w:rPr>
           <w:rStyle w:val="NormalTok"/>
         </w:rPr>
-        <w:t xml:space="preserve"> [{</w:t>
-      </w:r>
-      <w:r>
-        <w:br/>
-      </w:r>
-      <w:r>
-        <w:rPr>
-          <w:rStyle w:val="NormalTok"/>
-        </w:rPr>
-        <w:t xml:space="preserve">      role</w:t>
-      </w:r>
-      <w:r>
-        <w:rPr>
-          <w:rStyle w:val="OperatorTok"/>
-        </w:rPr>
-        <w:t xml:space="preserve">:</w:t>
-      </w:r>
-      <w:r>
-        <w:rPr>
-          <w:rStyle w:val="NormalTok"/>
-        </w:rPr>
-        <w:t xml:space="preserve"> </w:t>
-      </w:r>
-      <w:r>
-        <w:rPr>
-          <w:rStyle w:val="StringTok"/>
-        </w:rPr>
-        <w:t xml:space="preserve">'user'</w:t>
-      </w:r>
-      <w:r>
-        <w:rPr>
-          <w:rStyle w:val="OperatorTok"/>
-        </w:rPr>
-        <w:t xml:space="preserve">,</w:t>
-      </w:r>
-      <w:r>
-        <w:br/>
-      </w:r>
-      <w:r>
-        <w:rPr>
-          <w:rStyle w:val="NormalTok"/>
-        </w:rPr>
-        <w:t xml:space="preserve">      content</w:t>
-      </w:r>
-      <w:r>
-        <w:rPr>
-          <w:rStyle w:val="OperatorTok"/>
-        </w:rPr>
-        <w:t xml:space="preserve">:</w:t>
-      </w:r>
-      <w:r>
-        <w:rPr>
-          <w:rStyle w:val="NormalTok"/>
-        </w:rPr>
-        <w:t xml:space="preserve"> [</w:t>
-      </w:r>
-      <w:r>
-        <w:br/>
-      </w:r>
-      <w:r>
-        <w:rPr>
-          <w:rStyle w:val="NormalTok"/>
-        </w:rPr>
-        <w:t xml:space="preserve">        { type</w:t>
-      </w:r>
-      <w:r>
-        <w:rPr>
-          <w:rStyle w:val="OperatorTok"/>
-        </w:rPr>
-        <w:t xml:space="preserve">:</w:t>
-      </w:r>
-      <w:r>
-        <w:rPr>
-          <w:rStyle w:val="NormalTok"/>
-        </w:rPr>
-        <w:t xml:space="preserve"> </w:t>
-      </w:r>
-      <w:r>
-        <w:rPr>
-          <w:rStyle w:val="StringTok"/>
-        </w:rPr>
-        <w:t xml:space="preserve">'text'</w:t>
-      </w:r>
-      <w:r>
-        <w:rPr>
-          <w:rStyle w:val="OperatorTok"/>
-        </w:rPr>
-        <w:t xml:space="preserve">,</w:t>
-      </w:r>
-      <w:r>
-        <w:rPr>
-          <w:rStyle w:val="NormalTok"/>
-        </w:rPr>
-        <w:t xml:space="preserve"> text</w:t>
-      </w:r>
-      <w:r>
-        <w:rPr>
-          <w:rStyle w:val="OperatorTok"/>
-        </w:rPr>
-        <w:t xml:space="preserve">:</w:t>
-      </w:r>
-      <w:r>
-        <w:rPr>
-          <w:rStyle w:val="NormalTok"/>
-        </w:rPr>
-        <w:t xml:space="preserve"> </w:t>
-      </w:r>
-      <w:r>
-        <w:rPr>
-          <w:rStyle w:val="StringTok"/>
-        </w:rPr>
-        <w:t xml:space="preserve">'Analyze this Hebrew PDF form...'</w:t>
-      </w:r>
-      <w:r>
-        <w:rPr>
-          <w:rStyle w:val="NormalTok"/>
-        </w:rPr>
-        <w:t xml:space="preserve"> }</w:t>
-      </w:r>
-      <w:r>
-        <w:rPr>
-          <w:rStyle w:val="OperatorTok"/>
-        </w:rPr>
-        <w:t xml:space="preserve">,</w:t>
-      </w:r>
-      <w:r>
-        <w:br/>
-      </w:r>
-      <w:r>
-        <w:rPr>
-          <w:rStyle w:val="NormalTok"/>
-        </w:rPr>
-        <w:t xml:space="preserve">        { type</w:t>
-      </w:r>
-      <w:r>
-        <w:rPr>
-          <w:rStyle w:val="OperatorTok"/>
-        </w:rPr>
-        <w:t xml:space="preserve">:</w:t>
-      </w:r>
-      <w:r>
-        <w:rPr>
-          <w:rStyle w:val="NormalTok"/>
-        </w:rPr>
-        <w:t xml:space="preserve"> </w:t>
-      </w:r>
-      <w:r>
-        <w:rPr>
-          <w:rStyle w:val="StringTok"/>
-        </w:rPr>
-        <w:t xml:space="preserve">'image_url'</w:t>
-      </w:r>
-      <w:r>
-        <w:rPr>
-          <w:rStyle w:val="OperatorTok"/>
-        </w:rPr>
-        <w:t xml:space="preserve">,</w:t>
-      </w:r>
-      <w:r>
-        <w:rPr>
-          <w:rStyle w:val="NormalTok"/>
-        </w:rPr>
-        <w:t xml:space="preserve"> image_url</w:t>
-      </w:r>
-      <w:r>
-        <w:rPr>
-          <w:rStyle w:val="OperatorTok"/>
-        </w:rPr>
-        <w:t xml:space="preserve">:</w:t>
-      </w:r>
-      <w:r>
-        <w:rPr>
-          <w:rStyle w:val="NormalTok"/>
-        </w:rPr>
-        <w:t xml:space="preserve"> { url</w:t>
-      </w:r>
-      <w:r>
-        <w:rPr>
-          <w:rStyle w:val="OperatorTok"/>
-        </w:rPr>
-        <w:t xml:space="preserve">:</w:t>
-      </w:r>
-      <w:r>
-        <w:rPr>
-          <w:rStyle w:val="NormalTok"/>
-        </w:rPr>
         <w:t xml:space="preserve"> </w:t>
       </w:r>
       <w:r>
@@ -9582,72 +9568,6 @@
         <w:t xml:space="preserve">    }]</w:t>
       </w:r>
       <w:r>
-        <w:rPr>
-          <w:rStyle w:val="OperatorTok"/>
-        </w:rPr>
-        <w:t xml:space="preserve">,</w:t>
-      </w:r>
-      <w:r>
-        <w:br/>
-      </w:r>
-      <w:r>
-        <w:rPr>
-          <w:rStyle w:val="NormalTok"/>
-        </w:rPr>
-        <w:t xml:space="preserve">    temperature</w:t>
-      </w:r>
-      <w:r>
-        <w:rPr>
-          <w:rStyle w:val="OperatorTok"/>
-        </w:rPr>
-        <w:t xml:space="preserve">:</w:t>
-      </w:r>
-      <w:r>
-        <w:rPr>
-          <w:rStyle w:val="NormalTok"/>
-        </w:rPr>
-        <w:t xml:space="preserve"> </w:t>
-      </w:r>
-      <w:r>
-        <w:rPr>
-          <w:rStyle w:val="FloatTok"/>
-        </w:rPr>
-        <w:t xml:space="preserve">1.0</w:t>
-      </w:r>
-      <w:r>
-        <w:rPr>
-          <w:rStyle w:val="OperatorTok"/>
-        </w:rPr>
-        <w:t xml:space="preserve">,</w:t>
-      </w:r>
-      <w:r>
-        <w:br/>
-      </w:r>
-      <w:r>
-        <w:rPr>
-          <w:rStyle w:val="NormalTok"/>
-        </w:rPr>
-        <w:t xml:space="preserve">    top_p</w:t>
-      </w:r>
-      <w:r>
-        <w:rPr>
-          <w:rStyle w:val="OperatorTok"/>
-        </w:rPr>
-        <w:t xml:space="preserve">:</w:t>
-      </w:r>
-      <w:r>
-        <w:rPr>
-          <w:rStyle w:val="NormalTok"/>
-        </w:rPr>
-        <w:t xml:space="preserve"> </w:t>
-      </w:r>
-      <w:r>
-        <w:rPr>
-          <w:rStyle w:val="FloatTok"/>
-        </w:rPr>
-        <w:t xml:space="preserve">0.95</w:t>
-      </w:r>
-      <w:r>
         <w:br/>
       </w:r>
       <w:r>
@@ -9670,260 +9590,6 @@
           <w:rStyle w:val="OperatorTok"/>
         </w:rPr>
         <w:t xml:space="preserve">;</w:t>
-      </w:r>
-    </w:p>
-    <w:bookmarkEnd w:id="44"/>
-    <w:bookmarkStart w:id="45" w:name="gpu-passthrough-in-proxmox"/>
-    <w:p>
-      <w:pPr>
-        <w:pStyle w:val="Heading4"/>
-      </w:pPr>
-      <w:r>
-        <w:t xml:space="preserve">GPU Passthrough in Proxmox</w:t>
-      </w:r>
-    </w:p>
-    <w:p>
-      <w:pPr>
-        <w:pStyle w:val="FirstParagraph"/>
-      </w:pPr>
-      <w:r>
-        <w:t xml:space="preserve">If your Proxmox host has a dedicated GPU (e.g., RTX 3060/3090/4090):</w:t>
-      </w:r>
-    </w:p>
-    <w:p>
-      <w:pPr>
-        <w:pStyle w:val="SourceCode"/>
-      </w:pPr>
-      <w:r>
-        <w:rPr>
-          <w:rStyle w:val="CommentTok"/>
-        </w:rPr>
-        <w:t xml:space="preserve"># 1. Enable IOMMU in BIOS and grub:</w:t>
-      </w:r>
-      <w:r>
-        <w:br/>
-      </w:r>
-      <w:r>
-        <w:rPr>
-          <w:rStyle w:val="CommentTok"/>
-        </w:rPr>
-        <w:t xml:space="preserve">#    GRUB_CMDLINE_LINUX_DEFAULT="quiet intel_iommu=on iommu=pt"</w:t>
-      </w:r>
-      <w:r>
-        <w:br/>
-      </w:r>
-      <w:r>
-        <w:rPr>
-          <w:rStyle w:val="CommentTok"/>
-        </w:rPr>
-        <w:t xml:space="preserve">#    (or amd_iommu=on for AMD)</w:t>
-      </w:r>
-      <w:r>
-        <w:br/>
-      </w:r>
-      <w:r>
-        <w:br/>
-      </w:r>
-      <w:r>
-        <w:rPr>
-          <w:rStyle w:val="CommentTok"/>
-        </w:rPr>
-        <w:t xml:space="preserve"># 2. Blacklist host GPU drivers:</w:t>
-      </w:r>
-      <w:r>
-        <w:br/>
-      </w:r>
-      <w:r>
-        <w:rPr>
-          <w:rStyle w:val="BuiltInTok"/>
-        </w:rPr>
-        <w:t xml:space="preserve">echo</w:t>
-      </w:r>
-      <w:r>
-        <w:rPr>
-          <w:rStyle w:val="NormalTok"/>
-        </w:rPr>
-        <w:t xml:space="preserve"> </w:t>
-      </w:r>
-      <w:r>
-        <w:rPr>
-          <w:rStyle w:val="StringTok"/>
-        </w:rPr>
-        <w:t xml:space="preserve">"blacklist nouveau"</w:t>
-      </w:r>
-      <w:r>
-        <w:rPr>
-          <w:rStyle w:val="NormalTok"/>
-        </w:rPr>
-        <w:t xml:space="preserve"> </w:t>
-      </w:r>
-      <w:r>
-        <w:rPr>
-          <w:rStyle w:val="OperatorTok"/>
-        </w:rPr>
-        <w:t xml:space="preserve">&gt;&gt;</w:t>
-      </w:r>
-      <w:r>
-        <w:rPr>
-          <w:rStyle w:val="NormalTok"/>
-        </w:rPr>
-        <w:t xml:space="preserve"> /etc/modprobe.d/blacklist.conf</w:t>
-      </w:r>
-      <w:r>
-        <w:br/>
-      </w:r>
-      <w:r>
-        <w:rPr>
-          <w:rStyle w:val="BuiltInTok"/>
-        </w:rPr>
-        <w:t xml:space="preserve">echo</w:t>
-      </w:r>
-      <w:r>
-        <w:rPr>
-          <w:rStyle w:val="NormalTok"/>
-        </w:rPr>
-        <w:t xml:space="preserve"> </w:t>
-      </w:r>
-      <w:r>
-        <w:rPr>
-          <w:rStyle w:val="StringTok"/>
-        </w:rPr>
-        <w:t xml:space="preserve">"blacklist nvidia"</w:t>
-      </w:r>
-      <w:r>
-        <w:rPr>
-          <w:rStyle w:val="NormalTok"/>
-        </w:rPr>
-        <w:t xml:space="preserve"> </w:t>
-      </w:r>
-      <w:r>
-        <w:rPr>
-          <w:rStyle w:val="OperatorTok"/>
-        </w:rPr>
-        <w:t xml:space="preserve">&gt;&gt;</w:t>
-      </w:r>
-      <w:r>
-        <w:rPr>
-          <w:rStyle w:val="NormalTok"/>
-        </w:rPr>
-        <w:t xml:space="preserve"> /etc/modprobe.d/blacklist.conf</w:t>
-      </w:r>
-      <w:r>
-        <w:br/>
-      </w:r>
-      <w:r>
-        <w:rPr>
-          <w:rStyle w:val="ExtensionTok"/>
-        </w:rPr>
-        <w:t xml:space="preserve">update-initramfs</w:t>
-      </w:r>
-      <w:r>
-        <w:rPr>
-          <w:rStyle w:val="NormalTok"/>
-        </w:rPr>
-        <w:t xml:space="preserve"> </w:t>
-      </w:r>
-      <w:r>
-        <w:rPr>
-          <w:rStyle w:val="AttributeTok"/>
-        </w:rPr>
-        <w:t xml:space="preserve">-u</w:t>
-      </w:r>
-      <w:r>
-        <w:br/>
-      </w:r>
-      <w:r>
-        <w:br/>
-      </w:r>
-      <w:r>
-        <w:rPr>
-          <w:rStyle w:val="CommentTok"/>
-        </w:rPr>
-        <w:t xml:space="preserve"># 3. Add PCI device to VM in Proxmox UI:</w:t>
-      </w:r>
-      <w:r>
-        <w:br/>
-      </w:r>
-      <w:r>
-        <w:rPr>
-          <w:rStyle w:val="CommentTok"/>
-        </w:rPr>
-        <w:t xml:space="preserve">#    VM → Hardware → Add → PCI Device → select your GPU</w:t>
-      </w:r>
-      <w:r>
-        <w:br/>
-      </w:r>
-      <w:r>
-        <w:rPr>
-          <w:rStyle w:val="CommentTok"/>
-        </w:rPr>
-        <w:t xml:space="preserve">#    Check: All Functions, ROM-Bar, PCI-Express</w:t>
-      </w:r>
-      <w:r>
-        <w:br/>
-      </w:r>
-      <w:r>
-        <w:br/>
-      </w:r>
-      <w:r>
-        <w:rPr>
-          <w:rStyle w:val="CommentTok"/>
-        </w:rPr>
-        <w:t xml:space="preserve"># 4. Inside the VM, install NVIDIA drivers:</w:t>
-      </w:r>
-      <w:r>
-        <w:br/>
-      </w:r>
-      <w:r>
-        <w:rPr>
-          <w:rStyle w:val="ExtensionTok"/>
-        </w:rPr>
-        <w:t xml:space="preserve">apt</w:t>
-      </w:r>
-      <w:r>
-        <w:rPr>
-          <w:rStyle w:val="NormalTok"/>
-        </w:rPr>
-        <w:t xml:space="preserve"> install </w:t>
-      </w:r>
-      <w:r>
-        <w:rPr>
-          <w:rStyle w:val="AttributeTok"/>
-        </w:rPr>
-        <w:t xml:space="preserve">-y</w:t>
-      </w:r>
-      <w:r>
-        <w:rPr>
-          <w:rStyle w:val="NormalTok"/>
-        </w:rPr>
-        <w:t xml:space="preserve"> nvidia-driver-560  </w:t>
-      </w:r>
-      <w:r>
-        <w:rPr>
-          <w:rStyle w:val="CommentTok"/>
-        </w:rPr>
-        <w:t xml:space="preserve"># or latest</w:t>
-      </w:r>
-      <w:r>
-        <w:br/>
-      </w:r>
-      <w:r>
-        <w:rPr>
-          <w:rStyle w:val="ExtensionTok"/>
-        </w:rPr>
-        <w:t xml:space="preserve">nvidia-smi</w:t>
-      </w:r>
-      <w:r>
-        <w:rPr>
-          <w:rStyle w:val="NormalTok"/>
-        </w:rPr>
-        <w:t xml:space="preserve">  </w:t>
-      </w:r>
-      <w:r>
-        <w:rPr>
-          <w:rStyle w:val="CommentTok"/>
-        </w:rPr>
-        <w:t xml:space="preserve"># verify GPU is visible</w:t>
       </w:r>
     </w:p>
     <w:bookmarkEnd w:id="45"/>
@@ -10073,7 +9739,7 @@
               <w:jc w:val="left"/>
             </w:pPr>
             <w:r>
-              <w:t xml:space="preserve">Model updates require manual pull</w:t>
+              <w:t xml:space="preserve">Model updates require manual action</w:t>
             </w:r>
           </w:p>
         </w:tc>
@@ -10097,7 +9763,7 @@
               <w:jc w:val="left"/>
             </w:pPr>
             <w:r>
-              <w:t xml:space="preserve">Cron job:</w:t>
+              <w:t xml:space="preserve">Update model weights periodically; vLLM supports hot-reload with</w:t>
             </w:r>
             <w:r>
               <w:t xml:space="preserve"> </w:t>
@@ -10106,13 +9772,7 @@
               <w:rPr>
                 <w:rStyle w:val="VerbatimChar"/>
               </w:rPr>
-              <w:t xml:space="preserve">ollama pull gemma4:12b</w:t>
-            </w:r>
-            <w:r>
-              <w:t xml:space="preserve"> </w:t>
-            </w:r>
-            <w:r>
-              <w:t xml:space="preserve">weekly</w:t>
+              <w:t xml:space="preserve">--served-model-name</w:t>
             </w:r>
           </w:p>
         </w:tc>
@@ -10126,7 +9786,7 @@
               <w:jc w:val="left"/>
             </w:pPr>
             <w:r>
-              <w:t xml:space="preserve">GPU hardware failure</w:t>
+              <w:t xml:space="preserve">LLM machine down (maintenance, power)</w:t>
             </w:r>
           </w:p>
         </w:tc>
@@ -10150,7 +9810,7 @@
               <w:jc w:val="left"/>
             </w:pPr>
             <w:r>
-              <w:t xml:space="preserve">Configure Worker to fall back to ChatLLM API if self-hosted is down</w:t>
+              <w:t xml:space="preserve">Worker auto-falls back to ChatLLM/Grok; LLM machine has its own UPS</w:t>
             </w:r>
           </w:p>
         </w:tc>
@@ -10188,7 +9848,7 @@
               <w:jc w:val="left"/>
             </w:pPr>
             <w:r>
-              <w:t xml:space="preserve">GPU idle power is ~15-30W; minimal for intermittent use</w:t>
+              <w:t xml:space="preserve">GPU idle power is ~15-30W; machine is already running for other tasks</w:t>
             </w:r>
           </w:p>
         </w:tc>
@@ -10688,6 +10348,114 @@
         <w:rPr>
           <w:rStyle w:val="NormalTok"/>
         </w:rPr>
+        <w:t xml:space="preserve"> env</w:t>
+      </w:r>
+      <w:r>
+        <w:rPr>
+          <w:rStyle w:val="OperatorTok"/>
+        </w:rPr>
+        <w:t xml:space="preserve">.</w:t>
+      </w:r>
+      <w:r>
+        <w:rPr>
+          <w:rStyle w:val="AttributeTok"/>
+        </w:rPr>
+        <w:t xml:space="preserve">VLLM_API_KEY</w:t>
+      </w:r>
+      <w:r>
+        <w:rPr>
+          <w:rStyle w:val="NormalTok"/>
+        </w:rPr>
+        <w:t xml:space="preserve"> </w:t>
+      </w:r>
+      <w:r>
+        <w:rPr>
+          <w:rStyle w:val="OperatorTok"/>
+        </w:rPr>
+        <w:t xml:space="preserve">?</w:t>
+      </w:r>
+      <w:r>
+        <w:rPr>
+          <w:rStyle w:val="NormalTok"/>
+        </w:rPr>
+        <w:t xml:space="preserve"> { </w:t>
+      </w:r>
+      <w:r>
+        <w:rPr>
+          <w:rStyle w:val="StringTok"/>
+        </w:rPr>
+        <w:t xml:space="preserve">'Authorization'</w:t>
+      </w:r>
+      <w:r>
+        <w:rPr>
+          <w:rStyle w:val="OperatorTok"/>
+        </w:rPr>
+        <w:t xml:space="preserve">:</w:t>
+      </w:r>
+      <w:r>
+        <w:rPr>
+          <w:rStyle w:val="NormalTok"/>
+        </w:rPr>
+        <w:t xml:space="preserve"> </w:t>
+      </w:r>
+      <w:r>
+        <w:rPr>
+          <w:rStyle w:val="VerbatimStringTok"/>
+        </w:rPr>
+        <w:t xml:space="preserve">`Bearer </w:t>
+      </w:r>
+      <w:r>
+        <w:rPr>
+          <w:rStyle w:val="SpecialCharTok"/>
+        </w:rPr>
+        <w:t xml:space="preserve">${</w:t>
+      </w:r>
+      <w:r>
+        <w:rPr>
+          <w:rStyle w:val="NormalTok"/>
+        </w:rPr>
+        <w:t xml:space="preserve">env</w:t>
+      </w:r>
+      <w:r>
+        <w:rPr>
+          <w:rStyle w:val="OperatorTok"/>
+        </w:rPr>
+        <w:t xml:space="preserve">.</w:t>
+      </w:r>
+      <w:r>
+        <w:rPr>
+          <w:rStyle w:val="AttributeTok"/>
+        </w:rPr>
+        <w:t xml:space="preserve">VLLM_API_KEY</w:t>
+      </w:r>
+      <w:r>
+        <w:rPr>
+          <w:rStyle w:val="SpecialCharTok"/>
+        </w:rPr>
+        <w:t xml:space="preserve">}</w:t>
+      </w:r>
+      <w:r>
+        <w:rPr>
+          <w:rStyle w:val="VerbatimStringTok"/>
+        </w:rPr>
+        <w:t xml:space="preserve">`</w:t>
+      </w:r>
+      <w:r>
+        <w:rPr>
+          <w:rStyle w:val="NormalTok"/>
+        </w:rPr>
+        <w:t xml:space="preserve"> } </w:t>
+      </w:r>
+      <w:r>
+        <w:rPr>
+          <w:rStyle w:val="OperatorTok"/>
+        </w:rPr>
+        <w:t xml:space="preserve">:</w:t>
+      </w:r>
+      <w:r>
+        <w:rPr>
+          <w:rStyle w:val="NormalTok"/>
+        </w:rPr>
         <w:t xml:space="preserve"> {}</w:t>
       </w:r>
       <w:r>
@@ -10697,18 +10465,6 @@
         <w:t xml:space="preserve">,</w:t>
       </w:r>
       <w:r>
-        <w:rPr>
-          <w:rStyle w:val="NormalTok"/>
-        </w:rPr>
-        <w:t xml:space="preserve">             </w:t>
-      </w:r>
-      <w:r>
-        <w:rPr>
-          <w:rStyle w:val="CommentTok"/>
-        </w:rPr>
-        <w:t xml:space="preserve">// no auth if behind CF Tunnel + Access</w:t>
-      </w:r>
-      <w:r>
         <w:br/>
       </w:r>
       <w:r>
@@ -10763,7 +10519,7 @@
         <w:rPr>
           <w:rStyle w:val="StringTok"/>
         </w:rPr>
-        <w:t xml:space="preserve">'gemma4:12b'</w:t>
+        <w:t xml:space="preserve">'google/gemma-4-12b-it'</w:t>
       </w:r>
       <w:r>
         <w:br/>
@@ -13356,13 +13112,21 @@
         <w:t xml:space="preserve">at home.</w:t>
       </w:r>
     </w:p>
-    <w:bookmarkStart w:id="50" w:name="vm-lxc-requirements"/>
+    <w:bookmarkStart w:id="50" w:name="lxc-container-requirements"/>
     <w:p>
       <w:pPr>
         <w:pStyle w:val="Heading4"/>
       </w:pPr>
       <w:r>
-        <w:t xml:space="preserve">VM / LXC Requirements</w:t>
+        <w:t xml:space="preserve">LXC Container Requirements</w:t>
+      </w:r>
+    </w:p>
+    <w:p>
+      <w:pPr>
+        <w:pStyle w:val="FirstParagraph"/>
+      </w:pPr>
+      <w:r>
+        <w:t xml:space="preserve">PDF filler, dashboard, and cloudflared share a single LXC (LLM stays on your dedicated machine):</w:t>
       </w:r>
     </w:p>
     <w:tbl>
@@ -13372,9 +13136,9 @@
         <w:tblLook w:firstRow="1" w:lastRow="0" w:firstColumn="0" w:lastColumn="0" w:noHBand="0" w:noVBand="0" w:val="0020"/>
       </w:tblPr>
       <w:tblGrid>
-        <w:gridCol w:w="2941"/>
-        <w:gridCol w:w="2036"/>
-        <w:gridCol w:w="2941"/>
+        <w:gridCol w:w="1492"/>
+        <w:gridCol w:w="2984"/>
+        <w:gridCol w:w="3443"/>
       </w:tblGrid>
       <w:tr>
         <w:trPr>
@@ -13400,19 +13164,19 @@
               <w:jc w:val="left"/>
             </w:pPr>
             <w:r>
-              <w:t xml:space="preserve">Minimum</w:t>
-            </w:r>
-          </w:p>
-        </w:tc>
-        <w:tc>
-          <w:tcPr/>
-          <w:p>
-            <w:pPr>
-              <w:pStyle w:val="Compact"/>
-              <w:jc w:val="left"/>
-            </w:pPr>
-            <w:r>
-              <w:t xml:space="preserve">Recommended</w:t>
+              <w:t xml:space="preserve">Single service (PDF only)</w:t>
+            </w:r>
+          </w:p>
+        </w:tc>
+        <w:tc>
+          <w:tcPr/>
+          <w:p>
+            <w:pPr>
+              <w:pStyle w:val="Compact"/>
+              <w:jc w:val="left"/>
+            </w:pPr>
+            <w:r>
+              <w:t xml:space="preserve">All-in-one LXC (recommended)</w:t>
             </w:r>
           </w:p>
         </w:tc>
@@ -13442,19 +13206,19 @@
               <w:jc w:val="left"/>
             </w:pPr>
             <w:r>
-              <w:t xml:space="preserve">Debian 12 / Ubuntu 22.04 (LXC or VM)</w:t>
-            </w:r>
-          </w:p>
-        </w:tc>
-        <w:tc>
-          <w:tcPr/>
-          <w:p>
-            <w:pPr>
-              <w:pStyle w:val="Compact"/>
-              <w:jc w:val="left"/>
-            </w:pPr>
-            <w:r>
-              <w:t xml:space="preserve">Ubuntu 24.04 LXC (lowest overhead)</w:t>
+              <w:t xml:space="preserve">Debian 12 / Ubuntu 22.04</w:t>
+            </w:r>
+          </w:p>
+        </w:tc>
+        <w:tc>
+          <w:tcPr/>
+          <w:p>
+            <w:pPr>
+              <w:pStyle w:val="Compact"/>
+              <w:jc w:val="left"/>
+            </w:pPr>
+            <w:r>
+              <w:t xml:space="preserve">Ubuntu 24.04</w:t>
             </w:r>
           </w:p>
         </w:tc>
@@ -13496,7 +13260,7 @@
               <w:jc w:val="left"/>
             </w:pPr>
             <w:r>
-              <w:t xml:space="preserve">2 vCPU (PDF rendering benefits from extra core)</w:t>
+              <w:t xml:space="preserve">2–4 vCPU</w:t>
             </w:r>
           </w:p>
         </w:tc>
@@ -13538,7 +13302,7 @@
               <w:jc w:val="left"/>
             </w:pPr>
             <w:r>
-              <w:t xml:space="preserve">1 GB (ReportLab + Pillow peak during render)</w:t>
+              <w:t xml:space="preserve">2 GB (Node.js + Python)</w:t>
             </w:r>
           </w:p>
         </w:tc>
@@ -13580,7 +13344,7 @@
               <w:jc w:val="left"/>
             </w:pPr>
             <w:r>
-              <w:t xml:space="preserve">5 GB (OS + Python + deps + fonts + signatures + logs)</w:t>
+              <w:t xml:space="preserve">10 GB (OS + Node + Python + assets)</w:t>
             </w:r>
           </w:p>
         </w:tc>
@@ -13610,19 +13374,19 @@
               <w:jc w:val="left"/>
             </w:pPr>
             <w:r>
-              <w:t xml:space="preserve">Fixed IP, port forwarded (443 → VM)</w:t>
-            </w:r>
-          </w:p>
-        </w:tc>
-        <w:tc>
-          <w:tcPr/>
-          <w:p>
-            <w:pPr>
-              <w:pStyle w:val="Compact"/>
-              <w:jc w:val="left"/>
-            </w:pPr>
-            <w:r>
               <w:t xml:space="preserve">Cloudflare Tunnel (zero port forwarding)</w:t>
+            </w:r>
+          </w:p>
+        </w:tc>
+        <w:tc>
+          <w:tcPr/>
+          <w:p>
+            <w:pPr>
+              <w:pStyle w:val="Compact"/>
+              <w:jc w:val="left"/>
+            </w:pPr>
+            <w:r>
+              <w:t xml:space="preserve">Same</w:t>
             </w:r>
           </w:p>
         </w:tc>
@@ -13669,7 +13433,79 @@
           </w:p>
         </w:tc>
       </w:tr>
+      <w:tr>
+        <w:tc>
+          <w:tcPr/>
+          <w:p>
+            <w:pPr>
+              <w:pStyle w:val="Compact"/>
+              <w:jc w:val="left"/>
+            </w:pPr>
+            <w:r>
+              <w:rPr>
+                <w:bCs/>
+                <w:b/>
+              </w:rPr>
+              <w:t xml:space="preserve">Node.js</w:t>
+            </w:r>
+          </w:p>
+        </w:tc>
+        <w:tc>
+          <w:tcPr/>
+          <w:p>
+            <w:pPr>
+              <w:pStyle w:val="Compact"/>
+              <w:jc w:val="left"/>
+            </w:pPr>
+            <w:r>
+              <w:t xml:space="preserve">—</w:t>
+            </w:r>
+          </w:p>
+        </w:tc>
+        <w:tc>
+          <w:tcPr/>
+          <w:p>
+            <w:pPr>
+              <w:pStyle w:val="Compact"/>
+              <w:jc w:val="left"/>
+            </w:pPr>
+            <w:r>
+              <w:t xml:space="preserve">20 LTS (for dashboard)</w:t>
+            </w:r>
+          </w:p>
+        </w:tc>
+      </w:tr>
     </w:tbl>
+    <w:p>
+      <w:pPr>
+        <w:pStyle w:val="BlockText"/>
+      </w:pPr>
+      <w:r>
+        <w:rPr>
+          <w:bCs/>
+          <w:b/>
+        </w:rPr>
+        <w:t xml:space="preserve">LXC creation in Proxmox</w:t>
+      </w:r>
+      <w:r>
+        <w:t xml:space="preserve">: Datacenter → Create CT → Template: Ubuntu 24.04 → CPU: 2, RAM: 2048MB, Disk: 10GB → Network: DHCP or static on your LAN. Enable</w:t>
+      </w:r>
+      <w:r>
+        <w:t xml:space="preserve"> </w:t>
+      </w:r>
+      <w:r>
+        <w:rPr>
+          <w:rStyle w:val="VerbatimChar"/>
+        </w:rPr>
+        <w:t xml:space="preserve">nesting=1</w:t>
+      </w:r>
+      <w:r>
+        <w:t xml:space="preserve"> </w:t>
+      </w:r>
+      <w:r>
+        <w:t xml:space="preserve">in Options (needed for systemd services inside LXC).</w:t>
+      </w:r>
+    </w:p>
     <w:bookmarkEnd w:id="50"/>
     <w:bookmarkStart w:id="51" w:name="setup-steps-1"/>
     <w:p>
@@ -17017,7 +16853,19 @@
         <w:rPr>
           <w:rStyle w:val="StringTok"/>
         </w:rPr>
-        <w:t xml:space="preserve">"gemma4:12b"</w:t>
+        <w:t xml:space="preserve">"google/gemma-4-12b-it"</w:t>
+      </w:r>
+      <w:r>
+        <w:rPr>
+          <w:rStyle w:val="NormalTok"/>
+        </w:rPr>
+        <w:t xml:space="preserve">      </w:t>
+      </w:r>
+      <w:r>
+        <w:rPr>
+          <w:rStyle w:val="CommentTok"/>
+        </w:rPr>
+        <w:t xml:space="preserve"># or your vLLM model name</w:t>
       </w:r>
       <w:r>
         <w:br/>

</xml_diff>

<commit_message>
Add Option D: Google AI Studio free tier as LLM alternative
</commit_message>
<xml_diff>
--- a/CLOUDFLARE_MIGRATION_PLAN.docx
+++ b/CLOUDFLARE_MIGRATION_PLAN.docx
@@ -2,7 +2,7 @@
 <file path=word/document.xml><?xml version="1.0" encoding="utf-8"?>
 <w:document xmlns:w="http://schemas.openxmlformats.org/wordprocessingml/2006/main" xmlns:m="http://schemas.openxmlformats.org/officeDocument/2006/math" xmlns:r="http://schemas.openxmlformats.org/officeDocument/2006/relationships" xmlns:o="urn:schemas-microsoft-com:office:office" xmlns:v="urn:schemas-microsoft-com:vml" xmlns:w10="urn:schemas-microsoft-com:office:word" xmlns:a="http://schemas.openxmlformats.org/drawingml/2006/main" xmlns:pic="http://schemas.openxmlformats.org/drawingml/2006/picture" xmlns:wp="http://schemas.openxmlformats.org/drawingml/2006/wordprocessingDrawing">
   <w:body>
-    <w:bookmarkStart w:id="91" w:name="X2e167b15ab592e5e273ee85010a78787905df94"/>
+    <w:bookmarkStart w:id="99" w:name="X2e167b15ab592e5e273ee85010a78787905df94"/>
     <w:p>
       <w:pPr>
         <w:pStyle w:val="Heading1"/>
@@ -5324,7 +5324,7 @@
     </w:p>
     <w:bookmarkEnd w:id="35"/>
     <w:bookmarkEnd w:id="36"/>
-    <w:bookmarkStart w:id="49" w:name="llm-api-options"/>
+    <w:bookmarkStart w:id="57" w:name="llm-api-options"/>
     <w:p>
       <w:pPr>
         <w:pStyle w:val="Heading2"/>
@@ -7143,13 +7143,13 @@
       </w:r>
     </w:p>
     <w:bookmarkEnd w:id="40"/>
-    <w:bookmarkStart w:id="48" w:name="X323ab623c5b3da3648de06e2bd309decbdc327a"/>
+    <w:bookmarkStart w:id="48" w:name="X9bc2eb74a1846def284736ee2f35472f795c42e"/>
     <w:p>
       <w:pPr>
         <w:pStyle w:val="Heading3"/>
       </w:pPr>
       <w:r>
-        <w:t xml:space="preserve">Option C: Self-Hosted LLM via vLLM (your dedicated LLM machine)</w:t>
+        <w:t xml:space="preserve">Option D: Google AI Studio Free Tier (zero-cost hosted)</w:t>
       </w:r>
     </w:p>
     <w:p>
@@ -7157,16 +7157,1539 @@
         <w:pStyle w:val="FirstParagraph"/>
       </w:pPr>
       <w:r>
-        <w:t xml:space="preserve">You already have a dedicated machine running</w:t>
-      </w:r>
-      <w:r>
-        <w:t xml:space="preserve"> </w:t>
-      </w:r>
-      <w:r>
         <w:rPr>
           <w:bCs/>
           <w:b/>
         </w:rPr>
+        <w:t xml:space="preserve">Endpoint</w:t>
+      </w:r>
+      <w:r>
+        <w:t xml:space="preserve">:</w:t>
+      </w:r>
+      <w:r>
+        <w:t xml:space="preserve"> </w:t>
+      </w:r>
+      <w:r>
+        <w:rPr>
+          <w:rStyle w:val="VerbatimChar"/>
+        </w:rPr>
+        <w:t xml:space="preserve">https://generativelanguage.googleapis.com/v1beta/openai/</w:t>
+      </w:r>
+      <w:r>
+        <w:t xml:space="preserve"> </w:t>
+      </w:r>
+      <w:r>
+        <w:t xml:space="preserve">(OpenAI-compatible)</w:t>
+      </w:r>
+      <w:r>
+        <w:br/>
+      </w:r>
+      <w:r>
+        <w:rPr>
+          <w:bCs/>
+          <w:b/>
+        </w:rPr>
+        <w:t xml:space="preserve">Key</w:t>
+      </w:r>
+      <w:r>
+        <w:t xml:space="preserve">: Get free from</w:t>
+      </w:r>
+      <w:r>
+        <w:t xml:space="preserve"> </w:t>
+      </w:r>
+      <w:hyperlink r:id="rId41">
+        <w:r>
+          <w:rPr>
+            <w:rStyle w:val="Hyperlink"/>
+          </w:rPr>
+          <w:t xml:space="preserve">aistudio.google.com</w:t>
+        </w:r>
+      </w:hyperlink>
+      <w:r>
+        <w:br/>
+      </w:r>
+      <w:r>
+        <w:rPr>
+          <w:bCs/>
+          <w:b/>
+        </w:rPr>
+        <w:t xml:space="preserve">Models</w:t>
+      </w:r>
+      <w:r>
+        <w:t xml:space="preserve">:</w:t>
+      </w:r>
+      <w:r>
+        <w:t xml:space="preserve"> </w:t>
+      </w:r>
+      <w:r>
+        <w:rPr>
+          <w:rStyle w:val="VerbatimChar"/>
+        </w:rPr>
+        <w:t xml:space="preserve">gemini-2.5-flash</w:t>
+      </w:r>
+      <w:r>
+        <w:t xml:space="preserve"> </w:t>
+      </w:r>
+      <w:r>
+        <w:t xml:space="preserve">(recommended),</w:t>
+      </w:r>
+      <w:r>
+        <w:t xml:space="preserve"> </w:t>
+      </w:r>
+      <w:r>
+        <w:rPr>
+          <w:rStyle w:val="VerbatimChar"/>
+        </w:rPr>
+        <w:t xml:space="preserve">gemini-2.5-pro</w:t>
+      </w:r>
+      <w:r>
+        <w:br/>
+      </w:r>
+      <w:r>
+        <w:rPr>
+          <w:bCs/>
+          <w:b/>
+        </w:rPr>
+        <w:t xml:space="preserve">Vision</w:t>
+      </w:r>
+      <w:r>
+        <w:t xml:space="preserve">: ✅ Native multimodal — images, PDFs, same context window as paid</w:t>
+      </w:r>
+      <w:r>
+        <w:br/>
+      </w:r>
+      <w:r>
+        <w:rPr>
+          <w:bCs/>
+          <w:b/>
+        </w:rPr>
+        <w:t xml:space="preserve">Hebrew</w:t>
+      </w:r>
+      <w:r>
+        <w:t xml:space="preserve">: ✅ Excellent (same Gemini models used in paid tier)</w:t>
+      </w:r>
+      <w:r>
+        <w:br/>
+      </w:r>
+      <w:r>
+        <w:rPr>
+          <w:bCs/>
+          <w:b/>
+        </w:rPr>
+        <w:t xml:space="preserve">Cost</w:t>
+      </w:r>
+      <w:r>
+        <w:t xml:space="preserve">:</w:t>
+      </w:r>
+      <w:r>
+        <w:t xml:space="preserve"> </w:t>
+      </w:r>
+      <w:r>
+        <w:rPr>
+          <w:bCs/>
+          <w:b/>
+        </w:rPr>
+        <w:t xml:space="preserve">$0 — no credit card required, no expiry</w:t>
+      </w:r>
+    </w:p>
+    <w:bookmarkStart w:id="42" w:name="free-tier-limits-per-project"/>
+    <w:p>
+      <w:pPr>
+        <w:pStyle w:val="Heading4"/>
+      </w:pPr>
+      <w:r>
+        <w:t xml:space="preserve">Free Tier Limits (per project)</w:t>
+      </w:r>
+    </w:p>
+    <w:tbl>
+      <w:tblPr>
+        <w:tblStyle w:val="Table"/>
+        <w:tblW w:type="pct" w:w="5000"/>
+        <w:tblLook w:firstRow="1" w:lastRow="0" w:firstColumn="0" w:lastColumn="0" w:noHBand="0" w:noVBand="0" w:val="0020"/>
+      </w:tblPr>
+      <w:tblGrid>
+        <w:gridCol w:w="1911"/>
+        <w:gridCol w:w="1365"/>
+        <w:gridCol w:w="1365"/>
+        <w:gridCol w:w="1365"/>
+        <w:gridCol w:w="1911"/>
+      </w:tblGrid>
+      <w:tr>
+        <w:trPr>
+          <w:tblHeader w:val="true"/>
+        </w:trPr>
+        <w:tc>
+          <w:tcPr/>
+          <w:p>
+            <w:pPr>
+              <w:pStyle w:val="Compact"/>
+              <w:jc w:val="left"/>
+            </w:pPr>
+            <w:r>
+              <w:t xml:space="preserve">Model</w:t>
+            </w:r>
+          </w:p>
+        </w:tc>
+        <w:tc>
+          <w:tcPr/>
+          <w:p>
+            <w:pPr>
+              <w:pStyle w:val="Compact"/>
+              <w:jc w:val="left"/>
+            </w:pPr>
+            <w:r>
+              <w:t xml:space="preserve">RPM</w:t>
+            </w:r>
+          </w:p>
+        </w:tc>
+        <w:tc>
+          <w:tcPr/>
+          <w:p>
+            <w:pPr>
+              <w:pStyle w:val="Compact"/>
+              <w:jc w:val="left"/>
+            </w:pPr>
+            <w:r>
+              <w:t xml:space="preserve">RPD</w:t>
+            </w:r>
+          </w:p>
+        </w:tc>
+        <w:tc>
+          <w:tcPr/>
+          <w:p>
+            <w:pPr>
+              <w:pStyle w:val="Compact"/>
+              <w:jc w:val="left"/>
+            </w:pPr>
+            <w:r>
+              <w:t xml:space="preserve">TPM</w:t>
+            </w:r>
+          </w:p>
+        </w:tc>
+        <w:tc>
+          <w:tcPr/>
+          <w:p>
+            <w:pPr>
+              <w:pStyle w:val="Compact"/>
+              <w:jc w:val="left"/>
+            </w:pPr>
+            <w:r>
+              <w:t xml:space="preserve">Notes</w:t>
+            </w:r>
+          </w:p>
+        </w:tc>
+      </w:tr>
+      <w:tr>
+        <w:tc>
+          <w:tcPr/>
+          <w:p>
+            <w:pPr>
+              <w:pStyle w:val="Compact"/>
+              <w:jc w:val="left"/>
+            </w:pPr>
+            <w:r>
+              <w:rPr>
+                <w:bCs/>
+                <w:b/>
+              </w:rPr>
+              <w:t xml:space="preserve">Gemini 2.5 Flash</w:t>
+            </w:r>
+          </w:p>
+        </w:tc>
+        <w:tc>
+          <w:tcPr/>
+          <w:p>
+            <w:pPr>
+              <w:pStyle w:val="Compact"/>
+              <w:jc w:val="left"/>
+            </w:pPr>
+            <w:r>
+              <w:t xml:space="preserve">10</w:t>
+            </w:r>
+          </w:p>
+        </w:tc>
+        <w:tc>
+          <w:tcPr/>
+          <w:p>
+            <w:pPr>
+              <w:pStyle w:val="Compact"/>
+              <w:jc w:val="left"/>
+            </w:pPr>
+            <w:r>
+              <w:t xml:space="preserve">1,500</w:t>
+            </w:r>
+          </w:p>
+        </w:tc>
+        <w:tc>
+          <w:tcPr/>
+          <w:p>
+            <w:pPr>
+              <w:pStyle w:val="Compact"/>
+              <w:jc w:val="left"/>
+            </w:pPr>
+            <w:r>
+              <w:t xml:space="preserve">250K</w:t>
+            </w:r>
+          </w:p>
+        </w:tc>
+        <w:tc>
+          <w:tcPr/>
+          <w:p>
+            <w:pPr>
+              <w:pStyle w:val="Compact"/>
+              <w:jc w:val="left"/>
+            </w:pPr>
+            <w:r>
+              <w:t xml:space="preserve">Best for form processing</w:t>
+            </w:r>
+          </w:p>
+        </w:tc>
+      </w:tr>
+      <w:tr>
+        <w:tc>
+          <w:tcPr/>
+          <w:p>
+            <w:pPr>
+              <w:pStyle w:val="Compact"/>
+              <w:jc w:val="left"/>
+            </w:pPr>
+            <w:r>
+              <w:rPr>
+                <w:bCs/>
+                <w:b/>
+              </w:rPr>
+              <w:t xml:space="preserve">Gemini 2.5 Pro</w:t>
+            </w:r>
+          </w:p>
+        </w:tc>
+        <w:tc>
+          <w:tcPr/>
+          <w:p>
+            <w:pPr>
+              <w:pStyle w:val="Compact"/>
+              <w:jc w:val="left"/>
+            </w:pPr>
+            <w:r>
+              <w:t xml:space="preserve">5</w:t>
+            </w:r>
+          </w:p>
+        </w:tc>
+        <w:tc>
+          <w:tcPr/>
+          <w:p>
+            <w:pPr>
+              <w:pStyle w:val="Compact"/>
+              <w:jc w:val="left"/>
+            </w:pPr>
+            <w:r>
+              <w:t xml:space="preserve">50</w:t>
+            </w:r>
+          </w:p>
+        </w:tc>
+        <w:tc>
+          <w:tcPr/>
+          <w:p>
+            <w:pPr>
+              <w:pStyle w:val="Compact"/>
+              <w:jc w:val="left"/>
+            </w:pPr>
+            <w:r>
+              <w:t xml:space="preserve">250K</w:t>
+            </w:r>
+          </w:p>
+        </w:tc>
+        <w:tc>
+          <w:tcPr/>
+          <w:p>
+            <w:pPr>
+              <w:pStyle w:val="Compact"/>
+              <w:jc w:val="left"/>
+            </w:pPr>
+            <w:r>
+              <w:t xml:space="preserve">Overkill for forms, tight daily limit</w:t>
+            </w:r>
+          </w:p>
+        </w:tc>
+      </w:tr>
+    </w:tbl>
+    <w:bookmarkEnd w:id="42"/>
+    <w:bookmarkStart w:id="43" w:name="will-it-work-for-form-claw"/>
+    <w:p>
+      <w:pPr>
+        <w:pStyle w:val="Heading4"/>
+      </w:pPr>
+      <w:r>
+        <w:t xml:space="preserve">Will it work for Form Claw?</w:t>
+      </w:r>
+    </w:p>
+    <w:p>
+      <w:pPr>
+        <w:pStyle w:val="FirstParagraph"/>
+      </w:pPr>
+      <w:r>
+        <w:rPr>
+          <w:bCs/>
+          <w:b/>
+        </w:rPr>
+        <w:t xml:space="preserve">Yes, comfortably.</w:t>
+      </w:r>
+      <w:r>
+        <w:t xml:space="preserve"> </w:t>
+      </w:r>
+      <w:r>
+        <w:t xml:space="preserve">Here’s the math:</w:t>
+      </w:r>
+    </w:p>
+    <w:p>
+      <w:pPr>
+        <w:pStyle w:val="SourceCode"/>
+      </w:pPr>
+      <w:r>
+        <w:rPr>
+          <w:rStyle w:val="VerbatimChar"/>
+        </w:rPr>
+        <w:t xml:space="preserve">Per form: ~4-6 LLM calls (vision analysis + code generation + possible retry)</w:t>
+      </w:r>
+      <w:r>
+        <w:br/>
+      </w:r>
+      <w:r>
+        <w:rPr>
+          <w:rStyle w:val="VerbatimChar"/>
+        </w:rPr>
+        <w:t xml:space="preserve">Per day:  2 forms × 6 calls = 12 calls/day</w:t>
+      </w:r>
+      <w:r>
+        <w:br/>
+      </w:r>
+      <w:r>
+        <w:rPr>
+          <w:rStyle w:val="VerbatimChar"/>
+        </w:rPr>
+        <w:t xml:space="preserve">Free cap: 1,500 calls/day (Gemini 2.5 Flash)</w:t>
+      </w:r>
+      <w:r>
+        <w:br/>
+      </w:r>
+      <w:r>
+        <w:rPr>
+          <w:rStyle w:val="VerbatimChar"/>
+        </w:rPr>
+        <w:t xml:space="preserve">Usage:    0.8% of daily limit — massive headroom</w:t>
+      </w:r>
+    </w:p>
+    <w:p>
+      <w:pPr>
+        <w:pStyle w:val="FirstParagraph"/>
+      </w:pPr>
+      <w:r>
+        <w:t xml:space="preserve">Even at 10× the expected load (20 forms/day), you’d only use 8% of the free quota.</w:t>
+      </w:r>
+    </w:p>
+    <w:bookmarkEnd w:id="43"/>
+    <w:bookmarkStart w:id="44" w:name="caveats"/>
+    <w:p>
+      <w:pPr>
+        <w:pStyle w:val="Heading4"/>
+      </w:pPr>
+      <w:r>
+        <w:t xml:space="preserve">Caveats</w:t>
+      </w:r>
+    </w:p>
+    <w:tbl>
+      <w:tblPr>
+        <w:tblStyle w:val="Table"/>
+        <w:tblW w:type="pct" w:w="5000"/>
+        <w:tblLook w:firstRow="1" w:lastRow="0" w:firstColumn="0" w:lastColumn="0" w:noHBand="0" w:noVBand="0" w:val="0020"/>
+      </w:tblPr>
+      <w:tblGrid>
+        <w:gridCol w:w="2457"/>
+        <w:gridCol w:w="2184"/>
+        <w:gridCol w:w="3277"/>
+      </w:tblGrid>
+      <w:tr>
+        <w:trPr>
+          <w:tblHeader w:val="true"/>
+        </w:trPr>
+        <w:tc>
+          <w:tcPr/>
+          <w:p>
+            <w:pPr>
+              <w:pStyle w:val="Compact"/>
+              <w:jc w:val="left"/>
+            </w:pPr>
+            <w:r>
+              <w:t xml:space="preserve">Concern</w:t>
+            </w:r>
+          </w:p>
+        </w:tc>
+        <w:tc>
+          <w:tcPr/>
+          <w:p>
+            <w:pPr>
+              <w:pStyle w:val="Compact"/>
+              <w:jc w:val="left"/>
+            </w:pPr>
+            <w:r>
+              <w:t xml:space="preserve">Impact</w:t>
+            </w:r>
+          </w:p>
+        </w:tc>
+        <w:tc>
+          <w:tcPr/>
+          <w:p>
+            <w:pPr>
+              <w:pStyle w:val="Compact"/>
+              <w:jc w:val="left"/>
+            </w:pPr>
+            <w:r>
+              <w:t xml:space="preserve">Mitigation</w:t>
+            </w:r>
+          </w:p>
+        </w:tc>
+      </w:tr>
+      <w:tr>
+        <w:tc>
+          <w:tcPr/>
+          <w:p>
+            <w:pPr>
+              <w:pStyle w:val="Compact"/>
+              <w:jc w:val="left"/>
+            </w:pPr>
+            <w:r>
+              <w:rPr>
+                <w:bCs/>
+                <w:b/>
+              </w:rPr>
+              <w:t xml:space="preserve">Data privacy</w:t>
+            </w:r>
+          </w:p>
+        </w:tc>
+        <w:tc>
+          <w:tcPr/>
+          <w:p>
+            <w:pPr>
+              <w:pStyle w:val="Compact"/>
+              <w:jc w:val="left"/>
+            </w:pPr>
+            <w:r>
+              <w:t xml:space="preserve">Free tier inputs may be used to improve Google’s models</w:t>
+            </w:r>
+          </w:p>
+        </w:tc>
+        <w:tc>
+          <w:tcPr/>
+          <w:p>
+            <w:pPr>
+              <w:pStyle w:val="Compact"/>
+              <w:jc w:val="left"/>
+            </w:pPr>
+            <w:r>
+              <w:t xml:space="preserve">Forms contain personal/medical data — evaluate your comfort level</w:t>
+            </w:r>
+          </w:p>
+        </w:tc>
+      </w:tr>
+      <w:tr>
+        <w:tc>
+          <w:tcPr/>
+          <w:p>
+            <w:pPr>
+              <w:pStyle w:val="Compact"/>
+              <w:jc w:val="left"/>
+            </w:pPr>
+            <w:r>
+              <w:rPr>
+                <w:bCs/>
+                <w:b/>
+              </w:rPr>
+              <w:t xml:space="preserve">No SLA</w:t>
+            </w:r>
+          </w:p>
+        </w:tc>
+        <w:tc>
+          <w:tcPr/>
+          <w:p>
+            <w:pPr>
+              <w:pStyle w:val="Compact"/>
+              <w:jc w:val="left"/>
+            </w:pPr>
+            <w:r>
+              <w:t xml:space="preserve">Google can throttle or revoke free access anytime</w:t>
+            </w:r>
+          </w:p>
+        </w:tc>
+        <w:tc>
+          <w:tcPr/>
+          <w:p>
+            <w:pPr>
+              <w:pStyle w:val="Compact"/>
+              <w:jc w:val="left"/>
+            </w:pPr>
+            <w:r>
+              <w:t xml:space="preserve">Keep ChatLLM or vLLM as fallback</w:t>
+            </w:r>
+          </w:p>
+        </w:tc>
+      </w:tr>
+      <w:tr>
+        <w:tc>
+          <w:tcPr/>
+          <w:p>
+            <w:pPr>
+              <w:pStyle w:val="Compact"/>
+              <w:jc w:val="left"/>
+            </w:pPr>
+            <w:r>
+              <w:rPr>
+                <w:bCs/>
+                <w:b/>
+              </w:rPr>
+              <w:t xml:space="preserve">10 RPM cap</w:t>
+            </w:r>
+          </w:p>
+        </w:tc>
+        <w:tc>
+          <w:tcPr/>
+          <w:p>
+            <w:pPr>
+              <w:pStyle w:val="Compact"/>
+              <w:jc w:val="left"/>
+            </w:pPr>
+            <w:r>
+              <w:t xml:space="preserve">Can’t burst more than 10 requests/minute</w:t>
+            </w:r>
+          </w:p>
+        </w:tc>
+        <w:tc>
+          <w:tcPr/>
+          <w:p>
+            <w:pPr>
+              <w:pStyle w:val="Compact"/>
+              <w:jc w:val="left"/>
+            </w:pPr>
+            <w:r>
+              <w:t xml:space="preserve">Irrelevant at 2 forms/day; add exponential backoff just in case</w:t>
+            </w:r>
+          </w:p>
+        </w:tc>
+      </w:tr>
+      <w:tr>
+        <w:tc>
+          <w:tcPr/>
+          <w:p>
+            <w:pPr>
+              <w:pStyle w:val="Compact"/>
+              <w:jc w:val="left"/>
+            </w:pPr>
+            <w:r>
+              <w:rPr>
+                <w:bCs/>
+                <w:b/>
+              </w:rPr>
+              <w:t xml:space="preserve">50 RPD for Pro</w:t>
+            </w:r>
+          </w:p>
+        </w:tc>
+        <w:tc>
+          <w:tcPr/>
+          <w:p>
+            <w:pPr>
+              <w:pStyle w:val="Compact"/>
+              <w:jc w:val="left"/>
+            </w:pPr>
+            <w:r>
+              <w:t xml:space="preserve">If you want Pro-level reasoning, only 50/day</w:t>
+            </w:r>
+          </w:p>
+        </w:tc>
+        <w:tc>
+          <w:tcPr/>
+          <w:p>
+            <w:pPr>
+              <w:pStyle w:val="Compact"/>
+              <w:jc w:val="left"/>
+            </w:pPr>
+            <w:r>
+              <w:t xml:space="preserve">Flash is sufficient for form analysis</w:t>
+            </w:r>
+          </w:p>
+        </w:tc>
+      </w:tr>
+    </w:tbl>
+    <w:bookmarkEnd w:id="44"/>
+    <w:bookmarkStart w:id="45" w:name="integration-from-cloudflare-worker"/>
+    <w:p>
+      <w:pPr>
+        <w:pStyle w:val="Heading4"/>
+      </w:pPr>
+      <w:r>
+        <w:t xml:space="preserve">Integration from Cloudflare Worker</w:t>
+      </w:r>
+    </w:p>
+    <w:p>
+      <w:pPr>
+        <w:pStyle w:val="FirstParagraph"/>
+      </w:pPr>
+      <w:r>
+        <w:t xml:space="preserve">Since Google AI Studio exposes an</w:t>
+      </w:r>
+      <w:r>
+        <w:t xml:space="preserve"> </w:t>
+      </w:r>
+      <w:r>
+        <w:rPr>
+          <w:bCs/>
+          <w:b/>
+        </w:rPr>
+        <w:t xml:space="preserve">OpenAI-compatible endpoint</w:t>
+      </w:r>
+      <w:r>
+        <w:t xml:space="preserve">, the integration is a drop-in replacement — same code structure as Options A/B:</w:t>
+      </w:r>
+    </w:p>
+    <w:p>
+      <w:pPr>
+        <w:pStyle w:val="SourceCode"/>
+      </w:pPr>
+      <w:r>
+        <w:rPr>
+          <w:rStyle w:val="KeywordTok"/>
+        </w:rPr>
+        <w:t xml:space="preserve">const</w:t>
+      </w:r>
+      <w:r>
+        <w:rPr>
+          <w:rStyle w:val="NormalTok"/>
+        </w:rPr>
+        <w:t xml:space="preserve"> response </w:t>
+      </w:r>
+      <w:r>
+        <w:rPr>
+          <w:rStyle w:val="OperatorTok"/>
+        </w:rPr>
+        <w:t xml:space="preserve">=</w:t>
+      </w:r>
+      <w:r>
+        <w:rPr>
+          <w:rStyle w:val="NormalTok"/>
+        </w:rPr>
+        <w:t xml:space="preserve"> </w:t>
+      </w:r>
+      <w:r>
+        <w:rPr>
+          <w:rStyle w:val="ControlFlowTok"/>
+        </w:rPr>
+        <w:t xml:space="preserve">await</w:t>
+      </w:r>
+      <w:r>
+        <w:rPr>
+          <w:rStyle w:val="NormalTok"/>
+        </w:rPr>
+        <w:t xml:space="preserve"> </w:t>
+      </w:r>
+      <w:r>
+        <w:rPr>
+          <w:rStyle w:val="FunctionTok"/>
+        </w:rPr>
+        <w:t xml:space="preserve">fetch</w:t>
+      </w:r>
+      <w:r>
+        <w:rPr>
+          <w:rStyle w:val="NormalTok"/>
+        </w:rPr>
+        <w:t xml:space="preserve">(</w:t>
+      </w:r>
+      <w:r>
+        <w:rPr>
+          <w:rStyle w:val="StringTok"/>
+        </w:rPr>
+        <w:t xml:space="preserve">'https://generativelanguage.googleapis.com/v1beta/openai/chat/completions'</w:t>
+      </w:r>
+      <w:r>
+        <w:rPr>
+          <w:rStyle w:val="OperatorTok"/>
+        </w:rPr>
+        <w:t xml:space="preserve">,</w:t>
+      </w:r>
+      <w:r>
+        <w:rPr>
+          <w:rStyle w:val="NormalTok"/>
+        </w:rPr>
+        <w:t xml:space="preserve"> {</w:t>
+      </w:r>
+      <w:r>
+        <w:br/>
+      </w:r>
+      <w:r>
+        <w:rPr>
+          <w:rStyle w:val="NormalTok"/>
+        </w:rPr>
+        <w:t xml:space="preserve">  method</w:t>
+      </w:r>
+      <w:r>
+        <w:rPr>
+          <w:rStyle w:val="OperatorTok"/>
+        </w:rPr>
+        <w:t xml:space="preserve">:</w:t>
+      </w:r>
+      <w:r>
+        <w:rPr>
+          <w:rStyle w:val="NormalTok"/>
+        </w:rPr>
+        <w:t xml:space="preserve"> </w:t>
+      </w:r>
+      <w:r>
+        <w:rPr>
+          <w:rStyle w:val="StringTok"/>
+        </w:rPr>
+        <w:t xml:space="preserve">'POST'</w:t>
+      </w:r>
+      <w:r>
+        <w:rPr>
+          <w:rStyle w:val="OperatorTok"/>
+        </w:rPr>
+        <w:t xml:space="preserve">,</w:t>
+      </w:r>
+      <w:r>
+        <w:br/>
+      </w:r>
+      <w:r>
+        <w:rPr>
+          <w:rStyle w:val="NormalTok"/>
+        </w:rPr>
+        <w:t xml:space="preserve">  headers</w:t>
+      </w:r>
+      <w:r>
+        <w:rPr>
+          <w:rStyle w:val="OperatorTok"/>
+        </w:rPr>
+        <w:t xml:space="preserve">:</w:t>
+      </w:r>
+      <w:r>
+        <w:rPr>
+          <w:rStyle w:val="NormalTok"/>
+        </w:rPr>
+        <w:t xml:space="preserve"> {</w:t>
+      </w:r>
+      <w:r>
+        <w:br/>
+      </w:r>
+      <w:r>
+        <w:rPr>
+          <w:rStyle w:val="NormalTok"/>
+        </w:rPr>
+        <w:t xml:space="preserve">    </w:t>
+      </w:r>
+      <w:r>
+        <w:rPr>
+          <w:rStyle w:val="StringTok"/>
+        </w:rPr>
+        <w:t xml:space="preserve">'Authorization'</w:t>
+      </w:r>
+      <w:r>
+        <w:rPr>
+          <w:rStyle w:val="OperatorTok"/>
+        </w:rPr>
+        <w:t xml:space="preserve">:</w:t>
+      </w:r>
+      <w:r>
+        <w:rPr>
+          <w:rStyle w:val="NormalTok"/>
+        </w:rPr>
+        <w:t xml:space="preserve"> </w:t>
+      </w:r>
+      <w:r>
+        <w:rPr>
+          <w:rStyle w:val="VerbatimStringTok"/>
+        </w:rPr>
+        <w:t xml:space="preserve">`Bearer </w:t>
+      </w:r>
+      <w:r>
+        <w:rPr>
+          <w:rStyle w:val="SpecialCharTok"/>
+        </w:rPr>
+        <w:t xml:space="preserve">${</w:t>
+      </w:r>
+      <w:r>
+        <w:rPr>
+          <w:rStyle w:val="NormalTok"/>
+        </w:rPr>
+        <w:t xml:space="preserve">env</w:t>
+      </w:r>
+      <w:r>
+        <w:rPr>
+          <w:rStyle w:val="OperatorTok"/>
+        </w:rPr>
+        <w:t xml:space="preserve">.</w:t>
+      </w:r>
+      <w:r>
+        <w:rPr>
+          <w:rStyle w:val="AttributeTok"/>
+        </w:rPr>
+        <w:t xml:space="preserve">GOOGLE_AI_STUDIO_KEY</w:t>
+      </w:r>
+      <w:r>
+        <w:rPr>
+          <w:rStyle w:val="SpecialCharTok"/>
+        </w:rPr>
+        <w:t xml:space="preserve">}</w:t>
+      </w:r>
+      <w:r>
+        <w:rPr>
+          <w:rStyle w:val="VerbatimStringTok"/>
+        </w:rPr>
+        <w:t xml:space="preserve">`</w:t>
+      </w:r>
+      <w:r>
+        <w:rPr>
+          <w:rStyle w:val="OperatorTok"/>
+        </w:rPr>
+        <w:t xml:space="preserve">,</w:t>
+      </w:r>
+      <w:r>
+        <w:br/>
+      </w:r>
+      <w:r>
+        <w:rPr>
+          <w:rStyle w:val="NormalTok"/>
+        </w:rPr>
+        <w:t xml:space="preserve">    </w:t>
+      </w:r>
+      <w:r>
+        <w:rPr>
+          <w:rStyle w:val="StringTok"/>
+        </w:rPr>
+        <w:t xml:space="preserve">'Content-Type'</w:t>
+      </w:r>
+      <w:r>
+        <w:rPr>
+          <w:rStyle w:val="OperatorTok"/>
+        </w:rPr>
+        <w:t xml:space="preserve">:</w:t>
+      </w:r>
+      <w:r>
+        <w:rPr>
+          <w:rStyle w:val="NormalTok"/>
+        </w:rPr>
+        <w:t xml:space="preserve"> </w:t>
+      </w:r>
+      <w:r>
+        <w:rPr>
+          <w:rStyle w:val="StringTok"/>
+        </w:rPr>
+        <w:t xml:space="preserve">'application/json'</w:t>
+      </w:r>
+      <w:r>
+        <w:br/>
+      </w:r>
+      <w:r>
+        <w:rPr>
+          <w:rStyle w:val="NormalTok"/>
+        </w:rPr>
+        <w:t xml:space="preserve">  }</w:t>
+      </w:r>
+      <w:r>
+        <w:rPr>
+          <w:rStyle w:val="OperatorTok"/>
+        </w:rPr>
+        <w:t xml:space="preserve">,</w:t>
+      </w:r>
+      <w:r>
+        <w:br/>
+      </w:r>
+      <w:r>
+        <w:rPr>
+          <w:rStyle w:val="NormalTok"/>
+        </w:rPr>
+        <w:t xml:space="preserve">  body</w:t>
+      </w:r>
+      <w:r>
+        <w:rPr>
+          <w:rStyle w:val="OperatorTok"/>
+        </w:rPr>
+        <w:t xml:space="preserve">:</w:t>
+      </w:r>
+      <w:r>
+        <w:rPr>
+          <w:rStyle w:val="NormalTok"/>
+        </w:rPr>
+        <w:t xml:space="preserve"> </w:t>
+      </w:r>
+      <w:r>
+        <w:rPr>
+          <w:rStyle w:val="BuiltInTok"/>
+        </w:rPr>
+        <w:t xml:space="preserve">JSON</w:t>
+      </w:r>
+      <w:r>
+        <w:rPr>
+          <w:rStyle w:val="OperatorTok"/>
+        </w:rPr>
+        <w:t xml:space="preserve">.</w:t>
+      </w:r>
+      <w:r>
+        <w:rPr>
+          <w:rStyle w:val="FunctionTok"/>
+        </w:rPr>
+        <w:t xml:space="preserve">stringify</w:t>
+      </w:r>
+      <w:r>
+        <w:rPr>
+          <w:rStyle w:val="NormalTok"/>
+        </w:rPr>
+        <w:t xml:space="preserve">({</w:t>
+      </w:r>
+      <w:r>
+        <w:br/>
+      </w:r>
+      <w:r>
+        <w:rPr>
+          <w:rStyle w:val="NormalTok"/>
+        </w:rPr>
+        <w:t xml:space="preserve">    model</w:t>
+      </w:r>
+      <w:r>
+        <w:rPr>
+          <w:rStyle w:val="OperatorTok"/>
+        </w:rPr>
+        <w:t xml:space="preserve">:</w:t>
+      </w:r>
+      <w:r>
+        <w:rPr>
+          <w:rStyle w:val="NormalTok"/>
+        </w:rPr>
+        <w:t xml:space="preserve"> </w:t>
+      </w:r>
+      <w:r>
+        <w:rPr>
+          <w:rStyle w:val="StringTok"/>
+        </w:rPr>
+        <w:t xml:space="preserve">'gemini-2.5-flash'</w:t>
+      </w:r>
+      <w:r>
+        <w:rPr>
+          <w:rStyle w:val="OperatorTok"/>
+        </w:rPr>
+        <w:t xml:space="preserve">,</w:t>
+      </w:r>
+      <w:r>
+        <w:br/>
+      </w:r>
+      <w:r>
+        <w:rPr>
+          <w:rStyle w:val="NormalTok"/>
+        </w:rPr>
+        <w:t xml:space="preserve">    messages</w:t>
+      </w:r>
+      <w:r>
+        <w:rPr>
+          <w:rStyle w:val="OperatorTok"/>
+        </w:rPr>
+        <w:t xml:space="preserve">:</w:t>
+      </w:r>
+      <w:r>
+        <w:rPr>
+          <w:rStyle w:val="NormalTok"/>
+        </w:rPr>
+        <w:t xml:space="preserve"> [</w:t>
+      </w:r>
+      <w:r>
+        <w:br/>
+      </w:r>
+      <w:r>
+        <w:rPr>
+          <w:rStyle w:val="NormalTok"/>
+        </w:rPr>
+        <w:t xml:space="preserve">      {</w:t>
+      </w:r>
+      <w:r>
+        <w:br/>
+      </w:r>
+      <w:r>
+        <w:rPr>
+          <w:rStyle w:val="NormalTok"/>
+        </w:rPr>
+        <w:t xml:space="preserve">        role</w:t>
+      </w:r>
+      <w:r>
+        <w:rPr>
+          <w:rStyle w:val="OperatorTok"/>
+        </w:rPr>
+        <w:t xml:space="preserve">:</w:t>
+      </w:r>
+      <w:r>
+        <w:rPr>
+          <w:rStyle w:val="NormalTok"/>
+        </w:rPr>
+        <w:t xml:space="preserve"> </w:t>
+      </w:r>
+      <w:r>
+        <w:rPr>
+          <w:rStyle w:val="StringTok"/>
+        </w:rPr>
+        <w:t xml:space="preserve">'user'</w:t>
+      </w:r>
+      <w:r>
+        <w:rPr>
+          <w:rStyle w:val="OperatorTok"/>
+        </w:rPr>
+        <w:t xml:space="preserve">,</w:t>
+      </w:r>
+      <w:r>
+        <w:br/>
+      </w:r>
+      <w:r>
+        <w:rPr>
+          <w:rStyle w:val="NormalTok"/>
+        </w:rPr>
+        <w:t xml:space="preserve">        content</w:t>
+      </w:r>
+      <w:r>
+        <w:rPr>
+          <w:rStyle w:val="OperatorTok"/>
+        </w:rPr>
+        <w:t xml:space="preserve">:</w:t>
+      </w:r>
+      <w:r>
+        <w:rPr>
+          <w:rStyle w:val="NormalTok"/>
+        </w:rPr>
+        <w:t xml:space="preserve"> [</w:t>
+      </w:r>
+      <w:r>
+        <w:br/>
+      </w:r>
+      <w:r>
+        <w:rPr>
+          <w:rStyle w:val="NormalTok"/>
+        </w:rPr>
+        <w:t xml:space="preserve">          { type</w:t>
+      </w:r>
+      <w:r>
+        <w:rPr>
+          <w:rStyle w:val="OperatorTok"/>
+        </w:rPr>
+        <w:t xml:space="preserve">:</w:t>
+      </w:r>
+      <w:r>
+        <w:rPr>
+          <w:rStyle w:val="NormalTok"/>
+        </w:rPr>
+        <w:t xml:space="preserve"> </w:t>
+      </w:r>
+      <w:r>
+        <w:rPr>
+          <w:rStyle w:val="StringTok"/>
+        </w:rPr>
+        <w:t xml:space="preserve">'text'</w:t>
+      </w:r>
+      <w:r>
+        <w:rPr>
+          <w:rStyle w:val="OperatorTok"/>
+        </w:rPr>
+        <w:t xml:space="preserve">,</w:t>
+      </w:r>
+      <w:r>
+        <w:rPr>
+          <w:rStyle w:val="NormalTok"/>
+        </w:rPr>
+        <w:t xml:space="preserve"> text</w:t>
+      </w:r>
+      <w:r>
+        <w:rPr>
+          <w:rStyle w:val="OperatorTok"/>
+        </w:rPr>
+        <w:t xml:space="preserve">:</w:t>
+      </w:r>
+      <w:r>
+        <w:rPr>
+          <w:rStyle w:val="NormalTok"/>
+        </w:rPr>
+        <w:t xml:space="preserve"> </w:t>
+      </w:r>
+      <w:r>
+        <w:rPr>
+          <w:rStyle w:val="StringTok"/>
+        </w:rPr>
+        <w:t xml:space="preserve">'Analyze this PDF form...'</w:t>
+      </w:r>
+      <w:r>
+        <w:rPr>
+          <w:rStyle w:val="NormalTok"/>
+        </w:rPr>
+        <w:t xml:space="preserve"> }</w:t>
+      </w:r>
+      <w:r>
+        <w:rPr>
+          <w:rStyle w:val="OperatorTok"/>
+        </w:rPr>
+        <w:t xml:space="preserve">,</w:t>
+      </w:r>
+      <w:r>
+        <w:br/>
+      </w:r>
+      <w:r>
+        <w:rPr>
+          <w:rStyle w:val="NormalTok"/>
+        </w:rPr>
+        <w:t xml:space="preserve">          { type</w:t>
+      </w:r>
+      <w:r>
+        <w:rPr>
+          <w:rStyle w:val="OperatorTok"/>
+        </w:rPr>
+        <w:t xml:space="preserve">:</w:t>
+      </w:r>
+      <w:r>
+        <w:rPr>
+          <w:rStyle w:val="NormalTok"/>
+        </w:rPr>
+        <w:t xml:space="preserve"> </w:t>
+      </w:r>
+      <w:r>
+        <w:rPr>
+          <w:rStyle w:val="StringTok"/>
+        </w:rPr>
+        <w:t xml:space="preserve">'image_url'</w:t>
+      </w:r>
+      <w:r>
+        <w:rPr>
+          <w:rStyle w:val="OperatorTok"/>
+        </w:rPr>
+        <w:t xml:space="preserve">,</w:t>
+      </w:r>
+      <w:r>
+        <w:rPr>
+          <w:rStyle w:val="NormalTok"/>
+        </w:rPr>
+        <w:t xml:space="preserve"> image_url</w:t>
+      </w:r>
+      <w:r>
+        <w:rPr>
+          <w:rStyle w:val="OperatorTok"/>
+        </w:rPr>
+        <w:t xml:space="preserve">:</w:t>
+      </w:r>
+      <w:r>
+        <w:rPr>
+          <w:rStyle w:val="NormalTok"/>
+        </w:rPr>
+        <w:t xml:space="preserve"> { url</w:t>
+      </w:r>
+      <w:r>
+        <w:rPr>
+          <w:rStyle w:val="OperatorTok"/>
+        </w:rPr>
+        <w:t xml:space="preserve">:</w:t>
+      </w:r>
+      <w:r>
+        <w:rPr>
+          <w:rStyle w:val="NormalTok"/>
+        </w:rPr>
+        <w:t xml:space="preserve"> </w:t>
+      </w:r>
+      <w:r>
+        <w:rPr>
+          <w:rStyle w:val="VerbatimStringTok"/>
+        </w:rPr>
+        <w:t xml:space="preserve">`data:image/png;base64,</w:t>
+      </w:r>
+      <w:r>
+        <w:rPr>
+          <w:rStyle w:val="SpecialCharTok"/>
+        </w:rPr>
+        <w:t xml:space="preserve">${</w:t>
+      </w:r>
+      <w:r>
+        <w:rPr>
+          <w:rStyle w:val="NormalTok"/>
+        </w:rPr>
+        <w:t xml:space="preserve">pageImageBase64</w:t>
+      </w:r>
+      <w:r>
+        <w:rPr>
+          <w:rStyle w:val="SpecialCharTok"/>
+        </w:rPr>
+        <w:t xml:space="preserve">}</w:t>
+      </w:r>
+      <w:r>
+        <w:rPr>
+          <w:rStyle w:val="VerbatimStringTok"/>
+        </w:rPr>
+        <w:t xml:space="preserve">`</w:t>
+      </w:r>
+      <w:r>
+        <w:rPr>
+          <w:rStyle w:val="NormalTok"/>
+        </w:rPr>
+        <w:t xml:space="preserve"> } }</w:t>
+      </w:r>
+      <w:r>
+        <w:br/>
+      </w:r>
+      <w:r>
+        <w:rPr>
+          <w:rStyle w:val="NormalTok"/>
+        </w:rPr>
+        <w:t xml:space="preserve">        ]</w:t>
+      </w:r>
+      <w:r>
+        <w:br/>
+      </w:r>
+      <w:r>
+        <w:rPr>
+          <w:rStyle w:val="NormalTok"/>
+        </w:rPr>
+        <w:t xml:space="preserve">      }</w:t>
+      </w:r>
+      <w:r>
+        <w:br/>
+      </w:r>
+      <w:r>
+        <w:rPr>
+          <w:rStyle w:val="NormalTok"/>
+        </w:rPr>
+        <w:t xml:space="preserve">    ]</w:t>
+      </w:r>
+      <w:r>
+        <w:br/>
+      </w:r>
+      <w:r>
+        <w:rPr>
+          <w:rStyle w:val="NormalTok"/>
+        </w:rPr>
+        <w:t xml:space="preserve">  })</w:t>
+      </w:r>
+      <w:r>
+        <w:br/>
+      </w:r>
+      <w:r>
+        <w:rPr>
+          <w:rStyle w:val="NormalTok"/>
+        </w:rPr>
+        <w:t xml:space="preserve">})</w:t>
+      </w:r>
+      <w:r>
+        <w:rPr>
+          <w:rStyle w:val="OperatorTok"/>
+        </w:rPr>
+        <w:t xml:space="preserve">;</w:t>
+      </w:r>
+    </w:p>
+    <w:bookmarkEnd w:id="45"/>
+    <w:bookmarkStart w:id="46" w:name="getting-the-api-key-30-seconds"/>
+    <w:p>
+      <w:pPr>
+        <w:pStyle w:val="Heading4"/>
+      </w:pPr>
+      <w:r>
+        <w:t xml:space="preserve">Getting the API Key (30 seconds)</w:t>
+      </w:r>
+    </w:p>
+    <w:p>
+      <w:pPr>
+        <w:numPr>
+          <w:ilvl w:val="0"/>
+          <w:numId w:val="1004"/>
+        </w:numPr>
+        <w:pStyle w:val="Compact"/>
+      </w:pPr>
+      <w:r>
+        <w:t xml:space="preserve">Go to</w:t>
+      </w:r>
+      <w:r>
+        <w:t xml:space="preserve"> </w:t>
+      </w:r>
+      <w:hyperlink r:id="rId41">
+        <w:r>
+          <w:rPr>
+            <w:rStyle w:val="Hyperlink"/>
+          </w:rPr>
+          <w:t xml:space="preserve">aistudio.google.com/apikey</w:t>
+        </w:r>
+      </w:hyperlink>
+    </w:p>
+    <w:p>
+      <w:pPr>
+        <w:numPr>
+          <w:ilvl w:val="0"/>
+          <w:numId w:val="1004"/>
+        </w:numPr>
+        <w:pStyle w:val="Compact"/>
+      </w:pPr>
+      <w:r>
+        <w:t xml:space="preserve">Sign in with any Google account</w:t>
+      </w:r>
+    </w:p>
+    <w:p>
+      <w:pPr>
+        <w:numPr>
+          <w:ilvl w:val="0"/>
+          <w:numId w:val="1004"/>
+        </w:numPr>
+        <w:pStyle w:val="Compact"/>
+      </w:pPr>
+      <w:r>
+        <w:t xml:space="preserve">Click</w:t>
+      </w:r>
+      <w:r>
+        <w:t xml:space="preserve"> </w:t>
+      </w:r>
+      <w:r>
+        <w:t xml:space="preserve">“</w:t>
+      </w:r>
+      <w:r>
+        <w:t xml:space="preserve">Create API Key</w:t>
+      </w:r>
+      <w:r>
+        <w:t xml:space="preserve">”</w:t>
+      </w:r>
+      <w:r>
+        <w:t xml:space="preserve"> </w:t>
+      </w:r>
+      <w:r>
+        <w:t xml:space="preserve">→ select or create a Google Cloud project</w:t>
+      </w:r>
+    </w:p>
+    <w:p>
+      <w:pPr>
+        <w:numPr>
+          <w:ilvl w:val="0"/>
+          <w:numId w:val="1004"/>
+        </w:numPr>
+        <w:pStyle w:val="Compact"/>
+      </w:pPr>
+      <w:r>
+        <w:t xml:space="preserve">Copy the key → store as</w:t>
+      </w:r>
+      <w:r>
+        <w:t xml:space="preserve"> </w:t>
+      </w:r>
+      <w:r>
+        <w:rPr>
+          <w:rStyle w:val="VerbatimChar"/>
+        </w:rPr>
+        <w:t xml:space="preserve">GOOGLE_AI_STUDIO_KEY</w:t>
+      </w:r>
+      <w:r>
+        <w:t xml:space="preserve"> </w:t>
+      </w:r>
+      <w:r>
+        <w:t xml:space="preserve">in Cloudflare Worker secrets</w:t>
+      </w:r>
+    </w:p>
+    <w:p>
+      <w:pPr>
+        <w:pStyle w:val="FirstParagraph"/>
+      </w:pPr>
+      <w:r>
+        <w:t xml:space="preserve">No billing account needed. No credit card. No expiry.</w:t>
+      </w:r>
+    </w:p>
+    <w:bookmarkEnd w:id="46"/>
+    <w:bookmarkStart w:id="47" w:name="verdict"/>
+    <w:p>
+      <w:pPr>
+        <w:pStyle w:val="Heading4"/>
+      </w:pPr>
+      <w:r>
+        <w:t xml:space="preserve">Verdict</w:t>
+      </w:r>
+    </w:p>
+    <w:p>
+      <w:pPr>
+        <w:pStyle w:val="FirstParagraph"/>
+      </w:pPr>
+      <w:r>
+        <w:rPr>
+          <w:bCs/>
+          <w:b/>
+        </w:rPr>
+        <w:t xml:space="preserve">Best</w:t>
+      </w:r>
+      <w:r>
+        <w:rPr>
+          <w:bCs/>
+          <w:b/>
+        </w:rPr>
+        <w:t xml:space="preserve"> </w:t>
+      </w:r>
+      <w:r>
+        <w:rPr>
+          <w:bCs/>
+          <w:b/>
+        </w:rPr>
+        <w:t xml:space="preserve">“</w:t>
+      </w:r>
+      <w:r>
+        <w:rPr>
+          <w:bCs/>
+          <w:b/>
+        </w:rPr>
+        <w:t xml:space="preserve">set and forget</w:t>
+      </w:r>
+      <w:r>
+        <w:rPr>
+          <w:bCs/>
+          <w:b/>
+        </w:rPr>
+        <w:t xml:space="preserve">”</w:t>
+      </w:r>
+      <w:r>
+        <w:rPr>
+          <w:bCs/>
+          <w:b/>
+        </w:rPr>
+        <w:t xml:space="preserve"> </w:t>
+      </w:r>
+      <w:r>
+        <w:rPr>
+          <w:bCs/>
+          <w:b/>
+        </w:rPr>
+        <w:t xml:space="preserve">option</w:t>
+      </w:r>
+      <w:r>
+        <w:t xml:space="preserve"> </w:t>
+      </w:r>
+      <w:r>
+        <w:t xml:space="preserve">— $0/month, no billing surprises, no infrastructure to maintain. The only real consideration is whether you’re comfortable sending family/medical form data through Google’s free tier (which may be used for model training). If privacy is a concern, pair it with your local vLLM as primary and use Google AI Studio only as a fallback for non-sensitive forms, or use the paid tier ($0 for your volume anyway — paid tier just adds data privacy guarantee).</w:t>
+      </w:r>
+    </w:p>
+    <w:p>
+      <w:r>
+        <w:pict>
+          <v:rect style="width:0;height:1.5pt" o:hralign="center" o:hrstd="t" o:hr="t"/>
+        </w:pict>
+      </w:r>
+    </w:p>
+    <w:bookmarkEnd w:id="47"/>
+    <w:bookmarkEnd w:id="48"/>
+    <w:bookmarkStart w:id="56" w:name="X323ab623c5b3da3648de06e2bd309decbdc327a"/>
+    <w:p>
+      <w:pPr>
+        <w:pStyle w:val="Heading3"/>
+      </w:pPr>
+      <w:r>
+        <w:t xml:space="preserve">Option C: Self-Hosted LLM via vLLM (your dedicated LLM machine)</w:t>
+      </w:r>
+    </w:p>
+    <w:p>
+      <w:pPr>
+        <w:pStyle w:val="FirstParagraph"/>
+      </w:pPr>
+      <w:r>
+        <w:t xml:space="preserve">You already have a dedicated machine running</w:t>
+      </w:r>
+      <w:r>
+        <w:t xml:space="preserve"> </w:t>
+      </w:r>
+      <w:r>
+        <w:rPr>
+          <w:bCs/>
+          <w:b/>
+        </w:rPr>
         <w:t xml:space="preserve">vLLM</w:t>
       </w:r>
       <w:r>
@@ -7176,7 +8699,7 @@
         <w:t xml:space="preserve">with an OpenAI-compatible API. This is the primary LLM provider — zero API costs, zero external dependencies, already operational.</w:t>
       </w:r>
     </w:p>
-    <w:bookmarkStart w:id="41" w:name="recommended-models"/>
+    <w:bookmarkStart w:id="49" w:name="recommended-models"/>
     <w:p>
       <w:pPr>
         <w:pStyle w:val="Heading4"/>
@@ -7830,8 +9353,8 @@
         </w:tc>
       </w:tr>
     </w:tbl>
-    <w:bookmarkEnd w:id="41"/>
-    <w:bookmarkStart w:id="42" w:name="model-selection-guide"/>
+    <w:bookmarkEnd w:id="49"/>
+    <w:bookmarkStart w:id="50" w:name="model-selection-guide"/>
     <w:p>
       <w:pPr>
         <w:pStyle w:val="Heading4"/>
@@ -8238,8 +9761,8 @@
         <w:t xml:space="preserve">for superior document analysis.</w:t>
       </w:r>
     </w:p>
-    <w:bookmarkEnd w:id="42"/>
-    <w:bookmarkStart w:id="43" w:name="vllm-setup-already-running"/>
+    <w:bookmarkEnd w:id="50"/>
+    <w:bookmarkStart w:id="51" w:name="vllm-setup-already-running"/>
     <w:p>
       <w:pPr>
         <w:pStyle w:val="Heading4"/>
@@ -8618,8 +10141,8 @@
         <w:t xml:space="preserve">  }'</w:t>
       </w:r>
     </w:p>
-    <w:bookmarkEnd w:id="43"/>
-    <w:bookmarkStart w:id="44" w:name="exposing-vllm-to-cloudflare-worker"/>
+    <w:bookmarkEnd w:id="51"/>
+    <w:bookmarkStart w:id="52" w:name="exposing-vllm-to-cloudflare-worker"/>
     <w:p>
       <w:pPr>
         <w:pStyle w:val="Heading4"/>
@@ -8920,8 +10443,8 @@
         <w:t xml:space="preserve">This works if the LXC can reach the LLM machine on your LAN.</w:t>
       </w:r>
     </w:p>
-    <w:bookmarkEnd w:id="44"/>
-    <w:bookmarkStart w:id="45" w:name="integration-from-cloudflare-worker"/>
+    <w:bookmarkEnd w:id="52"/>
+    <w:bookmarkStart w:id="53" w:name="integration-from-cloudflare-worker-1"/>
     <w:p>
       <w:pPr>
         <w:pStyle w:val="Heading4"/>
@@ -9592,8 +11115,8 @@
         <w:t xml:space="preserve">;</w:t>
       </w:r>
     </w:p>
-    <w:bookmarkEnd w:id="45"/>
-    <w:bookmarkStart w:id="46" w:name="risks-of-self-hosted-llm"/>
+    <w:bookmarkEnd w:id="53"/>
+    <w:bookmarkStart w:id="54" w:name="risks-of-self-hosted-llm"/>
     <w:p>
       <w:pPr>
         <w:pStyle w:val="Heading4"/>
@@ -9854,8 +11377,8 @@
         </w:tc>
       </w:tr>
     </w:tbl>
-    <w:bookmarkEnd w:id="46"/>
-    <w:bookmarkStart w:id="47" w:name="Xdacfcc801a6db80e22003754ec0de70459d06b7"/>
+    <w:bookmarkEnd w:id="54"/>
+    <w:bookmarkStart w:id="55" w:name="Xdacfcc801a6db80e22003754ec0de70459d06b7"/>
     <w:p>
       <w:pPr>
         <w:pStyle w:val="Heading4"/>
@@ -9961,6 +11484,30 @@
         <w:rPr>
           <w:rStyle w:val="StringTok"/>
         </w:rPr>
+        <w:t xml:space="preserve">'google'</w:t>
+      </w:r>
+      <w:r>
+        <w:rPr>
+          <w:rStyle w:val="NormalTok"/>
+        </w:rPr>
+        <w:t xml:space="preserve"> </w:t>
+      </w:r>
+      <w:r>
+        <w:rPr>
+          <w:rStyle w:val="OperatorTok"/>
+        </w:rPr>
+        <w:t xml:space="preserve">|</w:t>
+      </w:r>
+      <w:r>
+        <w:rPr>
+          <w:rStyle w:val="NormalTok"/>
+        </w:rPr>
+        <w:t xml:space="preserve"> </w:t>
+      </w:r>
+      <w:r>
+        <w:rPr>
+          <w:rStyle w:val="StringTok"/>
+        </w:rPr>
         <w:t xml:space="preserve">'selfhosted'</w:t>
       </w:r>
       <w:r>
@@ -10964,6 +12511,228 @@
           <w:rStyle w:val="StringTok"/>
         </w:rPr>
         <w:t xml:space="preserve">'grok-2-vision-1212'</w:t>
+      </w:r>
+      <w:r>
+        <w:br/>
+      </w:r>
+      <w:r>
+        <w:rPr>
+          <w:rStyle w:val="NormalTok"/>
+        </w:rPr>
+        <w:t xml:space="preserve">      }</w:t>
+      </w:r>
+      <w:r>
+        <w:rPr>
+          <w:rStyle w:val="OperatorTok"/>
+        </w:rPr>
+        <w:t xml:space="preserve">;</w:t>
+      </w:r>
+      <w:r>
+        <w:br/>
+      </w:r>
+      <w:r>
+        <w:rPr>
+          <w:rStyle w:val="NormalTok"/>
+        </w:rPr>
+        <w:t xml:space="preserve">    </w:t>
+      </w:r>
+      <w:r>
+        <w:rPr>
+          <w:rStyle w:val="ControlFlowTok"/>
+        </w:rPr>
+        <w:t xml:space="preserve">case</w:t>
+      </w:r>
+      <w:r>
+        <w:rPr>
+          <w:rStyle w:val="NormalTok"/>
+        </w:rPr>
+        <w:t xml:space="preserve"> </w:t>
+      </w:r>
+      <w:r>
+        <w:rPr>
+          <w:rStyle w:val="StringTok"/>
+        </w:rPr>
+        <w:t xml:space="preserve">'google'</w:t>
+      </w:r>
+      <w:r>
+        <w:rPr>
+          <w:rStyle w:val="OperatorTok"/>
+        </w:rPr>
+        <w:t xml:space="preserve">:</w:t>
+      </w:r>
+      <w:r>
+        <w:br/>
+      </w:r>
+      <w:r>
+        <w:rPr>
+          <w:rStyle w:val="NormalTok"/>
+        </w:rPr>
+        <w:t xml:space="preserve">      </w:t>
+      </w:r>
+      <w:r>
+        <w:rPr>
+          <w:rStyle w:val="ControlFlowTok"/>
+        </w:rPr>
+        <w:t xml:space="preserve">return</w:t>
+      </w:r>
+      <w:r>
+        <w:rPr>
+          <w:rStyle w:val="NormalTok"/>
+        </w:rPr>
+        <w:t xml:space="preserve"> {</w:t>
+      </w:r>
+      <w:r>
+        <w:br/>
+      </w:r>
+      <w:r>
+        <w:rPr>
+          <w:rStyle w:val="NormalTok"/>
+        </w:rPr>
+        <w:t xml:space="preserve">        url</w:t>
+      </w:r>
+      <w:r>
+        <w:rPr>
+          <w:rStyle w:val="OperatorTok"/>
+        </w:rPr>
+        <w:t xml:space="preserve">:</w:t>
+      </w:r>
+      <w:r>
+        <w:rPr>
+          <w:rStyle w:val="NormalTok"/>
+        </w:rPr>
+        <w:t xml:space="preserve"> </w:t>
+      </w:r>
+      <w:r>
+        <w:rPr>
+          <w:rStyle w:val="StringTok"/>
+        </w:rPr>
+        <w:t xml:space="preserve">'https://generativelanguage.googleapis.com/v1beta/openai/chat/completions'</w:t>
+      </w:r>
+      <w:r>
+        <w:rPr>
+          <w:rStyle w:val="OperatorTok"/>
+        </w:rPr>
+        <w:t xml:space="preserve">,</w:t>
+      </w:r>
+      <w:r>
+        <w:br/>
+      </w:r>
+      <w:r>
+        <w:rPr>
+          <w:rStyle w:val="NormalTok"/>
+        </w:rPr>
+        <w:t xml:space="preserve">        headers</w:t>
+      </w:r>
+      <w:r>
+        <w:rPr>
+          <w:rStyle w:val="OperatorTok"/>
+        </w:rPr>
+        <w:t xml:space="preserve">:</w:t>
+      </w:r>
+      <w:r>
+        <w:rPr>
+          <w:rStyle w:val="NormalTok"/>
+        </w:rPr>
+        <w:t xml:space="preserve"> { </w:t>
+      </w:r>
+      <w:r>
+        <w:rPr>
+          <w:rStyle w:val="StringTok"/>
+        </w:rPr>
+        <w:t xml:space="preserve">'Authorization'</w:t>
+      </w:r>
+      <w:r>
+        <w:rPr>
+          <w:rStyle w:val="OperatorTok"/>
+        </w:rPr>
+        <w:t xml:space="preserve">:</w:t>
+      </w:r>
+      <w:r>
+        <w:rPr>
+          <w:rStyle w:val="NormalTok"/>
+        </w:rPr>
+        <w:t xml:space="preserve"> </w:t>
+      </w:r>
+      <w:r>
+        <w:rPr>
+          <w:rStyle w:val="VerbatimStringTok"/>
+        </w:rPr>
+        <w:t xml:space="preserve">`Bearer </w:t>
+      </w:r>
+      <w:r>
+        <w:rPr>
+          <w:rStyle w:val="SpecialCharTok"/>
+        </w:rPr>
+        <w:t xml:space="preserve">${</w:t>
+      </w:r>
+      <w:r>
+        <w:rPr>
+          <w:rStyle w:val="NormalTok"/>
+        </w:rPr>
+        <w:t xml:space="preserve">env</w:t>
+      </w:r>
+      <w:r>
+        <w:rPr>
+          <w:rStyle w:val="OperatorTok"/>
+        </w:rPr>
+        <w:t xml:space="preserve">.</w:t>
+      </w:r>
+      <w:r>
+        <w:rPr>
+          <w:rStyle w:val="AttributeTok"/>
+        </w:rPr>
+        <w:t xml:space="preserve">LLM_API_KEY</w:t>
+      </w:r>
+      <w:r>
+        <w:rPr>
+          <w:rStyle w:val="SpecialCharTok"/>
+        </w:rPr>
+        <w:t xml:space="preserve">}</w:t>
+      </w:r>
+      <w:r>
+        <w:rPr>
+          <w:rStyle w:val="VerbatimStringTok"/>
+        </w:rPr>
+        <w:t xml:space="preserve">`</w:t>
+      </w:r>
+      <w:r>
+        <w:rPr>
+          <w:rStyle w:val="NormalTok"/>
+        </w:rPr>
+        <w:t xml:space="preserve"> }</w:t>
+      </w:r>
+      <w:r>
+        <w:rPr>
+          <w:rStyle w:val="OperatorTok"/>
+        </w:rPr>
+        <w:t xml:space="preserve">,</w:t>
+      </w:r>
+      <w:r>
+        <w:br/>
+      </w:r>
+      <w:r>
+        <w:rPr>
+          <w:rStyle w:val="NormalTok"/>
+        </w:rPr>
+        <w:t xml:space="preserve">        model</w:t>
+      </w:r>
+      <w:r>
+        <w:rPr>
+          <w:rStyle w:val="OperatorTok"/>
+        </w:rPr>
+        <w:t xml:space="preserve">:</w:t>
+      </w:r>
+      <w:r>
+        <w:rPr>
+          <w:rStyle w:val="NormalTok"/>
+        </w:rPr>
+        <w:t xml:space="preserve"> </w:t>
+      </w:r>
+      <w:r>
+        <w:rPr>
+          <w:rStyle w:val="StringTok"/>
+        </w:rPr>
+        <w:t xml:space="preserve">'gemini-2.5-flash'</w:t>
       </w:r>
       <w:r>
         <w:br/>
@@ -12944,13 +14713,25 @@
         <w:rPr>
           <w:rStyle w:val="VerbatimChar"/>
         </w:rPr>
-        <w:t xml:space="preserve">LLM_FALLBACK_PROVIDER = "chatllm"</w:t>
+        <w:t xml:space="preserve">LLM_FALLBACK_PROVIDER = "google"</w:t>
       </w:r>
       <w:r>
         <w:t xml:space="preserve"> </w:t>
       </w:r>
       <w:r>
         <w:t xml:space="preserve">— cloud fallback (or</w:t>
+      </w:r>
+      <w:r>
+        <w:t xml:space="preserve"> </w:t>
+      </w:r>
+      <w:r>
+        <w:rPr>
+          <w:rStyle w:val="VerbatimChar"/>
+        </w:rPr>
+        <w:t xml:space="preserve">"chatllm"</w:t>
+      </w:r>
+      <w:r>
+        <w:t xml:space="preserve">,</w:t>
       </w:r>
       <w:r>
         <w:t xml:space="preserve"> </w:t>
@@ -12972,10 +14753,10 @@
         </w:pict>
       </w:r>
     </w:p>
-    <w:bookmarkEnd w:id="47"/>
-    <w:bookmarkEnd w:id="48"/>
-    <w:bookmarkEnd w:id="49"/>
-    <w:bookmarkStart w:id="59" w:name="X086a19020c15815322e4f50d15197bdc1b1ed10"/>
+    <w:bookmarkEnd w:id="55"/>
+    <w:bookmarkEnd w:id="56"/>
+    <w:bookmarkEnd w:id="57"/>
+    <w:bookmarkStart w:id="67" w:name="X086a19020c15815322e4f50d15197bdc1b1ed10"/>
     <w:p>
       <w:pPr>
         <w:pStyle w:val="Heading2"/>
@@ -13079,7 +14860,7 @@
         <w:t xml:space="preserve">But you have a home server — so we self-host.</w:t>
       </w:r>
     </w:p>
-    <w:bookmarkStart w:id="55" w:name="a.-home-vm-python-api-recommended"/>
+    <w:bookmarkStart w:id="63" w:name="a.-home-vm-python-api-recommended"/>
     <w:p>
       <w:pPr>
         <w:pStyle w:val="Heading3"/>
@@ -13112,7 +14893,7 @@
         <w:t xml:space="preserve">at home.</w:t>
       </w:r>
     </w:p>
-    <w:bookmarkStart w:id="50" w:name="lxc-container-requirements"/>
+    <w:bookmarkStart w:id="58" w:name="lxc-container-requirements"/>
     <w:p>
       <w:pPr>
         <w:pStyle w:val="Heading4"/>
@@ -13506,8 +15287,8 @@
         <w:t xml:space="preserve">in Options (needed for systemd services inside LXC).</w:t>
       </w:r>
     </w:p>
-    <w:bookmarkEnd w:id="50"/>
-    <w:bookmarkStart w:id="51" w:name="setup-steps-1"/>
+    <w:bookmarkEnd w:id="58"/>
+    <w:bookmarkStart w:id="59" w:name="setup-steps-1"/>
     <w:p>
       <w:pPr>
         <w:pStyle w:val="Heading4"/>
@@ -13986,8 +15767,8 @@
         <w:t xml:space="preserve"> form-claw-pdf</w:t>
       </w:r>
     </w:p>
-    <w:bookmarkEnd w:id="51"/>
-    <w:bookmarkStart w:id="52" w:name="fastapi-application-skeleton"/>
+    <w:bookmarkEnd w:id="59"/>
+    <w:bookmarkStart w:id="60" w:name="fastapi-application-skeleton"/>
     <w:p>
       <w:pPr>
         <w:pStyle w:val="Heading4"/>
@@ -14865,8 +16646,8 @@
         <w:t xml:space="preserve">}</w:t>
       </w:r>
     </w:p>
-    <w:bookmarkEnd w:id="52"/>
-    <w:bookmarkStart w:id="53" w:name="exposing-the-vm-to-the-internet"/>
+    <w:bookmarkEnd w:id="60"/>
+    <w:bookmarkStart w:id="61" w:name="exposing-the-vm-to-the-internet"/>
     <w:p>
       <w:pPr>
         <w:pStyle w:val="Heading4"/>
@@ -15278,8 +17059,8 @@
         <w:t xml:space="preserve">: Use Cloudflare Tunnel — it’s free, secure, and integrates with your existing Cloudflare setup.</w:t>
       </w:r>
     </w:p>
-    <w:bookmarkEnd w:id="53"/>
-    <w:bookmarkStart w:id="54" w:name="auto-update-from-github"/>
+    <w:bookmarkEnd w:id="61"/>
+    <w:bookmarkStart w:id="62" w:name="auto-update-from-github"/>
     <w:p>
       <w:pPr>
         <w:pStyle w:val="Heading4"/>
@@ -15566,9 +17347,9 @@
         <w:t xml:space="preserve">Or use a GitHub Actions deploy step that SSHs into the VM (see Section 7).</w:t>
       </w:r>
     </w:p>
-    <w:bookmarkEnd w:id="54"/>
-    <w:bookmarkEnd w:id="55"/>
-    <w:bookmarkStart w:id="57" w:name="X6b3e16fc0c80f1f7087bdfd3bc7c5960e88bfba"/>
+    <w:bookmarkEnd w:id="62"/>
+    <w:bookmarkEnd w:id="63"/>
+    <w:bookmarkStart w:id="65" w:name="X6b3e16fc0c80f1f7087bdfd3bc7c5960e88bfba"/>
     <w:p>
       <w:pPr>
         <w:pStyle w:val="Heading3"/>
@@ -15587,7 +17368,7 @@
       <w:r>
         <w:t xml:space="preserve"> </w:t>
       </w:r>
-      <w:hyperlink r:id="rId56">
+      <w:hyperlink r:id="rId64">
         <w:r>
           <w:rPr>
             <w:rStyle w:val="Hyperlink"/>
@@ -15650,8 +17431,8 @@
         <w:t xml:space="preserve">: Not suitable for the current form complexity.</w:t>
       </w:r>
     </w:p>
-    <w:bookmarkEnd w:id="57"/>
-    <w:bookmarkStart w:id="58" w:name="Xa9fc417534aa8b657a3b0649b4f60ffab02f4e1"/>
+    <w:bookmarkEnd w:id="65"/>
+    <w:bookmarkStart w:id="66" w:name="Xa9fc417534aa8b657a3b0649b4f60ffab02f4e1"/>
     <w:p>
       <w:pPr>
         <w:pStyle w:val="Heading3"/>
@@ -15675,9 +17456,9 @@
         </w:pict>
       </w:r>
     </w:p>
-    <w:bookmarkEnd w:id="58"/>
-    <w:bookmarkEnd w:id="59"/>
-    <w:bookmarkStart w:id="62" w:name="storage-split-strategy"/>
+    <w:bookmarkEnd w:id="66"/>
+    <w:bookmarkEnd w:id="67"/>
+    <w:bookmarkStart w:id="70" w:name="storage-split-strategy"/>
     <w:p>
       <w:pPr>
         <w:pStyle w:val="Heading2"/>
@@ -15686,7 +17467,7 @@
         <w:t xml:space="preserve">6. Storage: Split Strategy</w:t>
       </w:r>
     </w:p>
-    <w:bookmarkStart w:id="60" w:name="X81676f818ef8e314a273c8e377787280a06f62b"/>
+    <w:bookmarkStart w:id="68" w:name="X81676f818ef8e314a273c8e377787280a06f62b"/>
     <w:p>
       <w:pPr>
         <w:pStyle w:val="Heading3"/>
@@ -15888,8 +17669,8 @@
         </w:tc>
       </w:tr>
     </w:tbl>
-    <w:bookmarkEnd w:id="60"/>
-    <w:bookmarkStart w:id="61" w:name="X59c634f1c2b534bc65432344c07aa94daf34558"/>
+    <w:bookmarkEnd w:id="68"/>
+    <w:bookmarkStart w:id="69" w:name="X59c634f1c2b534bc65432344c07aa94daf34558"/>
     <w:p>
       <w:pPr>
         <w:pStyle w:val="Heading3"/>
@@ -15997,9 +17778,9 @@
         </w:pict>
       </w:r>
     </w:p>
-    <w:bookmarkEnd w:id="61"/>
-    <w:bookmarkEnd w:id="62"/>
-    <w:bookmarkStart w:id="69" w:name="github-integration-cicd"/>
+    <w:bookmarkEnd w:id="69"/>
+    <w:bookmarkEnd w:id="70"/>
+    <w:bookmarkStart w:id="77" w:name="github-integration-cicd"/>
     <w:p>
       <w:pPr>
         <w:pStyle w:val="Heading2"/>
@@ -16041,7 +17822,7 @@
         <w:t xml:space="preserve">).</w:t>
       </w:r>
     </w:p>
-    <w:bookmarkStart w:id="63" w:name="repository-structure-proposed-additions"/>
+    <w:bookmarkStart w:id="71" w:name="repository-structure-proposed-additions"/>
     <w:p>
       <w:pPr>
         <w:pStyle w:val="Heading3"/>
@@ -16322,8 +18103,8 @@
         <w:t xml:space="preserve">└── nextjs_space/               # existing dashboard (stays on Abacus)</w:t>
       </w:r>
     </w:p>
-    <w:bookmarkEnd w:id="63"/>
-    <w:bookmarkStart w:id="64" w:name="cloudflare-wrangler-configuration"/>
+    <w:bookmarkEnd w:id="71"/>
+    <w:bookmarkStart w:id="72" w:name="cloudflare-wrangler-configuration"/>
     <w:p>
       <w:pPr>
         <w:pStyle w:val="Heading3"/>
@@ -16946,8 +18727,8 @@
         <w:t xml:space="preserve">"k6622024@gmail.com,2396119@gmail.com"</w:t>
       </w:r>
     </w:p>
-    <w:bookmarkEnd w:id="64"/>
-    <w:bookmarkStart w:id="65" w:name="X884cc8cf31ae3daa5616830da9c90df193e1217"/>
+    <w:bookmarkEnd w:id="72"/>
+    <w:bookmarkStart w:id="73" w:name="X884cc8cf31ae3daa5616830da9c90df193e1217"/>
     <w:p>
       <w:pPr>
         <w:pStyle w:val="Heading3"/>
@@ -17097,7 +18878,7 @@
               <w:jc w:val="left"/>
             </w:pPr>
             <w:r>
-              <w:t xml:space="preserve">See Option A or B below</w:t>
+              <w:t xml:space="preserve">See Option A, B, or D</w:t>
             </w:r>
           </w:p>
         </w:tc>
@@ -17197,8 +18978,8 @@
         </w:tc>
       </w:tr>
     </w:tbl>
-    <w:bookmarkEnd w:id="65"/>
-    <w:bookmarkStart w:id="66" w:name="Xef9e88a4f0cb9c5bcd2527b0117922b44b709ba"/>
+    <w:bookmarkEnd w:id="73"/>
+    <w:bookmarkStart w:id="74" w:name="Xef9e88a4f0cb9c5bcd2527b0117922b44b709ba"/>
     <w:p>
       <w:pPr>
         <w:pStyle w:val="Heading3"/>
@@ -17364,7 +19145,7 @@
               <w:t xml:space="preserve">chatllm</w:t>
             </w:r>
             <w:r>
-              <w:t xml:space="preserve">, or</w:t>
+              <w:t xml:space="preserve">,</w:t>
             </w:r>
             <w:r>
               <w:t xml:space="preserve"> </w:t>
@@ -17375,6 +19156,18 @@
               </w:rPr>
               <w:t xml:space="preserve">grok</w:t>
             </w:r>
+            <w:r>
+              <w:t xml:space="preserve">, or</w:t>
+            </w:r>
+            <w:r>
+              <w:t xml:space="preserve"> </w:t>
+            </w:r>
+            <w:r>
+              <w:rPr>
+                <w:rStyle w:val="VerbatimChar"/>
+              </w:rPr>
+              <w:t xml:space="preserve">google</w:t>
+            </w:r>
           </w:p>
         </w:tc>
       </w:tr>
@@ -17537,8 +19330,8 @@
         </w:tc>
       </w:tr>
     </w:tbl>
-    <w:bookmarkEnd w:id="66"/>
-    <w:bookmarkStart w:id="67" w:name="cicd-via-github-actions"/>
+    <w:bookmarkEnd w:id="74"/>
+    <w:bookmarkStart w:id="75" w:name="cicd-via-github-actions"/>
     <w:p>
       <w:pPr>
         <w:pStyle w:val="Heading3"/>
@@ -18473,8 +20266,8 @@
         <w:t xml:space="preserve">            echo "Deployed at $(date)"</w:t>
       </w:r>
     </w:p>
-    <w:bookmarkEnd w:id="67"/>
-    <w:bookmarkStart w:id="68" w:name="github-secrets-required"/>
+    <w:bookmarkEnd w:id="75"/>
+    <w:bookmarkStart w:id="76" w:name="github-secrets-required"/>
     <w:p>
       <w:pPr>
         <w:pStyle w:val="Heading3"/>
@@ -18588,9 +20381,9 @@
         </w:pict>
       </w:r>
     </w:p>
-    <w:bookmarkEnd w:id="68"/>
-    <w:bookmarkEnd w:id="69"/>
-    <w:bookmarkStart w:id="73" w:name="cost-estimate-2-formsday"/>
+    <w:bookmarkEnd w:id="76"/>
+    <w:bookmarkEnd w:id="77"/>
+    <w:bookmarkStart w:id="81" w:name="cost-estimate-2-formsday"/>
     <w:p>
       <w:pPr>
         <w:pStyle w:val="Heading2"/>
@@ -18599,7 +20392,7 @@
         <w:t xml:space="preserve">8. Cost Estimate — 2 forms/day</w:t>
       </w:r>
     </w:p>
-    <w:bookmarkStart w:id="70" w:name="per-form-processing-breakdown"/>
+    <w:bookmarkStart w:id="78" w:name="per-form-processing-breakdown"/>
     <w:p>
       <w:pPr>
         <w:pStyle w:val="Heading3"/>
@@ -18734,8 +20527,8 @@
         <w:t xml:space="preserve">Estimated tokens per form: ~5,000 input + ~3,500 output (single page form)</w:t>
       </w:r>
     </w:p>
-    <w:bookmarkEnd w:id="70"/>
-    <w:bookmarkStart w:id="71" w:name="monthly-cost-at-2-formsday-60-formsmonth"/>
+    <w:bookmarkEnd w:id="78"/>
+    <w:bookmarkStart w:id="79" w:name="monthly-cost-at-2-formsday-60-formsmonth"/>
     <w:p>
       <w:pPr>
         <w:pStyle w:val="Heading3"/>
@@ -18751,10 +20544,11 @@
         <w:tblLook w:firstRow="1" w:lastRow="0" w:firstColumn="0" w:lastColumn="0" w:noHBand="0" w:noVBand="0" w:val="0020"/>
       </w:tblPr>
       <w:tblGrid>
-        <w:gridCol w:w="1102"/>
-        <w:gridCol w:w="1904"/>
-        <w:gridCol w:w="2205"/>
-        <w:gridCol w:w="2706"/>
+        <w:gridCol w:w="814"/>
+        <w:gridCol w:w="1406"/>
+        <w:gridCol w:w="1628"/>
+        <w:gridCol w:w="1998"/>
+        <w:gridCol w:w="2072"/>
       </w:tblGrid>
       <w:tr>
         <w:trPr>
@@ -18804,7 +20598,19 @@
               <w:jc w:val="left"/>
             </w:pPr>
             <w:r>
-              <w:t xml:space="preserve">Option C: Self-Hosted LLM</w:t>
+              <w:t xml:space="preserve">Option C: Self-Hosted vLLM</w:t>
+            </w:r>
+          </w:p>
+        </w:tc>
+        <w:tc>
+          <w:tcPr/>
+          <w:p>
+            <w:pPr>
+              <w:pStyle w:val="Compact"/>
+              <w:jc w:val="left"/>
+            </w:pPr>
+            <w:r>
+              <w:t xml:space="preserve">Option D: Google AI Studio</w:t>
             </w:r>
           </w:p>
         </w:tc>
@@ -18862,6 +20668,22 @@
             </w:r>
           </w:p>
         </w:tc>
+        <w:tc>
+          <w:tcPr/>
+          <w:p>
+            <w:pPr>
+              <w:pStyle w:val="Compact"/>
+              <w:jc w:val="left"/>
+            </w:pPr>
+            <w:r>
+              <w:rPr>
+                <w:bCs/>
+                <w:b/>
+              </w:rPr>
+              <w:t xml:space="preserve">$0 (free tier)</w:t>
+            </w:r>
+          </w:p>
+        </w:tc>
       </w:tr>
       <w:tr>
         <w:tc>
@@ -18916,6 +20738,18 @@
             </w:r>
           </w:p>
         </w:tc>
+        <w:tc>
+          <w:tcPr/>
+          <w:p>
+            <w:pPr>
+              <w:pStyle w:val="Compact"/>
+              <w:jc w:val="left"/>
+            </w:pPr>
+            <w:r>
+              <w:t xml:space="preserve">Free tier</w:t>
+            </w:r>
+          </w:p>
+        </w:tc>
       </w:tr>
       <w:tr>
         <w:tc>
@@ -18970,6 +20804,18 @@
             </w:r>
           </w:p>
         </w:tc>
+        <w:tc>
+          <w:tcPr/>
+          <w:p>
+            <w:pPr>
+              <w:pStyle w:val="Compact"/>
+              <w:jc w:val="left"/>
+            </w:pPr>
+            <w:r>
+              <w:t xml:space="preserve">Free tier</w:t>
+            </w:r>
+          </w:p>
+        </w:tc>
       </w:tr>
       <w:tr>
         <w:tc>
@@ -19024,6 +20870,18 @@
             </w:r>
           </w:p>
         </w:tc>
+        <w:tc>
+          <w:tcPr/>
+          <w:p>
+            <w:pPr>
+              <w:pStyle w:val="Compact"/>
+              <w:jc w:val="left"/>
+            </w:pPr>
+            <w:r>
+              <w:t xml:space="preserve">Free tier</w:t>
+            </w:r>
+          </w:p>
+        </w:tc>
       </w:tr>
       <w:tr>
         <w:tc>
@@ -19078,6 +20936,18 @@
             </w:r>
           </w:p>
         </w:tc>
+        <w:tc>
+          <w:tcPr/>
+          <w:p>
+            <w:pPr>
+              <w:pStyle w:val="Compact"/>
+              <w:jc w:val="left"/>
+            </w:pPr>
+            <w:r>
+              <w:t xml:space="preserve">Free</w:t>
+            </w:r>
+          </w:p>
+        </w:tc>
       </w:tr>
       <w:tr>
         <w:tc>
@@ -19132,6 +21002,18 @@
             </w:r>
           </w:p>
         </w:tc>
+        <w:tc>
+          <w:tcPr/>
+          <w:p>
+            <w:pPr>
+              <w:pStyle w:val="Compact"/>
+              <w:jc w:val="left"/>
+            </w:pPr>
+            <w:r>
+              <w:t xml:space="preserve">Free tier</w:t>
+            </w:r>
+          </w:p>
+        </w:tc>
       </w:tr>
       <w:tr>
         <w:tc>
@@ -19186,6 +21068,18 @@
             </w:r>
           </w:p>
         </w:tc>
+        <w:tc>
+          <w:tcPr/>
+          <w:p>
+            <w:pPr>
+              <w:pStyle w:val="Compact"/>
+              <w:jc w:val="left"/>
+            </w:pPr>
+            <w:r>
+              <w:t xml:space="preserve">$0 (your HW)</w:t>
+            </w:r>
+          </w:p>
+        </w:tc>
       </w:tr>
       <w:tr>
         <w:tc>
@@ -19200,7 +21094,7 @@
                 <w:bCs/>
                 <w:b/>
               </w:rPr>
-              <w:t xml:space="preserve">Home VM (Ollama + GPU)</w:t>
+              <w:t xml:space="preserve">Home LLM machine</w:t>
             </w:r>
           </w:p>
         </w:tc>
@@ -19237,6 +21131,18 @@
             </w:pPr>
             <w:r>
               <w:t xml:space="preserve">~$3-8/mo electricity</w:t>
+            </w:r>
+          </w:p>
+        </w:tc>
+        <w:tc>
+          <w:tcPr/>
+          <w:p>
+            <w:pPr>
+              <w:pStyle w:val="Compact"/>
+              <w:jc w:val="left"/>
+            </w:pPr>
+            <w:r>
+              <w:t xml:space="preserve">—</w:t>
             </w:r>
           </w:p>
         </w:tc>
@@ -19294,8 +21200,28 @@
             </w:r>
           </w:p>
         </w:tc>
+        <w:tc>
+          <w:tcPr/>
+          <w:p>
+            <w:pPr>
+              <w:pStyle w:val="Compact"/>
+              <w:jc w:val="left"/>
+            </w:pPr>
+            <w:r>
+              <w:t xml:space="preserve">Free</w:t>
+            </w:r>
+          </w:p>
+        </w:tc>
       </w:tr>
       <w:tr>
+        <w:tc>
+          <w:tcPr/>
+          <w:p>
+            <w:pPr>
+              <w:pStyle w:val="Compact"/>
+            </w:pPr>
+          </w:p>
+        </w:tc>
         <w:tc>
           <w:tcPr/>
           <w:p>
@@ -19396,7 +21322,23 @@
               <w:t xml:space="preserve"> </w:t>
             </w:r>
             <w:r>
-              <w:t xml:space="preserve">(electricity only)</w:t>
+              <w:t xml:space="preserve">(electricity)</w:t>
+            </w:r>
+          </w:p>
+        </w:tc>
+        <w:tc>
+          <w:tcPr/>
+          <w:p>
+            <w:pPr>
+              <w:pStyle w:val="Compact"/>
+              <w:jc w:val="left"/>
+            </w:pPr>
+            <w:r>
+              <w:rPr>
+                <w:bCs/>
+                <w:b/>
+              </w:rPr>
+              <w:t xml:space="preserve">~$0/mo</w:t>
             </w:r>
           </w:p>
         </w:tc>
@@ -19450,14 +21392,26 @@
               <w:jc w:val="left"/>
             </w:pPr>
             <w:r>
-              <w:t xml:space="preserve">$0–$400 (GPU if buying new)</w:t>
+              <w:t xml:space="preserve">$0 (already have HW)</w:t>
+            </w:r>
+          </w:p>
+        </w:tc>
+        <w:tc>
+          <w:tcPr/>
+          <w:p>
+            <w:pPr>
+              <w:pStyle w:val="Compact"/>
+              <w:jc w:val="left"/>
+            </w:pPr>
+            <w:r>
+              <w:t xml:space="preserve">$0</w:t>
             </w:r>
           </w:p>
         </w:tc>
       </w:tr>
     </w:tbl>
-    <w:bookmarkEnd w:id="71"/>
-    <w:bookmarkStart w:id="72" w:name="token-math-for-grok"/>
+    <w:bookmarkEnd w:id="79"/>
+    <w:bookmarkStart w:id="80" w:name="token-math-for-grok"/>
     <w:p>
       <w:pPr>
         <w:pStyle w:val="Heading3"/>
@@ -19538,9 +21492,9 @@
         </w:pict>
       </w:r>
     </w:p>
-    <w:bookmarkEnd w:id="72"/>
-    <w:bookmarkEnd w:id="73"/>
-    <w:bookmarkStart w:id="80" w:name="implementation-phases"/>
+    <w:bookmarkEnd w:id="80"/>
+    <w:bookmarkEnd w:id="81"/>
+    <w:bookmarkStart w:id="88" w:name="implementation-phases"/>
     <w:p>
       <w:pPr>
         <w:pStyle w:val="Heading2"/>
@@ -19549,92 +21503,13 @@
         <w:t xml:space="preserve">9. Implementation Phases</w:t>
       </w:r>
     </w:p>
-    <w:bookmarkStart w:id="74" w:name="phase-1-foundation-1-2-days"/>
+    <w:bookmarkStart w:id="82" w:name="phase-1-foundation-1-2-days"/>
     <w:p>
       <w:pPr>
         <w:pStyle w:val="Heading3"/>
       </w:pPr>
       <w:r>
         <w:t xml:space="preserve">Phase 1: Foundation (1-2 days)</w:t>
-      </w:r>
-    </w:p>
-    <w:p>
-      <w:pPr>
-        <w:numPr>
-          <w:ilvl w:val="0"/>
-          <w:numId w:val="1004"/>
-        </w:numPr>
-        <w:pStyle w:val="Compact"/>
-      </w:pPr>
-      <w:r>
-        <w:t xml:space="preserve">☐ Create Cloudflare D1 database with schema (see Section 3.3)</w:t>
-      </w:r>
-    </w:p>
-    <w:p>
-      <w:pPr>
-        <w:numPr>
-          <w:ilvl w:val="0"/>
-          <w:numId w:val="1004"/>
-        </w:numPr>
-        <w:pStyle w:val="Compact"/>
-      </w:pPr>
-      <w:r>
-        <w:t xml:space="preserve">☐ Create R2 bucket (for optional output PDF backup)</w:t>
-      </w:r>
-    </w:p>
-    <w:p>
-      <w:pPr>
-        <w:numPr>
-          <w:ilvl w:val="0"/>
-          <w:numId w:val="1004"/>
-        </w:numPr>
-        <w:pStyle w:val="Compact"/>
-      </w:pPr>
-      <w:r>
-        <w:t xml:space="preserve">☐ Set up GitHub repo structure (</w:t>
-      </w:r>
-      <w:r>
-        <w:rPr>
-          <w:rStyle w:val="VerbatimChar"/>
-        </w:rPr>
-        <w:t xml:space="preserve">workers/</w:t>
-      </w:r>
-      <w:r>
-        <w:t xml:space="preserve">,</w:t>
-      </w:r>
-      <w:r>
-        <w:t xml:space="preserve"> </w:t>
-      </w:r>
-      <w:r>
-        <w:rPr>
-          <w:rStyle w:val="VerbatimChar"/>
-        </w:rPr>
-        <w:t xml:space="preserve">services/</w:t>
-      </w:r>
-      <w:r>
-        <w:t xml:space="preserve">)</w:t>
-      </w:r>
-    </w:p>
-    <w:p>
-      <w:pPr>
-        <w:numPr>
-          <w:ilvl w:val="0"/>
-          <w:numId w:val="1004"/>
-        </w:numPr>
-        <w:pStyle w:val="Compact"/>
-      </w:pPr>
-      <w:r>
-        <w:t xml:space="preserve">☐ Set up GitHub Actions for Cloudflare + VM deployment</w:t>
-      </w:r>
-    </w:p>
-    <w:bookmarkEnd w:id="74"/>
-    <w:bookmarkStart w:id="75" w:name="phase-2-home-vm-setup-1-2-days"/>
-    <w:p>
-      <w:pPr>
-        <w:pStyle w:val="Heading3"/>
-      </w:pPr>
-      <w:r>
-        <w:t xml:space="preserve">Phase 2: Home VM Setup (1-2 days)</w:t>
       </w:r>
     </w:p>
     <w:p>
@@ -19646,7 +21521,7 @@
         <w:pStyle w:val="Compact"/>
       </w:pPr>
       <w:r>
-        <w:t xml:space="preserve">☐ Provision LXC container on Proxmox (Ubuntu 24.04, 1GB RAM, 5GB disk)</w:t>
+        <w:t xml:space="preserve">☐ Create Cloudflare D1 database with schema (see Section 3.3)</w:t>
       </w:r>
     </w:p>
     <w:p>
@@ -19658,7 +21533,7 @@
         <w:pStyle w:val="Compact"/>
       </w:pPr>
       <w:r>
-        <w:t xml:space="preserve">☐ Install Python 3.12, create venv, install deps (FastAPI, ReportLab, PyPDF2, Pillow)</w:t>
+        <w:t xml:space="preserve">☐ Create R2 bucket (for optional output PDF backup)</w:t>
       </w:r>
     </w:p>
     <w:p>
@@ -19670,22 +21545,16 @@
         <w:pStyle w:val="Compact"/>
       </w:pPr>
       <w:r>
-        <w:t xml:space="preserve">☐ Port</w:t>
-      </w:r>
-      <w:r>
-        <w:t xml:space="preserve"> </w:t>
+        <w:t xml:space="preserve">☐ Set up GitHub repo structure (</w:t>
       </w:r>
       <w:r>
         <w:rPr>
           <w:rStyle w:val="VerbatimChar"/>
         </w:rPr>
-        <w:t xml:space="preserve">fill_fnx_form.py</w:t>
-      </w:r>
-      <w:r>
-        <w:t xml:space="preserve"> </w:t>
-      </w:r>
-      <w:r>
-        <w:t xml:space="preserve">+ skill logic into stateless FastAPI</w:t>
+        <w:t xml:space="preserve">workers/</w:t>
+      </w:r>
+      <w:r>
+        <w:t xml:space="preserve">,</w:t>
       </w:r>
       <w:r>
         <w:t xml:space="preserve"> </w:t>
@@ -19694,13 +21563,10 @@
         <w:rPr>
           <w:rStyle w:val="VerbatimChar"/>
         </w:rPr>
-        <w:t xml:space="preserve">/fill-pdf</w:t>
-      </w:r>
-      <w:r>
-        <w:t xml:space="preserve"> </w:t>
-      </w:r>
-      <w:r>
-        <w:t xml:space="preserve">endpoint</w:t>
+        <w:t xml:space="preserve">services/</w:t>
+      </w:r>
+      <w:r>
+        <w:t xml:space="preserve">)</w:t>
       </w:r>
     </w:p>
     <w:p>
@@ -19712,74 +21578,17 @@
         <w:pStyle w:val="Compact"/>
       </w:pPr>
       <w:r>
-        <w:t xml:space="preserve">☐ Copy assets (signatures, fonts, family_data.json) into</w:t>
-      </w:r>
-      <w:r>
-        <w:t xml:space="preserve"> </w:t>
-      </w:r>
-      <w:r>
-        <w:rPr>
-          <w:rStyle w:val="VerbatimChar"/>
-        </w:rPr>
-        <w:t xml:space="preserve">/opt/form-claw-pdf/assets/</w:t>
+        <w:t xml:space="preserve">☐ Set up GitHub Actions for Cloudflare + VM deployment</w:t>
       </w:r>
     </w:p>
+    <w:bookmarkEnd w:id="82"/>
+    <w:bookmarkStart w:id="83" w:name="phase-2-home-vm-setup-1-2-days"/>
     <w:p>
       <w:pPr>
-        <w:numPr>
-          <w:ilvl w:val="0"/>
-          <w:numId w:val="1005"/>
-        </w:numPr>
-        <w:pStyle w:val="Compact"/>
-      </w:pPr>
-      <w:r>
-        <w:t xml:space="preserve">☐ Set up Cloudflare Tunnel (</w:t>
-      </w:r>
-      <w:r>
-        <w:rPr>
-          <w:rStyle w:val="VerbatimChar"/>
-        </w:rPr>
-        <w:t xml:space="preserve">pdf.savlil.com</w:t>
-      </w:r>
-      <w:r>
-        <w:t xml:space="preserve"> </w:t>
-      </w:r>
-      <w:r>
-        <w:t xml:space="preserve">→ VM:8787)</w:t>
-      </w:r>
-    </w:p>
-    <w:p>
-      <w:pPr>
-        <w:numPr>
-          <w:ilvl w:val="0"/>
-          <w:numId w:val="1005"/>
-        </w:numPr>
-        <w:pStyle w:val="Compact"/>
-      </w:pPr>
-      <w:r>
-        <w:t xml:space="preserve">☐ Set up systemd service for auto-start</w:t>
-      </w:r>
-    </w:p>
-    <w:p>
-      <w:pPr>
-        <w:numPr>
-          <w:ilvl w:val="0"/>
-          <w:numId w:val="1005"/>
-        </w:numPr>
-        <w:pStyle w:val="Compact"/>
-      </w:pPr>
-      <w:r>
-        <w:t xml:space="preserve">☐ Test with known form + fill instructions via curl</w:t>
-      </w:r>
-    </w:p>
-    <w:bookmarkEnd w:id="75"/>
-    <w:bookmarkStart w:id="76" w:name="phase-3-processor-worker-2-3-days"/>
-    <w:p>
-      <w:pPr>
         <w:pStyle w:val="Heading3"/>
       </w:pPr>
       <w:r>
-        <w:t xml:space="preserve">Phase 3: Processor Worker (2-3 days)</w:t>
+        <w:t xml:space="preserve">Phase 2: Home VM Setup (1-2 days)</w:t>
       </w:r>
     </w:p>
     <w:p>
@@ -19791,160 +21600,7 @@
         <w:pStyle w:val="Compact"/>
       </w:pPr>
       <w:r>
-        <w:t xml:space="preserve">☐ Write</w:t>
-      </w:r>
-      <w:r>
-        <w:t xml:space="preserve"> </w:t>
-      </w:r>
-      <w:r>
-        <w:rPr>
-          <w:rStyle w:val="VerbatimChar"/>
-        </w:rPr>
-        <w:t xml:space="preserve">form-claw-processor</w:t>
-      </w:r>
-      <w:r>
-        <w:t xml:space="preserve"> </w:t>
-      </w:r>
-      <w:r>
-        <w:t xml:space="preserve">Worker:</w:t>
-      </w:r>
-    </w:p>
-    <w:p>
-      <w:pPr>
-        <w:numPr>
-          <w:ilvl w:val="1"/>
-          <w:numId w:val="1007"/>
-        </w:numPr>
-        <w:pStyle w:val="Compact"/>
-      </w:pPr>
-      <w:r>
-        <w:t xml:space="preserve">Webhook handler</w:t>
-      </w:r>
-    </w:p>
-    <w:p>
-      <w:pPr>
-        <w:numPr>
-          <w:ilvl w:val="1"/>
-          <w:numId w:val="1007"/>
-        </w:numPr>
-        <w:pStyle w:val="Compact"/>
-      </w:pPr>
-      <w:r>
-        <w:t xml:space="preserve">Security filter (port</w:t>
-      </w:r>
-      <w:r>
-        <w:t xml:space="preserve"> </w:t>
-      </w:r>
-      <w:r>
-        <w:rPr>
-          <w:rStyle w:val="VerbatimChar"/>
-        </w:rPr>
-        <w:t xml:space="preserve">security_filter.py</w:t>
-      </w:r>
-      <w:r>
-        <w:t xml:space="preserve"> </w:t>
-      </w:r>
-      <w:r>
-        <w:t xml:space="preserve">to TypeScript)</w:t>
-      </w:r>
-    </w:p>
-    <w:p>
-      <w:pPr>
-        <w:numPr>
-          <w:ilvl w:val="1"/>
-          <w:numId w:val="1007"/>
-        </w:numPr>
-        <w:pStyle w:val="Compact"/>
-      </w:pPr>
-      <w:r>
-        <w:t xml:space="preserve">LLM client (with provider switch: ChatLLM / Grok)</w:t>
-      </w:r>
-    </w:p>
-    <w:p>
-      <w:pPr>
-        <w:numPr>
-          <w:ilvl w:val="1"/>
-          <w:numId w:val="1007"/>
-        </w:numPr>
-        <w:pStyle w:val="Compact"/>
-      </w:pPr>
-      <w:r>
-        <w:t xml:space="preserve">PDF service client (calls</w:t>
-      </w:r>
-      <w:r>
-        <w:t xml:space="preserve"> </w:t>
-      </w:r>
-      <w:r>
-        <w:rPr>
-          <w:rStyle w:val="VerbatimChar"/>
-        </w:rPr>
-        <w:t xml:space="preserve">https://pdf.savlil.com/fill-pdf</w:t>
-      </w:r>
-      <w:r>
-        <w:t xml:space="preserve">)</w:t>
-      </w:r>
-    </w:p>
-    <w:p>
-      <w:pPr>
-        <w:numPr>
-          <w:ilvl w:val="1"/>
-          <w:numId w:val="1007"/>
-        </w:numPr>
-        <w:pStyle w:val="Compact"/>
-      </w:pPr>
-      <w:r>
-        <w:t xml:space="preserve">Resend client (port</w:t>
-      </w:r>
-      <w:r>
-        <w:t xml:space="preserve"> </w:t>
-      </w:r>
-      <w:r>
-        <w:rPr>
-          <w:rStyle w:val="VerbatimChar"/>
-        </w:rPr>
-        <w:t xml:space="preserve">send_resend_reply.py</w:t>
-      </w:r>
-      <w:r>
-        <w:t xml:space="preserve"> </w:t>
-      </w:r>
-      <w:r>
-        <w:t xml:space="preserve">logic)</w:t>
-      </w:r>
-    </w:p>
-    <w:p>
-      <w:pPr>
-        <w:numPr>
-          <w:ilvl w:val="1"/>
-          <w:numId w:val="1007"/>
-        </w:numPr>
-        <w:pStyle w:val="Compact"/>
-      </w:pPr>
-      <w:r>
-        <w:t xml:space="preserve">D1 logging (</w:t>
-      </w:r>
-      <w:r>
-        <w:rPr>
-          <w:rStyle w:val="VerbatimChar"/>
-        </w:rPr>
-        <w:t xml:space="preserve">env.DB.prepare()</w:t>
-      </w:r>
-      <w:r>
-        <w:t xml:space="preserve"> </w:t>
-      </w:r>
-      <w:r>
-        <w:t xml:space="preserve">statements)</w:t>
-      </w:r>
-    </w:p>
-    <w:p>
-      <w:pPr>
-        <w:numPr>
-          <w:ilvl w:val="1"/>
-          <w:numId w:val="1007"/>
-        </w:numPr>
-        <w:pStyle w:val="Compact"/>
-      </w:pPr>
-      <w:r>
-        <w:t xml:space="preserve">Heartbeat reporting</w:t>
+        <w:t xml:space="preserve">☐ Provision LXC container on Proxmox (Ubuntu 24.04, 1GB RAM, 5GB disk)</w:t>
       </w:r>
     </w:p>
     <w:p>
@@ -19956,77 +21612,242 @@
         <w:pStyle w:val="Compact"/>
       </w:pPr>
       <w:r>
-        <w:t xml:space="preserve">☐ Deploy and wire up email intake Worker</w:t>
-      </w:r>
-    </w:p>
-    <w:bookmarkEnd w:id="76"/>
-    <w:bookmarkStart w:id="77" w:name="phase-4-dashboard-self-hosting-1-2-days"/>
-    <w:p>
-      <w:pPr>
-        <w:pStyle w:val="Heading3"/>
-      </w:pPr>
-      <w:r>
-        <w:t xml:space="preserve">Phase 4: Dashboard Self-Hosting (1-2 days)</w:t>
+        <w:t xml:space="preserve">☐ Install Python 3.12, create venv, install deps (FastAPI, ReportLab, PyPDF2, Pillow)</w:t>
       </w:r>
     </w:p>
     <w:p>
       <w:pPr>
         <w:numPr>
           <w:ilvl w:val="0"/>
+          <w:numId w:val="1006"/>
+        </w:numPr>
+        <w:pStyle w:val="Compact"/>
+      </w:pPr>
+      <w:r>
+        <w:t xml:space="preserve">☐ Port</w:t>
+      </w:r>
+      <w:r>
+        <w:t xml:space="preserve"> </w:t>
+      </w:r>
+      <w:r>
+        <w:rPr>
+          <w:rStyle w:val="VerbatimChar"/>
+        </w:rPr>
+        <w:t xml:space="preserve">fill_fnx_form.py</w:t>
+      </w:r>
+      <w:r>
+        <w:t xml:space="preserve"> </w:t>
+      </w:r>
+      <w:r>
+        <w:t xml:space="preserve">+ skill logic into stateless FastAPI</w:t>
+      </w:r>
+      <w:r>
+        <w:t xml:space="preserve"> </w:t>
+      </w:r>
+      <w:r>
+        <w:rPr>
+          <w:rStyle w:val="VerbatimChar"/>
+        </w:rPr>
+        <w:t xml:space="preserve">/fill-pdf</w:t>
+      </w:r>
+      <w:r>
+        <w:t xml:space="preserve"> </w:t>
+      </w:r>
+      <w:r>
+        <w:t xml:space="preserve">endpoint</w:t>
+      </w:r>
+    </w:p>
+    <w:p>
+      <w:pPr>
+        <w:numPr>
+          <w:ilvl w:val="0"/>
+          <w:numId w:val="1006"/>
+        </w:numPr>
+        <w:pStyle w:val="Compact"/>
+      </w:pPr>
+      <w:r>
+        <w:t xml:space="preserve">☐ Copy assets (signatures, fonts, family_data.json) into</w:t>
+      </w:r>
+      <w:r>
+        <w:t xml:space="preserve"> </w:t>
+      </w:r>
+      <w:r>
+        <w:rPr>
+          <w:rStyle w:val="VerbatimChar"/>
+        </w:rPr>
+        <w:t xml:space="preserve">/opt/form-claw-pdf/assets/</w:t>
+      </w:r>
+    </w:p>
+    <w:p>
+      <w:pPr>
+        <w:numPr>
+          <w:ilvl w:val="0"/>
+          <w:numId w:val="1006"/>
+        </w:numPr>
+        <w:pStyle w:val="Compact"/>
+      </w:pPr>
+      <w:r>
+        <w:t xml:space="preserve">☐ Set up Cloudflare Tunnel (</w:t>
+      </w:r>
+      <w:r>
+        <w:rPr>
+          <w:rStyle w:val="VerbatimChar"/>
+        </w:rPr>
+        <w:t xml:space="preserve">pdf.savlil.com</w:t>
+      </w:r>
+      <w:r>
+        <w:t xml:space="preserve"> </w:t>
+      </w:r>
+      <w:r>
+        <w:t xml:space="preserve">→ VM:8787)</w:t>
+      </w:r>
+    </w:p>
+    <w:p>
+      <w:pPr>
+        <w:numPr>
+          <w:ilvl w:val="0"/>
+          <w:numId w:val="1006"/>
+        </w:numPr>
+        <w:pStyle w:val="Compact"/>
+      </w:pPr>
+      <w:r>
+        <w:t xml:space="preserve">☐ Set up systemd service for auto-start</w:t>
+      </w:r>
+    </w:p>
+    <w:p>
+      <w:pPr>
+        <w:numPr>
+          <w:ilvl w:val="0"/>
+          <w:numId w:val="1006"/>
+        </w:numPr>
+        <w:pStyle w:val="Compact"/>
+      </w:pPr>
+      <w:r>
+        <w:t xml:space="preserve">☐ Test with known form + fill instructions via curl</w:t>
+      </w:r>
+    </w:p>
+    <w:bookmarkEnd w:id="83"/>
+    <w:bookmarkStart w:id="84" w:name="phase-3-processor-worker-2-3-days"/>
+    <w:p>
+      <w:pPr>
+        <w:pStyle w:val="Heading3"/>
+      </w:pPr>
+      <w:r>
+        <w:t xml:space="preserve">Phase 3: Processor Worker (2-3 days)</w:t>
+      </w:r>
+    </w:p>
+    <w:p>
+      <w:pPr>
+        <w:numPr>
+          <w:ilvl w:val="0"/>
+          <w:numId w:val="1007"/>
+        </w:numPr>
+        <w:pStyle w:val="Compact"/>
+      </w:pPr>
+      <w:r>
+        <w:t xml:space="preserve">☐ Write</w:t>
+      </w:r>
+      <w:r>
+        <w:t xml:space="preserve"> </w:t>
+      </w:r>
+      <w:r>
+        <w:rPr>
+          <w:rStyle w:val="VerbatimChar"/>
+        </w:rPr>
+        <w:t xml:space="preserve">form-claw-processor</w:t>
+      </w:r>
+      <w:r>
+        <w:t xml:space="preserve"> </w:t>
+      </w:r>
+      <w:r>
+        <w:t xml:space="preserve">Worker:</w:t>
+      </w:r>
+    </w:p>
+    <w:p>
+      <w:pPr>
+        <w:numPr>
+          <w:ilvl w:val="1"/>
           <w:numId w:val="1008"/>
         </w:numPr>
         <w:pStyle w:val="Compact"/>
       </w:pPr>
       <w:r>
-        <w:t xml:space="preserve">☐ Install Node.js 20 on the VM (same LXC or sibling)</w:t>
+        <w:t xml:space="preserve">Webhook handler</w:t>
       </w:r>
     </w:p>
     <w:p>
       <w:pPr>
         <w:numPr>
-          <w:ilvl w:val="0"/>
+          <w:ilvl w:val="1"/>
           <w:numId w:val="1008"/>
         </w:numPr>
         <w:pStyle w:val="Compact"/>
       </w:pPr>
       <w:r>
-        <w:t xml:space="preserve">☐ Replace Prisma with D1 HTTP client in all API routes (~10 files)</w:t>
+        <w:t xml:space="preserve">Security filter (port</w:t>
+      </w:r>
+      <w:r>
+        <w:t xml:space="preserve"> </w:t>
+      </w:r>
+      <w:r>
+        <w:rPr>
+          <w:rStyle w:val="VerbatimChar"/>
+        </w:rPr>
+        <w:t xml:space="preserve">security_filter.py</w:t>
+      </w:r>
+      <w:r>
+        <w:t xml:space="preserve"> </w:t>
+      </w:r>
+      <w:r>
+        <w:t xml:space="preserve">to TypeScript)</w:t>
       </w:r>
     </w:p>
     <w:p>
       <w:pPr>
         <w:numPr>
-          <w:ilvl w:val="0"/>
+          <w:ilvl w:val="1"/>
           <w:numId w:val="1008"/>
         </w:numPr>
         <w:pStyle w:val="Compact"/>
       </w:pPr>
       <w:r>
-        <w:t xml:space="preserve">☐ Set up NextAuth with local SQLite or Cloudflare Access</w:t>
+        <w:t xml:space="preserve">LLM client (with provider switch: ChatLLM / Grok)</w:t>
       </w:r>
     </w:p>
     <w:p>
       <w:pPr>
         <w:numPr>
-          <w:ilvl w:val="0"/>
+          <w:ilvl w:val="1"/>
           <w:numId w:val="1008"/>
         </w:numPr>
         <w:pStyle w:val="Compact"/>
       </w:pPr>
       <w:r>
-        <w:t xml:space="preserve">☐ Build and deploy via systemd service</w:t>
+        <w:t xml:space="preserve">PDF service client (calls</w:t>
+      </w:r>
+      <w:r>
+        <w:t xml:space="preserve"> </w:t>
+      </w:r>
+      <w:r>
+        <w:rPr>
+          <w:rStyle w:val="VerbatimChar"/>
+        </w:rPr>
+        <w:t xml:space="preserve">https://pdf.savlil.com/fill-pdf</w:t>
+      </w:r>
+      <w:r>
+        <w:t xml:space="preserve">)</w:t>
       </w:r>
     </w:p>
     <w:p>
       <w:pPr>
         <w:numPr>
-          <w:ilvl w:val="0"/>
+          <w:ilvl w:val="1"/>
           <w:numId w:val="1008"/>
         </w:numPr>
         <w:pStyle w:val="Compact"/>
       </w:pPr>
       <w:r>
-        <w:t xml:space="preserve">☐ Add</w:t>
+        <w:t xml:space="preserve">Resend client (port</w:t>
       </w:r>
       <w:r>
         <w:t xml:space="preserve"> </w:t>
@@ -20035,47 +21856,71 @@
         <w:rPr>
           <w:rStyle w:val="VerbatimChar"/>
         </w:rPr>
-        <w:t xml:space="preserve">formclaw.savlil.com</w:t>
-      </w:r>
-      <w:r>
-        <w:t xml:space="preserve"> </w:t>
-      </w:r>
-      <w:r>
-        <w:t xml:space="preserve">ingress to Cloudflare Tunnel</w:t>
+        <w:t xml:space="preserve">send_resend_reply.py</w:t>
+      </w:r>
+      <w:r>
+        <w:t xml:space="preserve"> </w:t>
+      </w:r>
+      <w:r>
+        <w:t xml:space="preserve">logic)</w:t>
       </w:r>
     </w:p>
     <w:p>
       <w:pPr>
         <w:numPr>
-          <w:ilvl w:val="0"/>
+          <w:ilvl w:val="1"/>
           <w:numId w:val="1008"/>
         </w:numPr>
         <w:pStyle w:val="Compact"/>
       </w:pPr>
       <w:r>
-        <w:t xml:space="preserve">☐ Update health check endpoint for new architecture</w:t>
+        <w:t xml:space="preserve">D1 logging (</w:t>
+      </w:r>
+      <w:r>
+        <w:rPr>
+          <w:rStyle w:val="VerbatimChar"/>
+        </w:rPr>
+        <w:t xml:space="preserve">env.DB.prepare()</w:t>
+      </w:r>
+      <w:r>
+        <w:t xml:space="preserve"> </w:t>
+      </w:r>
+      <w:r>
+        <w:t xml:space="preserve">statements)</w:t>
       </w:r>
     </w:p>
     <w:p>
       <w:pPr>
         <w:numPr>
-          <w:ilvl w:val="0"/>
+          <w:ilvl w:val="1"/>
           <w:numId w:val="1008"/>
         </w:numPr>
         <w:pStyle w:val="Compact"/>
       </w:pPr>
       <w:r>
-        <w:t xml:space="preserve">☐ Test all dashboard pages with D1 data</w:t>
+        <w:t xml:space="preserve">Heartbeat reporting</w:t>
       </w:r>
     </w:p>
-    <w:bookmarkEnd w:id="77"/>
-    <w:bookmarkStart w:id="78" w:name="phase-5-cutover-monitoring-1-day"/>
     <w:p>
       <w:pPr>
+        <w:numPr>
+          <w:ilvl w:val="0"/>
+          <w:numId w:val="1007"/>
+        </w:numPr>
+        <w:pStyle w:val="Compact"/>
+      </w:pPr>
+      <w:r>
+        <w:t xml:space="preserve">☐ Deploy and wire up email intake Worker</w:t>
+      </w:r>
+    </w:p>
+    <w:bookmarkEnd w:id="84"/>
+    <w:bookmarkStart w:id="85" w:name="phase-4-dashboard-self-hosting-1-2-days"/>
+    <w:p>
+      <w:pPr>
         <w:pStyle w:val="Heading3"/>
       </w:pPr>
       <w:r>
-        <w:t xml:space="preserve">Phase 5: Cutover &amp; Monitoring (1 day)</w:t>
+        <w:t xml:space="preserve">Phase 4: Dashboard Self-Hosting (1-2 days)</w:t>
       </w:r>
     </w:p>
     <w:p>
@@ -20087,22 +21932,7 @@
         <w:pStyle w:val="Compact"/>
       </w:pPr>
       <w:r>
-        <w:t xml:space="preserve">☐ Update email intake Worker’s</w:t>
-      </w:r>
-      <w:r>
-        <w:t xml:space="preserve"> </w:t>
-      </w:r>
-      <w:r>
-        <w:rPr>
-          <w:rStyle w:val="VerbatimChar"/>
-        </w:rPr>
-        <w:t xml:space="preserve">WEBHOOK_URL</w:t>
-      </w:r>
-      <w:r>
-        <w:t xml:space="preserve"> </w:t>
-      </w:r>
-      <w:r>
-        <w:t xml:space="preserve">to processor Worker</w:t>
+        <w:t xml:space="preserve">☐ Install Node.js 20 on the VM (same LXC or sibling)</w:t>
       </w:r>
     </w:p>
     <w:p>
@@ -20114,7 +21944,7 @@
         <w:pStyle w:val="Compact"/>
       </w:pPr>
       <w:r>
-        <w:t xml:space="preserve">☐ Run end-to-end test (email → fill → reply)</w:t>
+        <w:t xml:space="preserve">☐ Replace Prisma with D1 HTTP client in all API routes (~10 files)</w:t>
       </w:r>
     </w:p>
     <w:p>
@@ -20126,7 +21956,7 @@
         <w:pStyle w:val="Compact"/>
       </w:pPr>
       <w:r>
-        <w:t xml:space="preserve">☐ Monitor first 24h of production</w:t>
+        <w:t xml:space="preserve">☐ Set up NextAuth with local SQLite or Cloudflare Access</w:t>
       </w:r>
     </w:p>
     <w:p>
@@ -20138,17 +21968,68 @@
         <w:pStyle w:val="Compact"/>
       </w:pPr>
       <w:r>
-        <w:t xml:space="preserve">☐ Disable old Abacus daemon</w:t>
+        <w:t xml:space="preserve">☐ Build and deploy via systemd service</w:t>
       </w:r>
     </w:p>
-    <w:bookmarkEnd w:id="78"/>
-    <w:bookmarkStart w:id="79" w:name="phase-6-optional-self-hosted-llm"/>
     <w:p>
       <w:pPr>
+        <w:numPr>
+          <w:ilvl w:val="0"/>
+          <w:numId w:val="1009"/>
+        </w:numPr>
+        <w:pStyle w:val="Compact"/>
+      </w:pPr>
+      <w:r>
+        <w:t xml:space="preserve">☐ Add</w:t>
+      </w:r>
+      <w:r>
+        <w:t xml:space="preserve"> </w:t>
+      </w:r>
+      <w:r>
+        <w:rPr>
+          <w:rStyle w:val="VerbatimChar"/>
+        </w:rPr>
+        <w:t xml:space="preserve">formclaw.savlil.com</w:t>
+      </w:r>
+      <w:r>
+        <w:t xml:space="preserve"> </w:t>
+      </w:r>
+      <w:r>
+        <w:t xml:space="preserve">ingress to Cloudflare Tunnel</w:t>
+      </w:r>
+    </w:p>
+    <w:p>
+      <w:pPr>
+        <w:numPr>
+          <w:ilvl w:val="0"/>
+          <w:numId w:val="1009"/>
+        </w:numPr>
+        <w:pStyle w:val="Compact"/>
+      </w:pPr>
+      <w:r>
+        <w:t xml:space="preserve">☐ Update health check endpoint for new architecture</w:t>
+      </w:r>
+    </w:p>
+    <w:p>
+      <w:pPr>
+        <w:numPr>
+          <w:ilvl w:val="0"/>
+          <w:numId w:val="1009"/>
+        </w:numPr>
+        <w:pStyle w:val="Compact"/>
+      </w:pPr>
+      <w:r>
+        <w:t xml:space="preserve">☐ Test all dashboard pages with D1 data</w:t>
+      </w:r>
+    </w:p>
+    <w:bookmarkEnd w:id="85"/>
+    <w:bookmarkStart w:id="86" w:name="phase-5-cutover-monitoring-1-day"/>
+    <w:p>
+      <w:pPr>
         <w:pStyle w:val="Heading3"/>
       </w:pPr>
       <w:r>
-        <w:t xml:space="preserve">Phase 6 (optional): Self-Hosted LLM</w:t>
+        <w:t xml:space="preserve">Phase 5: Cutover &amp; Monitoring (1 day)</w:t>
       </w:r>
     </w:p>
     <w:p>
@@ -20160,7 +22041,22 @@
         <w:pStyle w:val="Compact"/>
       </w:pPr>
       <w:r>
-        <w:t xml:space="preserve">☐ Install Ollama on the VM (or a dedicated GPU-passthrough VM)</w:t>
+        <w:t xml:space="preserve">☐ Update email intake Worker’s</w:t>
+      </w:r>
+      <w:r>
+        <w:t xml:space="preserve"> </w:t>
+      </w:r>
+      <w:r>
+        <w:rPr>
+          <w:rStyle w:val="VerbatimChar"/>
+        </w:rPr>
+        <w:t xml:space="preserve">WEBHOOK_URL</w:t>
+      </w:r>
+      <w:r>
+        <w:t xml:space="preserve"> </w:t>
+      </w:r>
+      <w:r>
+        <w:t xml:space="preserve">to processor Worker</w:t>
       </w:r>
     </w:p>
     <w:p>
@@ -20172,7 +22068,7 @@
         <w:pStyle w:val="Compact"/>
       </w:pPr>
       <w:r>
-        <w:t xml:space="preserve">☐ Pull Gemma 4 12B (or Qwen2.5-VL-7B for better Hebrew)</w:t>
+        <w:t xml:space="preserve">☐ Run end-to-end test (email → fill → reply)</w:t>
       </w:r>
     </w:p>
     <w:p>
@@ -20184,7 +22080,7 @@
         <w:pStyle w:val="Compact"/>
       </w:pPr>
       <w:r>
-        <w:t xml:space="preserve">☐ Set up GPU passthrough if using dedicated GPU</w:t>
+        <w:t xml:space="preserve">☐ Monitor first 24h of production</w:t>
       </w:r>
     </w:p>
     <w:p>
@@ -20196,83 +22092,141 @@
         <w:pStyle w:val="Compact"/>
       </w:pPr>
       <w:r>
-        <w:t xml:space="preserve">☐ Add</w:t>
-      </w:r>
-      <w:r>
-        <w:t xml:space="preserve"> </w:t>
-      </w:r>
-      <w:r>
-        <w:rPr>
-          <w:rStyle w:val="VerbatimChar"/>
-        </w:rPr>
-        <w:t xml:space="preserve">llm.savlil.com</w:t>
-      </w:r>
-      <w:r>
-        <w:t xml:space="preserve"> </w:t>
-      </w:r>
-      <w:r>
-        <w:t xml:space="preserve">ingress to Cloudflare Tunnel (or route internally)</w:t>
+        <w:t xml:space="preserve">☐ Disable old Abacus daemon</w:t>
+      </w:r>
+    </w:p>
+    <w:bookmarkEnd w:id="86"/>
+    <w:bookmarkStart w:id="87" w:name="phase-6-optional-self-hosted-llm"/>
+    <w:p>
+      <w:pPr>
+        <w:pStyle w:val="Heading3"/>
+      </w:pPr>
+      <w:r>
+        <w:t xml:space="preserve">Phase 6 (optional): Self-Hosted LLM</w:t>
       </w:r>
     </w:p>
     <w:p>
       <w:pPr>
         <w:numPr>
           <w:ilvl w:val="0"/>
-          <w:numId w:val="1010"/>
+          <w:numId w:val="1011"/>
         </w:numPr>
         <w:pStyle w:val="Compact"/>
       </w:pPr>
       <w:r>
-        <w:t xml:space="preserve">☐ Test with 10+ real Hebrew forms, compare quality vs ChatLLM</w:t>
+        <w:t xml:space="preserve">☐ Install Ollama on the VM (or a dedicated GPU-passthrough VM)</w:t>
       </w:r>
     </w:p>
     <w:p>
       <w:pPr>
         <w:numPr>
           <w:ilvl w:val="0"/>
-          <w:numId w:val="1010"/>
+          <w:numId w:val="1011"/>
         </w:numPr>
         <w:pStyle w:val="Compact"/>
       </w:pPr>
       <w:r>
-        <w:t xml:space="preserve">☐ Switch</w:t>
-      </w:r>
-      <w:r>
-        <w:t xml:space="preserve"> </w:t>
-      </w:r>
-      <w:r>
-        <w:rPr>
-          <w:rStyle w:val="VerbatimChar"/>
-        </w:rPr>
-        <w:t xml:space="preserve">LLM_PROVIDER</w:t>
-      </w:r>
-      <w:r>
-        <w:t xml:space="preserve"> </w:t>
-      </w:r>
-      <w:r>
-        <w:t xml:space="preserve">to</w:t>
-      </w:r>
-      <w:r>
-        <w:t xml:space="preserve"> </w:t>
-      </w:r>
-      <w:r>
-        <w:rPr>
-          <w:rStyle w:val="VerbatimChar"/>
-        </w:rPr>
-        <w:t xml:space="preserve">selfhosted</w:t>
-      </w:r>
-      <w:r>
-        <w:t xml:space="preserve"> </w:t>
-      </w:r>
-      <w:r>
-        <w:t xml:space="preserve">in wrangler.toml if quality is acceptable</w:t>
+        <w:t xml:space="preserve">☐ Pull Gemma 4 12B (or Qwen2.5-VL-7B for better Hebrew)</w:t>
       </w:r>
     </w:p>
     <w:p>
       <w:pPr>
         <w:numPr>
           <w:ilvl w:val="0"/>
-          <w:numId w:val="1010"/>
+          <w:numId w:val="1011"/>
+        </w:numPr>
+        <w:pStyle w:val="Compact"/>
+      </w:pPr>
+      <w:r>
+        <w:t xml:space="preserve">☐ Set up GPU passthrough if using dedicated GPU</w:t>
+      </w:r>
+    </w:p>
+    <w:p>
+      <w:pPr>
+        <w:numPr>
+          <w:ilvl w:val="0"/>
+          <w:numId w:val="1011"/>
+        </w:numPr>
+        <w:pStyle w:val="Compact"/>
+      </w:pPr>
+      <w:r>
+        <w:t xml:space="preserve">☐ Add</w:t>
+      </w:r>
+      <w:r>
+        <w:t xml:space="preserve"> </w:t>
+      </w:r>
+      <w:r>
+        <w:rPr>
+          <w:rStyle w:val="VerbatimChar"/>
+        </w:rPr>
+        <w:t xml:space="preserve">llm.savlil.com</w:t>
+      </w:r>
+      <w:r>
+        <w:t xml:space="preserve"> </w:t>
+      </w:r>
+      <w:r>
+        <w:t xml:space="preserve">ingress to Cloudflare Tunnel (or route internally)</w:t>
+      </w:r>
+    </w:p>
+    <w:p>
+      <w:pPr>
+        <w:numPr>
+          <w:ilvl w:val="0"/>
+          <w:numId w:val="1011"/>
+        </w:numPr>
+        <w:pStyle w:val="Compact"/>
+      </w:pPr>
+      <w:r>
+        <w:t xml:space="preserve">☐ Test with 10+ real Hebrew forms, compare quality vs ChatLLM</w:t>
+      </w:r>
+    </w:p>
+    <w:p>
+      <w:pPr>
+        <w:numPr>
+          <w:ilvl w:val="0"/>
+          <w:numId w:val="1011"/>
+        </w:numPr>
+        <w:pStyle w:val="Compact"/>
+      </w:pPr>
+      <w:r>
+        <w:t xml:space="preserve">☐ Switch</w:t>
+      </w:r>
+      <w:r>
+        <w:t xml:space="preserve"> </w:t>
+      </w:r>
+      <w:r>
+        <w:rPr>
+          <w:rStyle w:val="VerbatimChar"/>
+        </w:rPr>
+        <w:t xml:space="preserve">LLM_PROVIDER</w:t>
+      </w:r>
+      <w:r>
+        <w:t xml:space="preserve"> </w:t>
+      </w:r>
+      <w:r>
+        <w:t xml:space="preserve">to</w:t>
+      </w:r>
+      <w:r>
+        <w:t xml:space="preserve"> </w:t>
+      </w:r>
+      <w:r>
+        <w:rPr>
+          <w:rStyle w:val="VerbatimChar"/>
+        </w:rPr>
+        <w:t xml:space="preserve">selfhosted</w:t>
+      </w:r>
+      <w:r>
+        <w:t xml:space="preserve"> </w:t>
+      </w:r>
+      <w:r>
+        <w:t xml:space="preserve">in wrangler.toml if quality is acceptable</w:t>
+      </w:r>
+    </w:p>
+    <w:p>
+      <w:pPr>
+        <w:numPr>
+          <w:ilvl w:val="0"/>
+          <w:numId w:val="1011"/>
         </w:numPr>
         <w:pStyle w:val="Compact"/>
       </w:pPr>
@@ -20305,9 +22259,9 @@
         </w:pict>
       </w:r>
     </w:p>
-    <w:bookmarkEnd w:id="79"/>
-    <w:bookmarkEnd w:id="80"/>
-    <w:bookmarkStart w:id="81" w:name="risks-mitigations"/>
+    <w:bookmarkEnd w:id="87"/>
+    <w:bookmarkEnd w:id="88"/>
+    <w:bookmarkStart w:id="89" w:name="risks-mitigations"/>
     <w:p>
       <w:pPr>
         <w:pStyle w:val="Heading2"/>
@@ -20701,8 +22655,8 @@
         </w:pict>
       </w:r>
     </w:p>
-    <w:bookmarkEnd w:id="81"/>
-    <w:bookmarkStart w:id="82" w:name="decision-matrix"/>
+    <w:bookmarkEnd w:id="89"/>
+    <w:bookmarkStart w:id="90" w:name="decision-matrix"/>
     <w:p>
       <w:pPr>
         <w:pStyle w:val="Heading2"/>
@@ -20775,13 +22729,13 @@
                 <w:bCs/>
                 <w:b/>
               </w:rPr>
-              <w:t xml:space="preserve">Self-hosted Gemma 4 12B</w:t>
+              <w:t xml:space="preserve">Self-hosted vLLM</w:t>
             </w:r>
             <w:r>
               <w:t xml:space="preserve"> </w:t>
             </w:r>
             <w:r>
-              <w:t xml:space="preserve">(free, private). Fall back to</w:t>
+              <w:t xml:space="preserve">(free, private) primary.</w:t>
             </w:r>
             <w:r>
               <w:t xml:space="preserve"> </w:t>
@@ -20791,29 +22745,13 @@
                 <w:bCs/>
                 <w:b/>
               </w:rPr>
-              <w:t xml:space="preserve">ChatLLM</w:t>
+              <w:t xml:space="preserve">Google AI Studio</w:t>
             </w:r>
             <w:r>
               <w:t xml:space="preserve"> </w:t>
             </w:r>
             <w:r>
-              <w:t xml:space="preserve">or</w:t>
-            </w:r>
-            <w:r>
-              <w:t xml:space="preserve"> </w:t>
-            </w:r>
-            <w:r>
-              <w:rPr>
-                <w:bCs/>
-                <w:b/>
-              </w:rPr>
-              <w:t xml:space="preserve">Grok</w:t>
-            </w:r>
-            <w:r>
-              <w:t xml:space="preserve"> </w:t>
-            </w:r>
-            <w:r>
-              <w:t xml:space="preserve">if quality issues.</w:t>
+              <w:t xml:space="preserve">(free, zero-infra) as best fallback. ChatLLM or Grok as additional options.</w:t>
             </w:r>
           </w:p>
         </w:tc>
@@ -21094,8 +23032,8 @@
         </w:pict>
       </w:r>
     </w:p>
-    <w:bookmarkEnd w:id="82"/>
-    <w:bookmarkStart w:id="88" w:name="X103397b2ec5692136d5a08208639cfa0da6d46c"/>
+    <w:bookmarkEnd w:id="90"/>
+    <w:bookmarkStart w:id="96" w:name="X103397b2ec5692136d5a08208639cfa0da6d46c"/>
     <w:p>
       <w:pPr>
         <w:pStyle w:val="Heading2"/>
@@ -21149,7 +23087,7 @@
         <w:t xml:space="preserve">on a Cloudflare Worker for analytics — this is a good fit because:</w:t>
       </w:r>
     </w:p>
-    <w:bookmarkStart w:id="83" w:name="why-graphql-works-well-here"/>
+    <w:bookmarkStart w:id="91" w:name="why-graphql-works-well-here"/>
     <w:p>
       <w:pPr>
         <w:pStyle w:val="Heading3"/>
@@ -21162,7 +23100,7 @@
       <w:pPr>
         <w:numPr>
           <w:ilvl w:val="0"/>
-          <w:numId w:val="1011"/>
+          <w:numId w:val="1012"/>
         </w:numPr>
         <w:pStyle w:val="Compact"/>
       </w:pPr>
@@ -21181,7 +23119,7 @@
       <w:pPr>
         <w:numPr>
           <w:ilvl w:val="0"/>
-          <w:numId w:val="1011"/>
+          <w:numId w:val="1012"/>
         </w:numPr>
         <w:pStyle w:val="Compact"/>
       </w:pPr>
@@ -21215,7 +23153,7 @@
       <w:pPr>
         <w:numPr>
           <w:ilvl w:val="0"/>
-          <w:numId w:val="1011"/>
+          <w:numId w:val="1012"/>
         </w:numPr>
         <w:pStyle w:val="Compact"/>
       </w:pPr>
@@ -21234,7 +23172,7 @@
       <w:pPr>
         <w:numPr>
           <w:ilvl w:val="0"/>
-          <w:numId w:val="1011"/>
+          <w:numId w:val="1012"/>
         </w:numPr>
         <w:pStyle w:val="Compact"/>
       </w:pPr>
@@ -21249,8 +23187,8 @@
         <w:t xml:space="preserve">: GraphQL’s typed schema documents the analytics API automatically.</w:t>
       </w:r>
     </w:p>
-    <w:bookmarkEnd w:id="83"/>
-    <w:bookmarkStart w:id="84" w:name="example-graphql-schema"/>
+    <w:bookmarkEnd w:id="91"/>
+    <w:bookmarkStart w:id="92" w:name="example-graphql-schema"/>
     <w:p>
       <w:pPr>
         <w:pStyle w:val="Heading3"/>
@@ -22104,8 +24042,8 @@
         <w:t xml:space="preserve">! }</w:t>
       </w:r>
     </w:p>
-    <w:bookmarkEnd w:id="84"/>
-    <w:bookmarkStart w:id="86" w:name="implementation"/>
+    <w:bookmarkEnd w:id="92"/>
+    <w:bookmarkStart w:id="94" w:name="implementation"/>
     <w:p>
       <w:pPr>
         <w:pStyle w:val="Heading3"/>
@@ -22124,7 +24062,7 @@
       <w:r>
         <w:t xml:space="preserve"> </w:t>
       </w:r>
-      <w:hyperlink r:id="rId85">
+      <w:hyperlink r:id="rId93">
         <w:r>
           <w:rPr>
             <w:rStyle w:val="VerbatimChar"/>
@@ -23050,8 +24988,8 @@
         <w:t xml:space="preserve">;</w:t>
       </w:r>
     </w:p>
-    <w:bookmarkEnd w:id="86"/>
-    <w:bookmarkStart w:id="87" w:name="when-to-add-graphql"/>
+    <w:bookmarkEnd w:id="94"/>
+    <w:bookmarkStart w:id="95" w:name="when-to-add-graphql"/>
     <w:p>
       <w:pPr>
         <w:pStyle w:val="Heading3"/>
@@ -23111,121 +25049,15 @@
         </w:pict>
       </w:r>
     </w:p>
-    <w:bookmarkEnd w:id="87"/>
-    <w:bookmarkEnd w:id="88"/>
-    <w:bookmarkStart w:id="89" w:name="what-stays-the-same"/>
+    <w:bookmarkEnd w:id="95"/>
+    <w:bookmarkEnd w:id="96"/>
+    <w:bookmarkStart w:id="97" w:name="what-stays-the-same"/>
     <w:p>
       <w:pPr>
         <w:pStyle w:val="Heading2"/>
       </w:pPr>
       <w:r>
         <w:t xml:space="preserve">13. What Stays the Same</w:t>
-      </w:r>
-    </w:p>
-    <w:p>
-      <w:pPr>
-        <w:numPr>
-          <w:ilvl w:val="0"/>
-          <w:numId w:val="1012"/>
-        </w:numPr>
-        <w:pStyle w:val="Compact"/>
-      </w:pPr>
-      <w:r>
-        <w:t xml:space="preserve">✅ Email intake Cloudflare Worker (already deployed)</w:t>
-      </w:r>
-    </w:p>
-    <w:p>
-      <w:pPr>
-        <w:numPr>
-          <w:ilvl w:val="0"/>
-          <w:numId w:val="1012"/>
-        </w:numPr>
-        <w:pStyle w:val="Compact"/>
-      </w:pPr>
-      <w:r>
-        <w:t xml:space="preserve">✅ Resend for outbound email (already configured)</w:t>
-      </w:r>
-    </w:p>
-    <w:p>
-      <w:pPr>
-        <w:numPr>
-          <w:ilvl w:val="0"/>
-          <w:numId w:val="1012"/>
-        </w:numPr>
-        <w:pStyle w:val="Compact"/>
-      </w:pPr>
-      <w:r>
-        <w:t xml:space="preserve">✅ GitHub repository as source of truth</w:t>
-      </w:r>
-    </w:p>
-    <w:p>
-      <w:pPr>
-        <w:numPr>
-          <w:ilvl w:val="0"/>
-          <w:numId w:val="1012"/>
-        </w:numPr>
-        <w:pStyle w:val="Compact"/>
-      </w:pPr>
-      <w:r>
-        <w:t xml:space="preserve">✅ Sender whitelist logic</w:t>
-      </w:r>
-    </w:p>
-    <w:p>
-      <w:pPr>
-        <w:numPr>
-          <w:ilvl w:val="0"/>
-          <w:numId w:val="1012"/>
-        </w:numPr>
-        <w:pStyle w:val="Compact"/>
-      </w:pPr>
-      <w:r>
-        <w:t xml:space="preserve">✅ Security filter logic (ported to TypeScript)</w:t>
-      </w:r>
-    </w:p>
-    <w:p>
-      <w:pPr>
-        <w:numPr>
-          <w:ilvl w:val="0"/>
-          <w:numId w:val="1012"/>
-        </w:numPr>
-        <w:pStyle w:val="Compact"/>
-      </w:pPr>
-      <w:r>
-        <w:t xml:space="preserve">✅ Family data structure (family_data.json)</w:t>
-      </w:r>
-    </w:p>
-    <w:p>
-      <w:pPr>
-        <w:numPr>
-          <w:ilvl w:val="0"/>
-          <w:numId w:val="1012"/>
-        </w:numPr>
-        <w:pStyle w:val="Compact"/>
-      </w:pPr>
-      <w:r>
-        <w:t xml:space="preserve">✅ Signature assets (PNGs with transparency)</w:t>
-      </w:r>
-    </w:p>
-    <w:p>
-      <w:pPr>
-        <w:numPr>
-          <w:ilvl w:val="0"/>
-          <w:numId w:val="1012"/>
-        </w:numPr>
-        <w:pStyle w:val="Compact"/>
-      </w:pPr>
-      <w:r>
-        <w:t xml:space="preserve">✅ Form-filling skill logic (coordinate placement, ellipses, split-digit fields)</w:t>
-      </w:r>
-    </w:p>
-    <w:bookmarkEnd w:id="89"/>
-    <w:bookmarkStart w:id="90" w:name="what-changes"/>
-    <w:p>
-      <w:pPr>
-        <w:pStyle w:val="Heading2"/>
-      </w:pPr>
-      <w:r>
-        <w:t xml:space="preserve">14. What Changes</w:t>
       </w:r>
     </w:p>
     <w:p>
@@ -23237,7 +25069,7 @@
         <w:pStyle w:val="Compact"/>
       </w:pPr>
       <w:r>
-        <w:t xml:space="preserve">🔄 Form processor: Abacus AI daemon → Cloudflare Worker + home VM Python API</w:t>
+        <w:t xml:space="preserve">✅ Email intake Cloudflare Worker (already deployed)</w:t>
       </w:r>
     </w:p>
     <w:p>
@@ -23249,7 +25081,7 @@
         <w:pStyle w:val="Compact"/>
       </w:pPr>
       <w:r>
-        <w:t xml:space="preserve">🔄 Database: Abacus-hosted PostgreSQL → Cloudflare D1 (SQLite)</w:t>
+        <w:t xml:space="preserve">✅ Resend for outbound email (already configured)</w:t>
       </w:r>
     </w:p>
     <w:p>
@@ -23261,7 +25093,7 @@
         <w:pStyle w:val="Compact"/>
       </w:pPr>
       <w:r>
-        <w:t xml:space="preserve">🔄 Asset storage: Abacus VM filesystem → Home VM local disk</w:t>
+        <w:t xml:space="preserve">✅ GitHub repository as source of truth</w:t>
       </w:r>
     </w:p>
     <w:p>
@@ -23273,7 +25105,7 @@
         <w:pStyle w:val="Compact"/>
       </w:pPr>
       <w:r>
-        <w:t xml:space="preserve">🔄 LLM calls: Abacus built-in agent → Self-hosted Gemma 4 / Ollama (or ChatLLM / Grok as fallback)</w:t>
+        <w:t xml:space="preserve">✅ Sender whitelist logic</w:t>
       </w:r>
     </w:p>
     <w:p>
@@ -23285,7 +25117,7 @@
         <w:pStyle w:val="Compact"/>
       </w:pPr>
       <w:r>
-        <w:t xml:space="preserve">🔄 Code execution: Abacus agent Python sandbox → Self-hosted FastAPI on Proxmox</w:t>
+        <w:t xml:space="preserve">✅ Security filter logic (ported to TypeScript)</w:t>
       </w:r>
     </w:p>
     <w:p>
@@ -23297,7 +25129,7 @@
         <w:pStyle w:val="Compact"/>
       </w:pPr>
       <w:r>
-        <w:t xml:space="preserve">🔄 Dashboard: Abacus-hosted → Self-hosted on Proxmox VM via Cloudflare Tunnel</w:t>
+        <w:t xml:space="preserve">✅ Family data structure (family_data.json)</w:t>
       </w:r>
     </w:p>
     <w:p>
@@ -23309,11 +25141,117 @@
         <w:pStyle w:val="Compact"/>
       </w:pPr>
       <w:r>
+        <w:t xml:space="preserve">✅ Signature assets (PNGs with transparency)</w:t>
+      </w:r>
+    </w:p>
+    <w:p>
+      <w:pPr>
+        <w:numPr>
+          <w:ilvl w:val="0"/>
+          <w:numId w:val="1013"/>
+        </w:numPr>
+        <w:pStyle w:val="Compact"/>
+      </w:pPr>
+      <w:r>
+        <w:t xml:space="preserve">✅ Form-filling skill logic (coordinate placement, ellipses, split-digit fields)</w:t>
+      </w:r>
+    </w:p>
+    <w:bookmarkEnd w:id="97"/>
+    <w:bookmarkStart w:id="98" w:name="what-changes"/>
+    <w:p>
+      <w:pPr>
+        <w:pStyle w:val="Heading2"/>
+      </w:pPr>
+      <w:r>
+        <w:t xml:space="preserve">14. What Changes</w:t>
+      </w:r>
+    </w:p>
+    <w:p>
+      <w:pPr>
+        <w:numPr>
+          <w:ilvl w:val="0"/>
+          <w:numId w:val="1014"/>
+        </w:numPr>
+        <w:pStyle w:val="Compact"/>
+      </w:pPr>
+      <w:r>
+        <w:t xml:space="preserve">🔄 Form processor: Abacus AI daemon → Cloudflare Worker + home VM Python API</w:t>
+      </w:r>
+    </w:p>
+    <w:p>
+      <w:pPr>
+        <w:numPr>
+          <w:ilvl w:val="0"/>
+          <w:numId w:val="1014"/>
+        </w:numPr>
+        <w:pStyle w:val="Compact"/>
+      </w:pPr>
+      <w:r>
+        <w:t xml:space="preserve">🔄 Database: Abacus-hosted PostgreSQL → Cloudflare D1 (SQLite)</w:t>
+      </w:r>
+    </w:p>
+    <w:p>
+      <w:pPr>
+        <w:numPr>
+          <w:ilvl w:val="0"/>
+          <w:numId w:val="1014"/>
+        </w:numPr>
+        <w:pStyle w:val="Compact"/>
+      </w:pPr>
+      <w:r>
+        <w:t xml:space="preserve">🔄 Asset storage: Abacus VM filesystem → Home VM local disk</w:t>
+      </w:r>
+    </w:p>
+    <w:p>
+      <w:pPr>
+        <w:numPr>
+          <w:ilvl w:val="0"/>
+          <w:numId w:val="1014"/>
+        </w:numPr>
+        <w:pStyle w:val="Compact"/>
+      </w:pPr>
+      <w:r>
+        <w:t xml:space="preserve">🔄 LLM calls: Abacus built-in agent → Self-hosted Gemma 4 / Ollama (or ChatLLM / Grok as fallback)</w:t>
+      </w:r>
+    </w:p>
+    <w:p>
+      <w:pPr>
+        <w:numPr>
+          <w:ilvl w:val="0"/>
+          <w:numId w:val="1014"/>
+        </w:numPr>
+        <w:pStyle w:val="Compact"/>
+      </w:pPr>
+      <w:r>
+        <w:t xml:space="preserve">🔄 Code execution: Abacus agent Python sandbox → Self-hosted FastAPI on Proxmox</w:t>
+      </w:r>
+    </w:p>
+    <w:p>
+      <w:pPr>
+        <w:numPr>
+          <w:ilvl w:val="0"/>
+          <w:numId w:val="1014"/>
+        </w:numPr>
+        <w:pStyle w:val="Compact"/>
+      </w:pPr>
+      <w:r>
+        <w:t xml:space="preserve">🔄 Dashboard: Abacus-hosted → Self-hosted on Proxmox VM via Cloudflare Tunnel</w:t>
+      </w:r>
+    </w:p>
+    <w:p>
+      <w:pPr>
+        <w:numPr>
+          <w:ilvl w:val="0"/>
+          <w:numId w:val="1014"/>
+        </w:numPr>
+        <w:pStyle w:val="Compact"/>
+      </w:pPr>
+      <w:r>
         <w:t xml:space="preserve">🔄 Analytics (future): REST → GraphQL on Cloudflare Worker</w:t>
       </w:r>
     </w:p>
-    <w:bookmarkEnd w:id="90"/>
-    <w:bookmarkEnd w:id="91"/>
+    <w:bookmarkEnd w:id="98"/>
+    <w:bookmarkEnd w:id="99"/>
     <w:sectPr/>
   </w:body>
 </w:document>
@@ -23621,7 +25559,34 @@
     </w:lvlOverride>
   </w:num>
   <w:num w:numId="1004">
-    <w:abstractNumId w:val="991"/>
+    <w:abstractNumId w:val="99411"/>
+    <w:lvlOverride w:ilvl="0">
+      <w:startOverride w:val="1"/>
+    </w:lvlOverride>
+    <w:lvlOverride w:ilvl="1">
+      <w:startOverride w:val="1"/>
+    </w:lvlOverride>
+    <w:lvlOverride w:ilvl="2">
+      <w:startOverride w:val="1"/>
+    </w:lvlOverride>
+    <w:lvlOverride w:ilvl="3">
+      <w:startOverride w:val="1"/>
+    </w:lvlOverride>
+    <w:lvlOverride w:ilvl="4">
+      <w:startOverride w:val="1"/>
+    </w:lvlOverride>
+    <w:lvlOverride w:ilvl="5">
+      <w:startOverride w:val="1"/>
+    </w:lvlOverride>
+    <w:lvlOverride w:ilvl="6">
+      <w:startOverride w:val="1"/>
+    </w:lvlOverride>
+    <w:lvlOverride w:ilvl="7">
+      <w:startOverride w:val="1"/>
+    </w:lvlOverride>
+    <w:lvlOverride w:ilvl="8">
+      <w:startOverride w:val="1"/>
+    </w:lvlOverride>
   </w:num>
   <w:num w:numId="1005">
     <w:abstractNumId w:val="991"/>
@@ -23648,6 +25613,9 @@
     <w:abstractNumId w:val="991"/>
   </w:num>
   <w:num w:numId="1013">
+    <w:abstractNumId w:val="991"/>
+  </w:num>
+  <w:num w:numId="1014">
     <w:abstractNumId w:val="991"/>
   </w:num>
 </w:numbering>

</xml_diff>